<commit_message>
fix: PRD Word v2 - embed all 25 prototype screenshots (was dropping <p><img></p> via skill bug)
</commit_message>
<xml_diff>
--- a/coupon-prd.docx
+++ b/coupon-prd.docx
@@ -5601,11 +5601,48 @@
       <w:r>
         <w:rPr>
           <w:rFonts w:eastAsia="Microsoft YaHei" w:ascii="Microsoft YaHei" w:hAnsi="Microsoft YaHei"/>
-          <w:color w:val="888888"/>
-        </w:rPr>
-        <w:br/>
-        <w:t>[图: 平台端后台原型]</w:t>
-        <w:br/>
+        </w:rPr>
+        <w:drawing>
+          <wp:inline xmlns:a="http://schemas.openxmlformats.org/drawingml/2006/main" xmlns:pic="http://schemas.openxmlformats.org/drawingml/2006/picture">
+            <wp:extent cx="5303520" cy="3137916"/>
+            <wp:docPr id="4" name="Picture 4"/>
+            <wp:cNvGraphicFramePr>
+              <a:graphicFrameLocks noChangeAspect="1"/>
+            </wp:cNvGraphicFramePr>
+            <a:graphic>
+              <a:graphicData uri="http://schemas.openxmlformats.org/drawingml/2006/picture">
+                <pic:pic>
+                  <pic:nvPicPr>
+                    <pic:cNvPr id="0" name="image.png"/>
+                    <pic:cNvPicPr/>
+                  </pic:nvPicPr>
+                  <pic:blipFill>
+                    <a:blip r:embed="rId16"/>
+                    <a:stretch>
+                      <a:fillRect/>
+                    </a:stretch>
+                  </pic:blipFill>
+                  <pic:spPr>
+                    <a:xfrm>
+                      <a:off x="0" y="0"/>
+                      <a:ext cx="5303520" cy="3137916"/>
+                    </a:xfrm>
+                    <a:prstGeom prst="rect"/>
+                  </pic:spPr>
+                </pic:pic>
+              </a:graphicData>
+            </a:graphic>
+          </wp:inline>
+        </w:drawing>
+      </w:r>
+      <w:r>
+        <w:rPr>
+          <w:rFonts w:eastAsia="Microsoft YaHei" w:ascii="Microsoft YaHei" w:hAnsi="Microsoft YaHei"/>
+          <w:i/>
+          <w:color w:val="6B7280"/>
+          <w:sz w:val="18"/>
+        </w:rPr>
+        <w:t xml:space="preserve">  平台端后台原型</w:t>
       </w:r>
     </w:p>
     <w:p>
@@ -6863,11 +6900,48 @@
       <w:r>
         <w:rPr>
           <w:rFonts w:eastAsia="Microsoft YaHei" w:ascii="Microsoft YaHei" w:hAnsi="Microsoft YaHei"/>
-          <w:color w:val="888888"/>
-        </w:rPr>
-        <w:br/>
-        <w:t>[图: 增加发行量弹窗]</w:t>
-        <w:br/>
+        </w:rPr>
+        <w:drawing>
+          <wp:inline xmlns:a="http://schemas.openxmlformats.org/drawingml/2006/main" xmlns:pic="http://schemas.openxmlformats.org/drawingml/2006/picture">
+            <wp:extent cx="5303520" cy="3314700"/>
+            <wp:docPr id="5" name="Picture 5"/>
+            <wp:cNvGraphicFramePr>
+              <a:graphicFrameLocks noChangeAspect="1"/>
+            </wp:cNvGraphicFramePr>
+            <a:graphic>
+              <a:graphicData uri="http://schemas.openxmlformats.org/drawingml/2006/picture">
+                <pic:pic>
+                  <pic:nvPicPr>
+                    <pic:cNvPr id="0" name="image.png"/>
+                    <pic:cNvPicPr/>
+                  </pic:nvPicPr>
+                  <pic:blipFill>
+                    <a:blip r:embed="rId17"/>
+                    <a:stretch>
+                      <a:fillRect/>
+                    </a:stretch>
+                  </pic:blipFill>
+                  <pic:spPr>
+                    <a:xfrm>
+                      <a:off x="0" y="0"/>
+                      <a:ext cx="5303520" cy="3314700"/>
+                    </a:xfrm>
+                    <a:prstGeom prst="rect"/>
+                  </pic:spPr>
+                </pic:pic>
+              </a:graphicData>
+            </a:graphic>
+          </wp:inline>
+        </w:drawing>
+      </w:r>
+      <w:r>
+        <w:rPr>
+          <w:rFonts w:eastAsia="Microsoft YaHei" w:ascii="Microsoft YaHei" w:hAnsi="Microsoft YaHei"/>
+          <w:i/>
+          <w:color w:val="6B7280"/>
+          <w:sz w:val="18"/>
+        </w:rPr>
+        <w:t xml:space="preserve">  增加发行量弹窗</w:t>
       </w:r>
     </w:p>
     <w:p>
@@ -6892,11 +6966,48 @@
       <w:r>
         <w:rPr>
           <w:rFonts w:eastAsia="Microsoft YaHei" w:ascii="Microsoft YaHei" w:hAnsi="Microsoft YaHei"/>
-          <w:color w:val="888888"/>
-        </w:rPr>
-        <w:br/>
-        <w:t>[图: 平台端券详情页]</w:t>
-        <w:br/>
+        </w:rPr>
+        <w:drawing>
+          <wp:inline xmlns:a="http://schemas.openxmlformats.org/drawingml/2006/main" xmlns:pic="http://schemas.openxmlformats.org/drawingml/2006/picture">
+            <wp:extent cx="5303520" cy="3233674"/>
+            <wp:docPr id="6" name="Picture 6"/>
+            <wp:cNvGraphicFramePr>
+              <a:graphicFrameLocks noChangeAspect="1"/>
+            </wp:cNvGraphicFramePr>
+            <a:graphic>
+              <a:graphicData uri="http://schemas.openxmlformats.org/drawingml/2006/picture">
+                <pic:pic>
+                  <pic:nvPicPr>
+                    <pic:cNvPr id="0" name="image.png"/>
+                    <pic:cNvPicPr/>
+                  </pic:nvPicPr>
+                  <pic:blipFill>
+                    <a:blip r:embed="rId18"/>
+                    <a:stretch>
+                      <a:fillRect/>
+                    </a:stretch>
+                  </pic:blipFill>
+                  <pic:spPr>
+                    <a:xfrm>
+                      <a:off x="0" y="0"/>
+                      <a:ext cx="5303520" cy="3233674"/>
+                    </a:xfrm>
+                    <a:prstGeom prst="rect"/>
+                  </pic:spPr>
+                </pic:pic>
+              </a:graphicData>
+            </a:graphic>
+          </wp:inline>
+        </w:drawing>
+      </w:r>
+      <w:r>
+        <w:rPr>
+          <w:rFonts w:eastAsia="Microsoft YaHei" w:ascii="Microsoft YaHei" w:hAnsi="Microsoft YaHei"/>
+          <w:i/>
+          <w:color w:val="6B7280"/>
+          <w:sz w:val="18"/>
+        </w:rPr>
+        <w:t xml:space="preserve">  平台端券详情页</w:t>
       </w:r>
     </w:p>
     <w:p>
@@ -7973,11 +8084,48 @@
       <w:r>
         <w:rPr>
           <w:rFonts w:eastAsia="Microsoft YaHei" w:ascii="Microsoft YaHei" w:hAnsi="Microsoft YaHei"/>
-          <w:color w:val="888888"/>
-        </w:rPr>
-        <w:br/>
-        <w:t>[图: D2新建编辑优惠券]</w:t>
-        <w:br/>
+        </w:rPr>
+        <w:drawing>
+          <wp:inline xmlns:a="http://schemas.openxmlformats.org/drawingml/2006/main" xmlns:pic="http://schemas.openxmlformats.org/drawingml/2006/picture">
+            <wp:extent cx="5303520" cy="3922395"/>
+            <wp:docPr id="7" name="Picture 7"/>
+            <wp:cNvGraphicFramePr>
+              <a:graphicFrameLocks noChangeAspect="1"/>
+            </wp:cNvGraphicFramePr>
+            <a:graphic>
+              <a:graphicData uri="http://schemas.openxmlformats.org/drawingml/2006/picture">
+                <pic:pic>
+                  <pic:nvPicPr>
+                    <pic:cNvPr id="0" name="image.png"/>
+                    <pic:cNvPicPr/>
+                  </pic:nvPicPr>
+                  <pic:blipFill>
+                    <a:blip r:embed="rId19"/>
+                    <a:stretch>
+                      <a:fillRect/>
+                    </a:stretch>
+                  </pic:blipFill>
+                  <pic:spPr>
+                    <a:xfrm>
+                      <a:off x="0" y="0"/>
+                      <a:ext cx="5303520" cy="3922395"/>
+                    </a:xfrm>
+                    <a:prstGeom prst="rect"/>
+                  </pic:spPr>
+                </pic:pic>
+              </a:graphicData>
+            </a:graphic>
+          </wp:inline>
+        </w:drawing>
+      </w:r>
+      <w:r>
+        <w:rPr>
+          <w:rFonts w:eastAsia="Microsoft YaHei" w:ascii="Microsoft YaHei" w:hAnsi="Microsoft YaHei"/>
+          <w:i/>
+          <w:color w:val="6B7280"/>
+          <w:sz w:val="18"/>
+        </w:rPr>
+        <w:t xml:space="preserve">  D2新建编辑优惠券</w:t>
       </w:r>
     </w:p>
     <w:p>
@@ -12339,11 +12487,48 @@
       <w:r>
         <w:rPr>
           <w:rFonts w:eastAsia="Microsoft YaHei" w:ascii="Microsoft YaHei" w:hAnsi="Microsoft YaHei"/>
-          <w:color w:val="888888"/>
-        </w:rPr>
-        <w:br/>
-        <w:t>[图: P2发券活动管理列表]</w:t>
-        <w:br/>
+        </w:rPr>
+        <w:drawing>
+          <wp:inline xmlns:a="http://schemas.openxmlformats.org/drawingml/2006/main" xmlns:pic="http://schemas.openxmlformats.org/drawingml/2006/picture">
+            <wp:extent cx="5303520" cy="3137916"/>
+            <wp:docPr id="8" name="Picture 8"/>
+            <wp:cNvGraphicFramePr>
+              <a:graphicFrameLocks noChangeAspect="1"/>
+            </wp:cNvGraphicFramePr>
+            <a:graphic>
+              <a:graphicData uri="http://schemas.openxmlformats.org/drawingml/2006/picture">
+                <pic:pic>
+                  <pic:nvPicPr>
+                    <pic:cNvPr id="0" name="image.png"/>
+                    <pic:cNvPicPr/>
+                  </pic:nvPicPr>
+                  <pic:blipFill>
+                    <a:blip r:embed="rId20"/>
+                    <a:stretch>
+                      <a:fillRect/>
+                    </a:stretch>
+                  </pic:blipFill>
+                  <pic:spPr>
+                    <a:xfrm>
+                      <a:off x="0" y="0"/>
+                      <a:ext cx="5303520" cy="3137916"/>
+                    </a:xfrm>
+                    <a:prstGeom prst="rect"/>
+                  </pic:spPr>
+                </pic:pic>
+              </a:graphicData>
+            </a:graphic>
+          </wp:inline>
+        </w:drawing>
+      </w:r>
+      <w:r>
+        <w:rPr>
+          <w:rFonts w:eastAsia="Microsoft YaHei" w:ascii="Microsoft YaHei" w:hAnsi="Microsoft YaHei"/>
+          <w:i/>
+          <w:color w:val="6B7280"/>
+          <w:sz w:val="18"/>
+        </w:rPr>
+        <w:t xml:space="preserve">  P2发券活动管理列表</w:t>
       </w:r>
     </w:p>
     <w:p>
@@ -12403,11 +12588,48 @@
       <w:r>
         <w:rPr>
           <w:rFonts w:eastAsia="Microsoft YaHei" w:ascii="Microsoft YaHei" w:hAnsi="Microsoft YaHei"/>
-          <w:color w:val="888888"/>
-        </w:rPr>
-        <w:br/>
-        <w:t>[图: D3新建编辑发券活动]</w:t>
-        <w:br/>
+        </w:rPr>
+        <w:drawing>
+          <wp:inline xmlns:a="http://schemas.openxmlformats.org/drawingml/2006/main" xmlns:pic="http://schemas.openxmlformats.org/drawingml/2006/picture">
+            <wp:extent cx="5303520" cy="3137916"/>
+            <wp:docPr id="9" name="Picture 9"/>
+            <wp:cNvGraphicFramePr>
+              <a:graphicFrameLocks noChangeAspect="1"/>
+            </wp:cNvGraphicFramePr>
+            <a:graphic>
+              <a:graphicData uri="http://schemas.openxmlformats.org/drawingml/2006/picture">
+                <pic:pic>
+                  <pic:nvPicPr>
+                    <pic:cNvPr id="0" name="image.png"/>
+                    <pic:cNvPicPr/>
+                  </pic:nvPicPr>
+                  <pic:blipFill>
+                    <a:blip r:embed="rId21"/>
+                    <a:stretch>
+                      <a:fillRect/>
+                    </a:stretch>
+                  </pic:blipFill>
+                  <pic:spPr>
+                    <a:xfrm>
+                      <a:off x="0" y="0"/>
+                      <a:ext cx="5303520" cy="3137916"/>
+                    </a:xfrm>
+                    <a:prstGeom prst="rect"/>
+                  </pic:spPr>
+                </pic:pic>
+              </a:graphicData>
+            </a:graphic>
+          </wp:inline>
+        </w:drawing>
+      </w:r>
+      <w:r>
+        <w:rPr>
+          <w:rFonts w:eastAsia="Microsoft YaHei" w:ascii="Microsoft YaHei" w:hAnsi="Microsoft YaHei"/>
+          <w:i/>
+          <w:color w:val="6B7280"/>
+          <w:sz w:val="18"/>
+        </w:rPr>
+        <w:t xml:space="preserve">  D3新建编辑发券活动</w:t>
       </w:r>
     </w:p>
     <w:p>
@@ -13934,11 +14156,48 @@
       <w:r>
         <w:rPr>
           <w:rFonts w:eastAsia="Microsoft YaHei" w:ascii="Microsoft YaHei" w:hAnsi="Microsoft YaHei"/>
-          <w:color w:val="888888"/>
-        </w:rPr>
-        <w:br/>
-        <w:t>[图: 数据看板]</w:t>
-        <w:br/>
+        </w:rPr>
+        <w:drawing>
+          <wp:inline xmlns:a="http://schemas.openxmlformats.org/drawingml/2006/main" xmlns:pic="http://schemas.openxmlformats.org/drawingml/2006/picture">
+            <wp:extent cx="5303520" cy="3314700"/>
+            <wp:docPr id="10" name="Picture 10"/>
+            <wp:cNvGraphicFramePr>
+              <a:graphicFrameLocks noChangeAspect="1"/>
+            </wp:cNvGraphicFramePr>
+            <a:graphic>
+              <a:graphicData uri="http://schemas.openxmlformats.org/drawingml/2006/picture">
+                <pic:pic>
+                  <pic:nvPicPr>
+                    <pic:cNvPr id="0" name="image.png"/>
+                    <pic:cNvPicPr/>
+                  </pic:nvPicPr>
+                  <pic:blipFill>
+                    <a:blip r:embed="rId22"/>
+                    <a:stretch>
+                      <a:fillRect/>
+                    </a:stretch>
+                  </pic:blipFill>
+                  <pic:spPr>
+                    <a:xfrm>
+                      <a:off x="0" y="0"/>
+                      <a:ext cx="5303520" cy="3314700"/>
+                    </a:xfrm>
+                    <a:prstGeom prst="rect"/>
+                  </pic:spPr>
+                </pic:pic>
+              </a:graphicData>
+            </a:graphic>
+          </wp:inline>
+        </w:drawing>
+      </w:r>
+      <w:r>
+        <w:rPr>
+          <w:rFonts w:eastAsia="Microsoft YaHei" w:ascii="Microsoft YaHei" w:hAnsi="Microsoft YaHei"/>
+          <w:i/>
+          <w:color w:val="6B7280"/>
+          <w:sz w:val="18"/>
+        </w:rPr>
+        <w:t xml:space="preserve">  数据看板</w:t>
       </w:r>
     </w:p>
     <w:p>
@@ -13989,11 +14248,48 @@
       <w:r>
         <w:rPr>
           <w:rFonts w:eastAsia="Microsoft YaHei" w:ascii="Microsoft YaHei" w:hAnsi="Microsoft YaHei"/>
-          <w:color w:val="888888"/>
-        </w:rPr>
-        <w:br/>
-        <w:t>[图: 券明细记录]</w:t>
-        <w:br/>
+        </w:rPr>
+        <w:drawing>
+          <wp:inline xmlns:a="http://schemas.openxmlformats.org/drawingml/2006/main" xmlns:pic="http://schemas.openxmlformats.org/drawingml/2006/picture">
+            <wp:extent cx="5303520" cy="2773299"/>
+            <wp:docPr id="11" name="Picture 11"/>
+            <wp:cNvGraphicFramePr>
+              <a:graphicFrameLocks noChangeAspect="1"/>
+            </wp:cNvGraphicFramePr>
+            <a:graphic>
+              <a:graphicData uri="http://schemas.openxmlformats.org/drawingml/2006/picture">
+                <pic:pic>
+                  <pic:nvPicPr>
+                    <pic:cNvPr id="0" name="image.png"/>
+                    <pic:cNvPicPr/>
+                  </pic:nvPicPr>
+                  <pic:blipFill>
+                    <a:blip r:embed="rId23"/>
+                    <a:stretch>
+                      <a:fillRect/>
+                    </a:stretch>
+                  </pic:blipFill>
+                  <pic:spPr>
+                    <a:xfrm>
+                      <a:off x="0" y="0"/>
+                      <a:ext cx="5303520" cy="2773299"/>
+                    </a:xfrm>
+                    <a:prstGeom prst="rect"/>
+                  </pic:spPr>
+                </pic:pic>
+              </a:graphicData>
+            </a:graphic>
+          </wp:inline>
+        </w:drawing>
+      </w:r>
+      <w:r>
+        <w:rPr>
+          <w:rFonts w:eastAsia="Microsoft YaHei" w:ascii="Microsoft YaHei" w:hAnsi="Microsoft YaHei"/>
+          <w:i/>
+          <w:color w:val="6B7280"/>
+          <w:sz w:val="18"/>
+        </w:rPr>
+        <w:t xml:space="preserve">  券明细记录</w:t>
       </w:r>
     </w:p>
     <w:p>
@@ -15089,11 +15385,48 @@
       <w:r>
         <w:rPr>
           <w:rFonts w:eastAsia="Microsoft YaHei" w:ascii="Microsoft YaHei" w:hAnsi="Microsoft YaHei"/>
-          <w:color w:val="888888"/>
-        </w:rPr>
-        <w:br/>
-        <w:t>[图: P5用户券查询-查询入口]</w:t>
-        <w:br/>
+        </w:rPr>
+        <w:drawing>
+          <wp:inline xmlns:a="http://schemas.openxmlformats.org/drawingml/2006/main" xmlns:pic="http://schemas.openxmlformats.org/drawingml/2006/picture">
+            <wp:extent cx="5303520" cy="3137916"/>
+            <wp:docPr id="12" name="Picture 12"/>
+            <wp:cNvGraphicFramePr>
+              <a:graphicFrameLocks noChangeAspect="1"/>
+            </wp:cNvGraphicFramePr>
+            <a:graphic>
+              <a:graphicData uri="http://schemas.openxmlformats.org/drawingml/2006/picture">
+                <pic:pic>
+                  <pic:nvPicPr>
+                    <pic:cNvPr id="0" name="image.png"/>
+                    <pic:cNvPicPr/>
+                  </pic:nvPicPr>
+                  <pic:blipFill>
+                    <a:blip r:embed="rId24"/>
+                    <a:stretch>
+                      <a:fillRect/>
+                    </a:stretch>
+                  </pic:blipFill>
+                  <pic:spPr>
+                    <a:xfrm>
+                      <a:off x="0" y="0"/>
+                      <a:ext cx="5303520" cy="3137916"/>
+                    </a:xfrm>
+                    <a:prstGeom prst="rect"/>
+                  </pic:spPr>
+                </pic:pic>
+              </a:graphicData>
+            </a:graphic>
+          </wp:inline>
+        </w:drawing>
+      </w:r>
+      <w:r>
+        <w:rPr>
+          <w:rFonts w:eastAsia="Microsoft YaHei" w:ascii="Microsoft YaHei" w:hAnsi="Microsoft YaHei"/>
+          <w:i/>
+          <w:color w:val="6B7280"/>
+          <w:sz w:val="18"/>
+        </w:rPr>
+        <w:t xml:space="preserve">  P5用户券查询-查询入口</w:t>
       </w:r>
     </w:p>
     <w:p>
@@ -15171,11 +15504,48 @@
       <w:r>
         <w:rPr>
           <w:rFonts w:eastAsia="Microsoft YaHei" w:ascii="Microsoft YaHei" w:hAnsi="Microsoft YaHei"/>
-          <w:color w:val="888888"/>
-        </w:rPr>
-        <w:br/>
-        <w:t>[图: P5优惠券详情展示]</w:t>
-        <w:br/>
+        </w:rPr>
+        <w:drawing>
+          <wp:inline xmlns:a="http://schemas.openxmlformats.org/drawingml/2006/main" xmlns:pic="http://schemas.openxmlformats.org/drawingml/2006/picture">
+            <wp:extent cx="5303520" cy="2541270"/>
+            <wp:docPr id="13" name="Picture 13"/>
+            <wp:cNvGraphicFramePr>
+              <a:graphicFrameLocks noChangeAspect="1"/>
+            </wp:cNvGraphicFramePr>
+            <a:graphic>
+              <a:graphicData uri="http://schemas.openxmlformats.org/drawingml/2006/picture">
+                <pic:pic>
+                  <pic:nvPicPr>
+                    <pic:cNvPr id="0" name="image.png"/>
+                    <pic:cNvPicPr/>
+                  </pic:nvPicPr>
+                  <pic:blipFill>
+                    <a:blip r:embed="rId25"/>
+                    <a:stretch>
+                      <a:fillRect/>
+                    </a:stretch>
+                  </pic:blipFill>
+                  <pic:spPr>
+                    <a:xfrm>
+                      <a:off x="0" y="0"/>
+                      <a:ext cx="5303520" cy="2541270"/>
+                    </a:xfrm>
+                    <a:prstGeom prst="rect"/>
+                  </pic:spPr>
+                </pic:pic>
+              </a:graphicData>
+            </a:graphic>
+          </wp:inline>
+        </w:drawing>
+      </w:r>
+      <w:r>
+        <w:rPr>
+          <w:rFonts w:eastAsia="Microsoft YaHei" w:ascii="Microsoft YaHei" w:hAnsi="Microsoft YaHei"/>
+          <w:i/>
+          <w:color w:val="6B7280"/>
+          <w:sz w:val="18"/>
+        </w:rPr>
+        <w:t xml:space="preserve">  P5优惠券详情展示</w:t>
       </w:r>
     </w:p>
     <w:tbl>
@@ -16156,11 +16526,48 @@
       <w:r>
         <w:rPr>
           <w:rFonts w:eastAsia="Microsoft YaHei" w:ascii="Microsoft YaHei" w:hAnsi="Microsoft YaHei"/>
-          <w:color w:val="888888"/>
-        </w:rPr>
-        <w:br/>
-        <w:t>[图: 会员中心批量送券弹窗原型]</w:t>
-        <w:br/>
+        </w:rPr>
+        <w:drawing>
+          <wp:inline xmlns:a="http://schemas.openxmlformats.org/drawingml/2006/main" xmlns:pic="http://schemas.openxmlformats.org/drawingml/2006/picture">
+            <wp:extent cx="5303520" cy="3211576"/>
+            <wp:docPr id="14" name="Picture 14"/>
+            <wp:cNvGraphicFramePr>
+              <a:graphicFrameLocks noChangeAspect="1"/>
+            </wp:cNvGraphicFramePr>
+            <a:graphic>
+              <a:graphicData uri="http://schemas.openxmlformats.org/drawingml/2006/picture">
+                <pic:pic>
+                  <pic:nvPicPr>
+                    <pic:cNvPr id="0" name="image.png"/>
+                    <pic:cNvPicPr/>
+                  </pic:nvPicPr>
+                  <pic:blipFill>
+                    <a:blip r:embed="rId26"/>
+                    <a:stretch>
+                      <a:fillRect/>
+                    </a:stretch>
+                  </pic:blipFill>
+                  <pic:spPr>
+                    <a:xfrm>
+                      <a:off x="0" y="0"/>
+                      <a:ext cx="5303520" cy="3211576"/>
+                    </a:xfrm>
+                    <a:prstGeom prst="rect"/>
+                  </pic:spPr>
+                </pic:pic>
+              </a:graphicData>
+            </a:graphic>
+          </wp:inline>
+        </w:drawing>
+      </w:r>
+      <w:r>
+        <w:rPr>
+          <w:rFonts w:eastAsia="Microsoft YaHei" w:ascii="Microsoft YaHei" w:hAnsi="Microsoft YaHei"/>
+          <w:i/>
+          <w:color w:val="6B7280"/>
+          <w:sz w:val="18"/>
+        </w:rPr>
+        <w:t xml:space="preserve">  会员中心批量送券弹窗原型</w:t>
       </w:r>
     </w:p>
     <w:p>
@@ -16240,11 +16647,48 @@
       <w:r>
         <w:rPr>
           <w:rFonts w:eastAsia="Microsoft YaHei" w:ascii="Microsoft YaHei" w:hAnsi="Microsoft YaHei"/>
-          <w:color w:val="888888"/>
-        </w:rPr>
-        <w:br/>
-        <w:t>[图: M1 会员列表与批量赠送入口]</w:t>
-        <w:br/>
+        </w:rPr>
+        <w:drawing>
+          <wp:inline xmlns:a="http://schemas.openxmlformats.org/drawingml/2006/main" xmlns:pic="http://schemas.openxmlformats.org/drawingml/2006/picture">
+            <wp:extent cx="5303520" cy="3145282"/>
+            <wp:docPr id="15" name="Picture 15"/>
+            <wp:cNvGraphicFramePr>
+              <a:graphicFrameLocks noChangeAspect="1"/>
+            </wp:cNvGraphicFramePr>
+            <a:graphic>
+              <a:graphicData uri="http://schemas.openxmlformats.org/drawingml/2006/picture">
+                <pic:pic>
+                  <pic:nvPicPr>
+                    <pic:cNvPr id="0" name="image.png"/>
+                    <pic:cNvPicPr/>
+                  </pic:nvPicPr>
+                  <pic:blipFill>
+                    <a:blip r:embed="rId27"/>
+                    <a:stretch>
+                      <a:fillRect/>
+                    </a:stretch>
+                  </pic:blipFill>
+                  <pic:spPr>
+                    <a:xfrm>
+                      <a:off x="0" y="0"/>
+                      <a:ext cx="5303520" cy="3145282"/>
+                    </a:xfrm>
+                    <a:prstGeom prst="rect"/>
+                  </pic:spPr>
+                </pic:pic>
+              </a:graphicData>
+            </a:graphic>
+          </wp:inline>
+        </w:drawing>
+      </w:r>
+      <w:r>
+        <w:rPr>
+          <w:rFonts w:eastAsia="Microsoft YaHei" w:ascii="Microsoft YaHei" w:hAnsi="Microsoft YaHei"/>
+          <w:i/>
+          <w:color w:val="6B7280"/>
+          <w:sz w:val="18"/>
+        </w:rPr>
+        <w:t xml:space="preserve">  M1 会员列表与批量赠送入口</w:t>
       </w:r>
     </w:p>
     <w:p>
@@ -18943,11 +19387,48 @@
       <w:r>
         <w:rPr>
           <w:rFonts w:eastAsia="Microsoft YaHei" w:ascii="Microsoft YaHei" w:hAnsi="Microsoft YaHei"/>
-          <w:color w:val="888888"/>
-        </w:rPr>
-        <w:br/>
-        <w:t>[图: App端原型]</w:t>
-        <w:br/>
+        </w:rPr>
+        <w:drawing>
+          <wp:inline xmlns:a="http://schemas.openxmlformats.org/drawingml/2006/main" xmlns:pic="http://schemas.openxmlformats.org/drawingml/2006/picture">
+            <wp:extent cx="5303520" cy="3314700"/>
+            <wp:docPr id="16" name="Picture 16"/>
+            <wp:cNvGraphicFramePr>
+              <a:graphicFrameLocks noChangeAspect="1"/>
+            </wp:cNvGraphicFramePr>
+            <a:graphic>
+              <a:graphicData uri="http://schemas.openxmlformats.org/drawingml/2006/picture">
+                <pic:pic>
+                  <pic:nvPicPr>
+                    <pic:cNvPr id="0" name="image.png"/>
+                    <pic:cNvPicPr/>
+                  </pic:nvPicPr>
+                  <pic:blipFill>
+                    <a:blip r:embed="rId28"/>
+                    <a:stretch>
+                      <a:fillRect/>
+                    </a:stretch>
+                  </pic:blipFill>
+                  <pic:spPr>
+                    <a:xfrm>
+                      <a:off x="0" y="0"/>
+                      <a:ext cx="5303520" cy="3314700"/>
+                    </a:xfrm>
+                    <a:prstGeom prst="rect"/>
+                  </pic:spPr>
+                </pic:pic>
+              </a:graphicData>
+            </a:graphic>
+          </wp:inline>
+        </w:drawing>
+      </w:r>
+      <w:r>
+        <w:rPr>
+          <w:rFonts w:eastAsia="Microsoft YaHei" w:ascii="Microsoft YaHei" w:hAnsi="Microsoft YaHei"/>
+          <w:i/>
+          <w:color w:val="6B7280"/>
+          <w:sz w:val="18"/>
+        </w:rPr>
+        <w:t xml:space="preserve">  App端原型</w:t>
       </w:r>
     </w:p>
     <w:p>
@@ -19071,11 +19552,48 @@
       <w:r>
         <w:rPr>
           <w:rFonts w:eastAsia="Microsoft YaHei" w:ascii="Microsoft YaHei" w:hAnsi="Microsoft YaHei"/>
-          <w:color w:val="888888"/>
-        </w:rPr>
-        <w:br/>
-        <w:t>[图: 商品详情页优惠券入口条]</w:t>
-        <w:br/>
+        </w:rPr>
+        <w:drawing>
+          <wp:inline xmlns:a="http://schemas.openxmlformats.org/drawingml/2006/main" xmlns:pic="http://schemas.openxmlformats.org/drawingml/2006/picture">
+            <wp:extent cx="5303520" cy="11150991"/>
+            <wp:docPr id="17" name="Picture 17"/>
+            <wp:cNvGraphicFramePr>
+              <a:graphicFrameLocks noChangeAspect="1"/>
+            </wp:cNvGraphicFramePr>
+            <a:graphic>
+              <a:graphicData uri="http://schemas.openxmlformats.org/drawingml/2006/picture">
+                <pic:pic>
+                  <pic:nvPicPr>
+                    <pic:cNvPr id="0" name="image.png"/>
+                    <pic:cNvPicPr/>
+                  </pic:nvPicPr>
+                  <pic:blipFill>
+                    <a:blip r:embed="rId29"/>
+                    <a:stretch>
+                      <a:fillRect/>
+                    </a:stretch>
+                  </pic:blipFill>
+                  <pic:spPr>
+                    <a:xfrm>
+                      <a:off x="0" y="0"/>
+                      <a:ext cx="5303520" cy="11150991"/>
+                    </a:xfrm>
+                    <a:prstGeom prst="rect"/>
+                  </pic:spPr>
+                </pic:pic>
+              </a:graphicData>
+            </a:graphic>
+          </wp:inline>
+        </w:drawing>
+      </w:r>
+      <w:r>
+        <w:rPr>
+          <w:rFonts w:eastAsia="Microsoft YaHei" w:ascii="Microsoft YaHei" w:hAnsi="Microsoft YaHei"/>
+          <w:i/>
+          <w:color w:val="6B7280"/>
+          <w:sz w:val="18"/>
+        </w:rPr>
+        <w:t xml:space="preserve">  商品详情页优惠券入口条</w:t>
       </w:r>
     </w:p>
     <w:p>
@@ -19098,11 +19616,48 @@
       <w:r>
         <w:rPr>
           <w:rFonts w:eastAsia="Microsoft YaHei" w:ascii="Microsoft YaHei" w:hAnsi="Microsoft YaHei"/>
-          <w:color w:val="888888"/>
-        </w:rPr>
-        <w:br/>
-        <w:t>[图: 优惠详情弹窗]</w:t>
-        <w:br/>
+        </w:rPr>
+        <w:drawing>
+          <wp:inline xmlns:a="http://schemas.openxmlformats.org/drawingml/2006/main" xmlns:pic="http://schemas.openxmlformats.org/drawingml/2006/picture">
+            <wp:extent cx="5303520" cy="11150991"/>
+            <wp:docPr id="18" name="Picture 18"/>
+            <wp:cNvGraphicFramePr>
+              <a:graphicFrameLocks noChangeAspect="1"/>
+            </wp:cNvGraphicFramePr>
+            <a:graphic>
+              <a:graphicData uri="http://schemas.openxmlformats.org/drawingml/2006/picture">
+                <pic:pic>
+                  <pic:nvPicPr>
+                    <pic:cNvPr id="0" name="image.png"/>
+                    <pic:cNvPicPr/>
+                  </pic:nvPicPr>
+                  <pic:blipFill>
+                    <a:blip r:embed="rId30"/>
+                    <a:stretch>
+                      <a:fillRect/>
+                    </a:stretch>
+                  </pic:blipFill>
+                  <pic:spPr>
+                    <a:xfrm>
+                      <a:off x="0" y="0"/>
+                      <a:ext cx="5303520" cy="11150991"/>
+                    </a:xfrm>
+                    <a:prstGeom prst="rect"/>
+                  </pic:spPr>
+                </pic:pic>
+              </a:graphicData>
+            </a:graphic>
+          </wp:inline>
+        </w:drawing>
+      </w:r>
+      <w:r>
+        <w:rPr>
+          <w:rFonts w:eastAsia="Microsoft YaHei" w:ascii="Microsoft YaHei" w:hAnsi="Microsoft YaHei"/>
+          <w:i/>
+          <w:color w:val="6B7280"/>
+          <w:sz w:val="18"/>
+        </w:rPr>
+        <w:t xml:space="preserve">  优惠详情弹窗</w:t>
       </w:r>
     </w:p>
     <w:p>
@@ -19484,11 +20039,48 @@
       <w:r>
         <w:rPr>
           <w:rFonts w:eastAsia="Microsoft YaHei" w:ascii="Microsoft YaHei" w:hAnsi="Microsoft YaHei"/>
-          <w:color w:val="888888"/>
-        </w:rPr>
-        <w:br/>
-        <w:t>[图: 券规则页]</w:t>
-        <w:br/>
+        </w:rPr>
+        <w:drawing>
+          <wp:inline xmlns:a="http://schemas.openxmlformats.org/drawingml/2006/main" xmlns:pic="http://schemas.openxmlformats.org/drawingml/2006/picture">
+            <wp:extent cx="5303520" cy="11150991"/>
+            <wp:docPr id="19" name="Picture 19"/>
+            <wp:cNvGraphicFramePr>
+              <a:graphicFrameLocks noChangeAspect="1"/>
+            </wp:cNvGraphicFramePr>
+            <a:graphic>
+              <a:graphicData uri="http://schemas.openxmlformats.org/drawingml/2006/picture">
+                <pic:pic>
+                  <pic:nvPicPr>
+                    <pic:cNvPr id="0" name="image.png"/>
+                    <pic:cNvPicPr/>
+                  </pic:nvPicPr>
+                  <pic:blipFill>
+                    <a:blip r:embed="rId31"/>
+                    <a:stretch>
+                      <a:fillRect/>
+                    </a:stretch>
+                  </pic:blipFill>
+                  <pic:spPr>
+                    <a:xfrm>
+                      <a:off x="0" y="0"/>
+                      <a:ext cx="5303520" cy="11150991"/>
+                    </a:xfrm>
+                    <a:prstGeom prst="rect"/>
+                  </pic:spPr>
+                </pic:pic>
+              </a:graphicData>
+            </a:graphic>
+          </wp:inline>
+        </w:drawing>
+      </w:r>
+      <w:r>
+        <w:rPr>
+          <w:rFonts w:eastAsia="Microsoft YaHei" w:ascii="Microsoft YaHei" w:hAnsi="Microsoft YaHei"/>
+          <w:i/>
+          <w:color w:val="6B7280"/>
+          <w:sz w:val="18"/>
+        </w:rPr>
+        <w:t xml:space="preserve">  券规则页</w:t>
       </w:r>
     </w:p>
     <w:p>
@@ -19941,11 +20533,48 @@
       <w:r>
         <w:rPr>
           <w:rFonts w:eastAsia="Microsoft YaHei" w:ascii="Microsoft YaHei" w:hAnsi="Microsoft YaHei"/>
-          <w:color w:val="888888"/>
-        </w:rPr>
-        <w:br/>
-        <w:t>[图: App我的优惠券三态]</w:t>
-        <w:br/>
+        </w:rPr>
+        <w:drawing>
+          <wp:inline xmlns:a="http://schemas.openxmlformats.org/drawingml/2006/main" xmlns:pic="http://schemas.openxmlformats.org/drawingml/2006/picture">
+            <wp:extent cx="5303520" cy="3314700"/>
+            <wp:docPr id="20" name="Picture 20"/>
+            <wp:cNvGraphicFramePr>
+              <a:graphicFrameLocks noChangeAspect="1"/>
+            </wp:cNvGraphicFramePr>
+            <a:graphic>
+              <a:graphicData uri="http://schemas.openxmlformats.org/drawingml/2006/picture">
+                <pic:pic>
+                  <pic:nvPicPr>
+                    <pic:cNvPr id="0" name="image.png"/>
+                    <pic:cNvPicPr/>
+                  </pic:nvPicPr>
+                  <pic:blipFill>
+                    <a:blip r:embed="rId32"/>
+                    <a:stretch>
+                      <a:fillRect/>
+                    </a:stretch>
+                  </pic:blipFill>
+                  <pic:spPr>
+                    <a:xfrm>
+                      <a:off x="0" y="0"/>
+                      <a:ext cx="5303520" cy="3314700"/>
+                    </a:xfrm>
+                    <a:prstGeom prst="rect"/>
+                  </pic:spPr>
+                </pic:pic>
+              </a:graphicData>
+            </a:graphic>
+          </wp:inline>
+        </w:drawing>
+      </w:r>
+      <w:r>
+        <w:rPr>
+          <w:rFonts w:eastAsia="Microsoft YaHei" w:ascii="Microsoft YaHei" w:hAnsi="Microsoft YaHei"/>
+          <w:i/>
+          <w:color w:val="6B7280"/>
+          <w:sz w:val="18"/>
+        </w:rPr>
+        <w:t xml:space="preserve">  App我的优惠券三态</w:t>
       </w:r>
     </w:p>
     <w:p>
@@ -21357,11 +21986,48 @@
       <w:r>
         <w:rPr>
           <w:rFonts w:eastAsia="Microsoft YaHei" w:ascii="Microsoft YaHei" w:hAnsi="Microsoft YaHei"/>
-          <w:color w:val="888888"/>
-        </w:rPr>
-        <w:br/>
-        <w:t>[图: 跨端口置灰券与点击提示示意]</w:t>
-        <w:br/>
+        </w:rPr>
+        <w:drawing>
+          <wp:inline xmlns:a="http://schemas.openxmlformats.org/drawingml/2006/main" xmlns:pic="http://schemas.openxmlformats.org/drawingml/2006/picture">
+            <wp:extent cx="5303520" cy="11150991"/>
+            <wp:docPr id="21" name="Picture 21"/>
+            <wp:cNvGraphicFramePr>
+              <a:graphicFrameLocks noChangeAspect="1"/>
+            </wp:cNvGraphicFramePr>
+            <a:graphic>
+              <a:graphicData uri="http://schemas.openxmlformats.org/drawingml/2006/picture">
+                <pic:pic>
+                  <pic:nvPicPr>
+                    <pic:cNvPr id="0" name="image.png"/>
+                    <pic:cNvPicPr/>
+                  </pic:nvPicPr>
+                  <pic:blipFill>
+                    <a:blip r:embed="rId33"/>
+                    <a:stretch>
+                      <a:fillRect/>
+                    </a:stretch>
+                  </pic:blipFill>
+                  <pic:spPr>
+                    <a:xfrm>
+                      <a:off x="0" y="0"/>
+                      <a:ext cx="5303520" cy="11150991"/>
+                    </a:xfrm>
+                    <a:prstGeom prst="rect"/>
+                  </pic:spPr>
+                </pic:pic>
+              </a:graphicData>
+            </a:graphic>
+          </wp:inline>
+        </w:drawing>
+      </w:r>
+      <w:r>
+        <w:rPr>
+          <w:rFonts w:eastAsia="Microsoft YaHei" w:ascii="Microsoft YaHei" w:hAnsi="Microsoft YaHei"/>
+          <w:i/>
+          <w:color w:val="6B7280"/>
+          <w:sz w:val="18"/>
+        </w:rPr>
+        <w:t xml:space="preserve">  跨端口置灰券与点击提示示意</w:t>
       </w:r>
     </w:p>
     <w:p>
@@ -22023,11 +22689,48 @@
       <w:r>
         <w:rPr>
           <w:rFonts w:eastAsia="Microsoft YaHei" w:ascii="Microsoft YaHei" w:hAnsi="Microsoft YaHei"/>
-          <w:color w:val="888888"/>
-        </w:rPr>
-        <w:br/>
-        <w:t>[图: 确认订单选券]</w:t>
-        <w:br/>
+        </w:rPr>
+        <w:drawing>
+          <wp:inline xmlns:a="http://schemas.openxmlformats.org/drawingml/2006/main" xmlns:pic="http://schemas.openxmlformats.org/drawingml/2006/picture">
+            <wp:extent cx="5303520" cy="15066818"/>
+            <wp:docPr id="22" name="Picture 22"/>
+            <wp:cNvGraphicFramePr>
+              <a:graphicFrameLocks noChangeAspect="1"/>
+            </wp:cNvGraphicFramePr>
+            <a:graphic>
+              <a:graphicData uri="http://schemas.openxmlformats.org/drawingml/2006/picture">
+                <pic:pic>
+                  <pic:nvPicPr>
+                    <pic:cNvPr id="0" name="image.png"/>
+                    <pic:cNvPicPr/>
+                  </pic:nvPicPr>
+                  <pic:blipFill>
+                    <a:blip r:embed="rId34"/>
+                    <a:stretch>
+                      <a:fillRect/>
+                    </a:stretch>
+                  </pic:blipFill>
+                  <pic:spPr>
+                    <a:xfrm>
+                      <a:off x="0" y="0"/>
+                      <a:ext cx="5303520" cy="15066818"/>
+                    </a:xfrm>
+                    <a:prstGeom prst="rect"/>
+                  </pic:spPr>
+                </pic:pic>
+              </a:graphicData>
+            </a:graphic>
+          </wp:inline>
+        </w:drawing>
+      </w:r>
+      <w:r>
+        <w:rPr>
+          <w:rFonts w:eastAsia="Microsoft YaHei" w:ascii="Microsoft YaHei" w:hAnsi="Microsoft YaHei"/>
+          <w:i/>
+          <w:color w:val="6B7280"/>
+          <w:sz w:val="18"/>
+        </w:rPr>
+        <w:t xml:space="preserve">  确认订单选券</w:t>
       </w:r>
     </w:p>
     <w:p>
@@ -23281,7 +23984,7 @@
         </w:rPr>
         <w:t xml:space="preserve">本需求埋点事件与属性严格遵循 </w:t>
       </w:r>
-      <w:hyperlink r:id="rId16">
+      <w:hyperlink r:id="rId35">
         <w:r>
           <w:rPr>
             <w:rStyle w:val="Hyperlink"/>
@@ -26133,7 +26836,7 @@
         </w:rPr>
         <w:t>：</w:t>
       </w:r>
-      <w:hyperlink r:id="rId17">
+      <w:hyperlink r:id="rId36">
         <w:r>
           <w:rPr>
             <w:rStyle w:val="Hyperlink"/>
@@ -26159,12 +26862,59 @@
       </w:r>
     </w:p>
     <w:p>
-      <w:r>
-        <w:rPr>
-          <w:rFonts w:eastAsia="Microsoft YaHei" w:ascii="Microsoft YaHei" w:hAnsi="Microsoft YaHei"/>
-          <w:color w:val="DC2626"/>
-        </w:rPr>
-        <w:t>[缺失图片] 会员中心-批量送券原型</w:t>
+      <w:pPr>
+        <w:jc w:val="center"/>
+      </w:pPr>
+      <w:r>
+        <w:rPr>
+          <w:rFonts w:eastAsia="Microsoft YaHei" w:ascii="Microsoft YaHei" w:hAnsi="Microsoft YaHei"/>
+        </w:rPr>
+        <w:drawing>
+          <wp:inline xmlns:a="http://schemas.openxmlformats.org/drawingml/2006/main" xmlns:pic="http://schemas.openxmlformats.org/drawingml/2006/picture">
+            <wp:extent cx="5303520" cy="3729038"/>
+            <wp:docPr id="23" name="Picture 23"/>
+            <wp:cNvGraphicFramePr>
+              <a:graphicFrameLocks noChangeAspect="1"/>
+            </wp:cNvGraphicFramePr>
+            <a:graphic>
+              <a:graphicData uri="http://schemas.openxmlformats.org/drawingml/2006/picture">
+                <pic:pic>
+                  <pic:nvPicPr>
+                    <pic:cNvPr id="0" name="image.png"/>
+                    <pic:cNvPicPr/>
+                  </pic:nvPicPr>
+                  <pic:blipFill>
+                    <a:blip r:embed="rId37"/>
+                    <a:stretch>
+                      <a:fillRect/>
+                    </a:stretch>
+                  </pic:blipFill>
+                  <pic:spPr>
+                    <a:xfrm>
+                      <a:off x="0" y="0"/>
+                      <a:ext cx="5303520" cy="3729038"/>
+                    </a:xfrm>
+                    <a:prstGeom prst="rect"/>
+                  </pic:spPr>
+                </pic:pic>
+              </a:graphicData>
+            </a:graphic>
+          </wp:inline>
+        </w:drawing>
+      </w:r>
+    </w:p>
+    <w:p>
+      <w:pPr>
+        <w:jc w:val="center"/>
+      </w:pPr>
+      <w:r>
+        <w:rPr>
+          <w:rFonts w:eastAsia="Microsoft YaHei" w:ascii="Microsoft YaHei" w:hAnsi="Microsoft YaHei"/>
+          <w:i/>
+          <w:color w:val="6B7280"/>
+          <w:sz w:val="18"/>
+        </w:rPr>
+        <w:t>会员中心-批量送券原型</w:t>
       </w:r>
     </w:p>
     <w:p>
@@ -26225,7 +26975,7 @@
         </w:rPr>
         <w:t>：</w:t>
       </w:r>
-      <w:hyperlink r:id="rId18">
+      <w:hyperlink r:id="rId38">
         <w:r>
           <w:rPr>
             <w:rStyle w:val="Hyperlink"/>
@@ -26251,12 +27001,59 @@
       </w:r>
     </w:p>
     <w:p>
-      <w:r>
-        <w:rPr>
-          <w:rFonts w:eastAsia="Microsoft YaHei" w:ascii="Microsoft YaHei" w:hAnsi="Microsoft YaHei"/>
-          <w:color w:val="DC2626"/>
-        </w:rPr>
-        <w:t>[缺失图片] 关联直播原型</w:t>
+      <w:pPr>
+        <w:jc w:val="center"/>
+      </w:pPr>
+      <w:r>
+        <w:rPr>
+          <w:rFonts w:eastAsia="Microsoft YaHei" w:ascii="Microsoft YaHei" w:hAnsi="Microsoft YaHei"/>
+        </w:rPr>
+        <w:drawing>
+          <wp:inline xmlns:a="http://schemas.openxmlformats.org/drawingml/2006/main" xmlns:pic="http://schemas.openxmlformats.org/drawingml/2006/picture">
+            <wp:extent cx="5303520" cy="3729038"/>
+            <wp:docPr id="24" name="Picture 24"/>
+            <wp:cNvGraphicFramePr>
+              <a:graphicFrameLocks noChangeAspect="1"/>
+            </wp:cNvGraphicFramePr>
+            <a:graphic>
+              <a:graphicData uri="http://schemas.openxmlformats.org/drawingml/2006/picture">
+                <pic:pic>
+                  <pic:nvPicPr>
+                    <pic:cNvPr id="0" name="image.png"/>
+                    <pic:cNvPicPr/>
+                  </pic:nvPicPr>
+                  <pic:blipFill>
+                    <a:blip r:embed="rId39"/>
+                    <a:stretch>
+                      <a:fillRect/>
+                    </a:stretch>
+                  </pic:blipFill>
+                  <pic:spPr>
+                    <a:xfrm>
+                      <a:off x="0" y="0"/>
+                      <a:ext cx="5303520" cy="3729038"/>
+                    </a:xfrm>
+                    <a:prstGeom prst="rect"/>
+                  </pic:spPr>
+                </pic:pic>
+              </a:graphicData>
+            </a:graphic>
+          </wp:inline>
+        </w:drawing>
+      </w:r>
+    </w:p>
+    <w:p>
+      <w:pPr>
+        <w:jc w:val="center"/>
+      </w:pPr>
+      <w:r>
+        <w:rPr>
+          <w:rFonts w:eastAsia="Microsoft YaHei" w:ascii="Microsoft YaHei" w:hAnsi="Microsoft YaHei"/>
+          <w:i/>
+          <w:color w:val="6B7280"/>
+          <w:sz w:val="18"/>
+        </w:rPr>
+        <w:t>关联直播原型</w:t>
       </w:r>
     </w:p>
     <w:p>
@@ -26317,7 +27114,7 @@
         </w:rPr>
         <w:t>：</w:t>
       </w:r>
-      <w:hyperlink r:id="rId19">
+      <w:hyperlink r:id="rId40">
         <w:r>
           <w:rPr>
             <w:rStyle w:val="Hyperlink"/>
@@ -26343,12 +27140,59 @@
       </w:r>
     </w:p>
     <w:p>
-      <w:r>
-        <w:rPr>
-          <w:rFonts w:eastAsia="Microsoft YaHei" w:ascii="Microsoft YaHei" w:hAnsi="Microsoft YaHei"/>
-          <w:color w:val="DC2626"/>
-        </w:rPr>
-        <w:t>[缺失图片] 订单关联优惠券原型</w:t>
+      <w:pPr>
+        <w:jc w:val="center"/>
+      </w:pPr>
+      <w:r>
+        <w:rPr>
+          <w:rFonts w:eastAsia="Microsoft YaHei" w:ascii="Microsoft YaHei" w:hAnsi="Microsoft YaHei"/>
+        </w:rPr>
+        <w:drawing>
+          <wp:inline xmlns:a="http://schemas.openxmlformats.org/drawingml/2006/main" xmlns:pic="http://schemas.openxmlformats.org/drawingml/2006/picture">
+            <wp:extent cx="5303520" cy="3729038"/>
+            <wp:docPr id="25" name="Picture 25"/>
+            <wp:cNvGraphicFramePr>
+              <a:graphicFrameLocks noChangeAspect="1"/>
+            </wp:cNvGraphicFramePr>
+            <a:graphic>
+              <a:graphicData uri="http://schemas.openxmlformats.org/drawingml/2006/picture">
+                <pic:pic>
+                  <pic:nvPicPr>
+                    <pic:cNvPr id="0" name="image.png"/>
+                    <pic:cNvPicPr/>
+                  </pic:nvPicPr>
+                  <pic:blipFill>
+                    <a:blip r:embed="rId41"/>
+                    <a:stretch>
+                      <a:fillRect/>
+                    </a:stretch>
+                  </pic:blipFill>
+                  <pic:spPr>
+                    <a:xfrm>
+                      <a:off x="0" y="0"/>
+                      <a:ext cx="5303520" cy="3729038"/>
+                    </a:xfrm>
+                    <a:prstGeom prst="rect"/>
+                  </pic:spPr>
+                </pic:pic>
+              </a:graphicData>
+            </a:graphic>
+          </wp:inline>
+        </w:drawing>
+      </w:r>
+    </w:p>
+    <w:p>
+      <w:pPr>
+        <w:jc w:val="center"/>
+      </w:pPr>
+      <w:r>
+        <w:rPr>
+          <w:rFonts w:eastAsia="Microsoft YaHei" w:ascii="Microsoft YaHei" w:hAnsi="Microsoft YaHei"/>
+          <w:i/>
+          <w:color w:val="6B7280"/>
+          <w:sz w:val="18"/>
+        </w:rPr>
+        <w:t>订单关联优惠券原型</w:t>
       </w:r>
     </w:p>
     <w:p>

</xml_diff>

<commit_message>
update coupon-prd.docx: sync PRD with merged 下架 button + reason popup
</commit_message>
<xml_diff>
--- a/coupon-prd.docx
+++ b/coupon-prd.docx
@@ -1667,7 +1667,7 @@
                 <w:rFonts w:eastAsia="Microsoft YaHei" w:ascii="Microsoft YaHei" w:hAnsi="Microsoft YaHei"/>
                 <w:b w:val="0"/>
               </w:rPr>
-              <w:t>「启用」→ 平台端下架 / 平台端违规下架</w:t>
+              <w:t>「启用」→ 平台端「下架」（弹窗填写下架原因，必填）</w:t>
             </w:r>
           </w:p>
         </w:tc>
@@ -2294,21 +2294,49 @@
                 <w:rFonts w:eastAsia="Microsoft YaHei" w:ascii="Microsoft YaHei" w:hAnsi="Microsoft YaHei"/>
                 <w:b w:val="0"/>
               </w:rPr>
-              <w:t>① 仅可下架</w:t>
-            </w:r>
-            <w:r>
-              <w:rPr>
-                <w:rFonts w:eastAsia="Microsoft YaHei" w:ascii="Microsoft YaHei" w:hAnsi="Microsoft YaHei"/>
-                <w:b/>
-              </w:rPr>
-              <w:t>自己创建</w:t>
-            </w:r>
-            <w:r>
-              <w:rPr>
-                <w:rFonts w:eastAsia="Microsoft YaHei" w:ascii="Microsoft YaHei" w:hAnsi="Microsoft YaHei"/>
-                <w:b w:val="0"/>
-              </w:rPr>
-              <w:t>的优惠券</w:t>
+              <w:t xml:space="preserve">① </w:t>
+            </w:r>
+            <w:r>
+              <w:rPr>
+                <w:rFonts w:eastAsia="Microsoft YaHei" w:ascii="Microsoft YaHei" w:hAnsi="Microsoft YaHei"/>
+                <w:b/>
+              </w:rPr>
+              <w:t>下架前校验活动引用（硬拦截）</w:t>
+            </w:r>
+            <w:r>
+              <w:rPr>
+                <w:rFonts w:eastAsia="Microsoft YaHei" w:ascii="Microsoft YaHei" w:hAnsi="Microsoft YaHei"/>
+                <w:b w:val="0"/>
+              </w:rPr>
+              <w:t>：系统检查是否存在状态=「未开始 / 进行中」的</w:t>
+            </w:r>
+            <w:r>
+              <w:rPr>
+                <w:rFonts w:eastAsia="Microsoft YaHei" w:ascii="Microsoft YaHei" w:hAnsi="Microsoft YaHei"/>
+                <w:b/>
+              </w:rPr>
+              <w:t>发券活动</w:t>
+            </w:r>
+            <w:r>
+              <w:rPr>
+                <w:rFonts w:eastAsia="Microsoft YaHei" w:ascii="Microsoft YaHei" w:hAnsi="Microsoft YaHei"/>
+                <w:b w:val="0"/>
+              </w:rPr>
+              <w:t>关联本券（跨"优惠券管理"与"发券活动管理"两模块校验）；若存在，</w:t>
+            </w:r>
+            <w:r>
+              <w:rPr>
+                <w:rFonts w:eastAsia="Microsoft YaHei" w:ascii="Microsoft YaHei" w:hAnsi="Microsoft YaHei"/>
+                <w:b/>
+              </w:rPr>
+              <w:t>禁止下架</w:t>
+            </w:r>
+            <w:r>
+              <w:rPr>
+                <w:rFonts w:eastAsia="Microsoft YaHei" w:ascii="Microsoft YaHei" w:hAnsi="Microsoft YaHei"/>
+                <w:b w:val="0"/>
+              </w:rPr>
+              <w:t>并提示"该券正被 N 个发券活动引用，请先删除相关发券活动后再下架"，必须将引用活动删除或置为「已结束」后方可下架（发券活动侧约束见 §4.5）</w:t>
             </w:r>
             <w:r>
               <w:br/>
@@ -2325,42 +2353,28 @@
                 <w:rFonts w:eastAsia="Microsoft YaHei" w:ascii="Microsoft YaHei" w:hAnsi="Microsoft YaHei"/>
                 <w:b/>
               </w:rPr>
-              <w:t>下架前校验活动引用（硬拦截）</w:t>
-            </w:r>
-            <w:r>
-              <w:rPr>
-                <w:rFonts w:eastAsia="Microsoft YaHei" w:ascii="Microsoft YaHei" w:hAnsi="Microsoft YaHei"/>
-                <w:b w:val="0"/>
-              </w:rPr>
-              <w:t>：系统检查是否存在状态=「未开始 / 进行中」的</w:t>
-            </w:r>
-            <w:r>
-              <w:rPr>
-                <w:rFonts w:eastAsia="Microsoft YaHei" w:ascii="Microsoft YaHei" w:hAnsi="Microsoft YaHei"/>
-                <w:b/>
-              </w:rPr>
-              <w:t>发券活动</w:t>
-            </w:r>
-            <w:r>
-              <w:rPr>
-                <w:rFonts w:eastAsia="Microsoft YaHei" w:ascii="Microsoft YaHei" w:hAnsi="Microsoft YaHei"/>
-                <w:b w:val="0"/>
-              </w:rPr>
-              <w:t>关联本券（跨"优惠券管理"与"发券活动管理"两模块校验）；若存在，</w:t>
-            </w:r>
-            <w:r>
-              <w:rPr>
-                <w:rFonts w:eastAsia="Microsoft YaHei" w:ascii="Microsoft YaHei" w:hAnsi="Microsoft YaHei"/>
-                <w:b/>
-              </w:rPr>
-              <w:t>禁止下架</w:t>
-            </w:r>
-            <w:r>
-              <w:rPr>
-                <w:rFonts w:eastAsia="Microsoft YaHei" w:ascii="Microsoft YaHei" w:hAnsi="Microsoft YaHei"/>
-                <w:b w:val="0"/>
-              </w:rPr>
-              <w:t>并提示"该券正被 N 个发券活动引用，请先删除相关发券活动后再下架"，必须将引用活动删除或置为「已结束」后方可下架（发券活动侧约束见 §4.5）</w:t>
+              <w:t>弹窗「下架优惠券」→ 必填下架原因（≤200字）→ 确定</w:t>
+            </w:r>
+            <w:r>
+              <w:rPr>
+                <w:rFonts w:eastAsia="Microsoft YaHei" w:ascii="Microsoft YaHei" w:hAnsi="Microsoft YaHei"/>
+                <w:b w:val="0"/>
+              </w:rPr>
+              <w:t>：下架原因作为下架操作记录留存（供违规处置追溯）；平台端可下架</w:t>
+            </w:r>
+            <w:r>
+              <w:rPr>
+                <w:rFonts w:eastAsia="Microsoft YaHei" w:ascii="Microsoft YaHei" w:hAnsi="Microsoft YaHei"/>
+                <w:b/>
+              </w:rPr>
+              <w:t>任意商家</w:t>
+            </w:r>
+            <w:r>
+              <w:rPr>
+                <w:rFonts w:eastAsia="Microsoft YaHei" w:ascii="Microsoft YaHei" w:hAnsi="Microsoft YaHei"/>
+                <w:b w:val="0"/>
+              </w:rPr>
+              <w:t>的优惠券（含跨商家违规处置）</w:t>
             </w:r>
             <w:r>
               <w:br/>
@@ -2456,151 +2470,7 @@
                 <w:rFonts w:eastAsia="Microsoft YaHei" w:ascii="Microsoft YaHei" w:hAnsi="Microsoft YaHei"/>
                 <w:b w:val="0"/>
               </w:rPr>
-              <w:t>」</w:t>
-            </w:r>
-          </w:p>
-        </w:tc>
-      </w:tr>
-      <w:tr>
-        <w:tc>
-          <w:tcPr>
-            <w:tcW w:type="dxa" w:w="1440"/>
-          </w:tcPr>
-          <w:p>
-            <w:r/>
-            <w:r>
-              <w:rPr>
-                <w:rFonts w:eastAsia="Microsoft YaHei" w:ascii="Microsoft YaHei" w:hAnsi="Microsoft YaHei"/>
-                <w:b w:val="0"/>
-              </w:rPr>
-              <w:t>启用</w:t>
-            </w:r>
-          </w:p>
-        </w:tc>
-        <w:tc>
-          <w:tcPr>
-            <w:tcW w:type="dxa" w:w="1440"/>
-          </w:tcPr>
-          <w:p>
-            <w:r/>
-            <w:r>
-              <w:rPr>
-                <w:rFonts w:eastAsia="Microsoft YaHei" w:ascii="Microsoft YaHei" w:hAnsi="Microsoft YaHei"/>
-                <w:b w:val="0"/>
-              </w:rPr>
-              <w:t>违规下架</w:t>
-            </w:r>
-          </w:p>
-        </w:tc>
-        <w:tc>
-          <w:tcPr>
-            <w:tcW w:type="dxa" w:w="1440"/>
-          </w:tcPr>
-          <w:p>
-            <w:r/>
-            <w:r>
-              <w:rPr>
-                <w:rFonts w:eastAsia="Microsoft YaHei" w:ascii="Microsoft YaHei" w:hAnsi="Microsoft YaHei"/>
-                <w:b w:val="0"/>
-              </w:rPr>
-              <w:t>平台端</w:t>
-            </w:r>
-          </w:p>
-        </w:tc>
-        <w:tc>
-          <w:tcPr>
-            <w:tcW w:type="dxa" w:w="1440"/>
-          </w:tcPr>
-          <w:p>
-            <w:r/>
-            <w:r>
-              <w:rPr>
-                <w:rFonts w:eastAsia="Microsoft YaHei" w:ascii="Microsoft YaHei" w:hAnsi="Microsoft YaHei"/>
-                <w:b w:val="0"/>
-              </w:rPr>
-              <w:t>可下架</w:t>
-            </w:r>
-            <w:r>
-              <w:rPr>
-                <w:rFonts w:eastAsia="Microsoft YaHei" w:ascii="Microsoft YaHei" w:hAnsi="Microsoft YaHei"/>
-                <w:b/>
-              </w:rPr>
-              <w:t>所有商家</w:t>
-            </w:r>
-            <w:r>
-              <w:rPr>
-                <w:rFonts w:eastAsia="Microsoft YaHei" w:ascii="Microsoft YaHei" w:hAnsi="Microsoft YaHei"/>
-                <w:b w:val="0"/>
-              </w:rPr>
-              <w:t>的优惠券（违规处置）</w:t>
-            </w:r>
-            <w:r>
-              <w:br/>
-            </w:r>
-            <w:r>
-              <w:rPr>
-                <w:rFonts w:eastAsia="Microsoft YaHei" w:ascii="Microsoft YaHei" w:hAnsi="Microsoft YaHei"/>
-                <w:b w:val="0"/>
-              </w:rPr>
-              <w:t>弹窗「违规下架」→ 输入违规原因（</w:t>
-            </w:r>
-            <w:r>
-              <w:rPr>
-                <w:rFonts w:eastAsia="Microsoft YaHei" w:ascii="Microsoft YaHei" w:hAnsi="Microsoft YaHei"/>
-                <w:b/>
-              </w:rPr>
-              <w:t>必填</w:t>
-            </w:r>
-            <w:r>
-              <w:rPr>
-                <w:rFonts w:eastAsia="Microsoft YaHei" w:ascii="Microsoft YaHei" w:hAnsi="Microsoft YaHei"/>
-                <w:b w:val="0"/>
-              </w:rPr>
-              <w:t>，≤200字）→ 确定</w:t>
-            </w:r>
-          </w:p>
-        </w:tc>
-        <w:tc>
-          <w:tcPr>
-            <w:tcW w:type="dxa" w:w="1440"/>
-          </w:tcPr>
-          <w:p>
-            <w:r/>
-            <w:r>
-              <w:rPr>
-                <w:rFonts w:eastAsia="Microsoft YaHei" w:ascii="Microsoft YaHei" w:hAnsi="Microsoft YaHei"/>
-                <w:b w:val="0"/>
-              </w:rPr>
-              <w:t>下架</w:t>
-            </w:r>
-          </w:p>
-        </w:tc>
-        <w:tc>
-          <w:tcPr>
-            <w:tcW w:type="dxa" w:w="1440"/>
-          </w:tcPr>
-          <w:p>
-            <w:r/>
-            <w:r>
-              <w:rPr>
-                <w:rFonts w:eastAsia="Microsoft YaHei" w:ascii="Microsoft YaHei" w:hAnsi="Microsoft YaHei"/>
-                <w:b w:val="0"/>
-              </w:rPr>
-              <w:t>平台端列表操作列「</w:t>
-            </w:r>
-            <w:r>
-              <w:rPr>
-                <w:rFonts w:eastAsia="Microsoft YaHei" w:ascii="Microsoft YaHei" w:hAnsi="Microsoft YaHei"/>
-                <w:b w:val="0"/>
-              </w:rPr>
-              <w:t>违规下架</w:t>
-            </w:r>
-            <w:r>
-              <w:rPr>
-                <w:rFonts w:eastAsia="Microsoft YaHei" w:ascii="Microsoft YaHei" w:hAnsi="Microsoft YaHei"/>
-                <w:b w:val="0"/>
-              </w:rPr>
-              <w:t>」→ 弹窗（标题"违规下架"，文本框 placeholder="请输入违规原因，必填"，取消/确定按钮）</w:t>
+              <w:t>」→ 弹窗（标题"下架优惠券"，文本框 placeholder="请输入下架原因（必填，≤200字）"，取消/确定按钮）；D1 券详情页「下架」按钮同逻辑</w:t>
             </w:r>
           </w:p>
         </w:tc>
@@ -6552,7 +6422,7 @@
                 <w:rFonts w:eastAsia="Microsoft YaHei" w:ascii="Microsoft YaHei" w:hAnsi="Microsoft YaHei"/>
                 <w:b w:val="0"/>
               </w:rPr>
-              <w:t>将券置为「下架」状态（不可逆），列表即时刷新；仅影响发券活动可选性，不影响已发放用户券</w:t>
+              <w:t>点击「下架」→ 弹窗「下架优惠券」→ 必填下架原因（≤200字）→ 确定 → 将券置为「下架」状态（不可逆），列表即时刷新；仅影响发券活动可选性，不影响已发放用户券</w:t>
             </w:r>
           </w:p>
         </w:tc>
@@ -7883,7 +7753,7 @@
                 <w:rFonts w:eastAsia="Microsoft YaHei" w:ascii="Microsoft YaHei" w:hAnsi="Microsoft YaHei"/>
                 <w:b w:val="0"/>
               </w:rPr>
-              <w:t>将当前券置为「下架」状态（不可逆）；仅影响发券活动可选性，已发放用户券不受影响</w:t>
+              <w:t>点击「下架」→ 弹窗「下架优惠券」→ 必填下架原因（≤200字）→ 确定 → 将当前券置为「下架」状态（不可逆）；仅影响发券活动可选性，已发放用户券不受影响</w:t>
             </w:r>
           </w:p>
         </w:tc>
@@ -8021,7 +7891,7 @@
           <w:rFonts w:eastAsia="Microsoft YaHei" w:ascii="Microsoft YaHei" w:hAnsi="Microsoft YaHei"/>
           <w:b w:val="0"/>
         </w:rPr>
-        <w:t>：点击「下架」→ 二次确认弹窗（提示不可逆）→ 确认后接口置下架 → 列表与详情页状态 Tag 即时刷新 → Toast「已下架」。</w:t>
+        <w:t>：点击「下架」→ 弹窗「下架优惠券」→ 填写下架原因（必填，≤200字）→ 确定后接口置下架 → 列表与详情页状态 Tag 即时刷新 → Toast「已下架」。</w:t>
       </w:r>
     </w:p>
     <w:p>
@@ -15426,7 +15296,7 @@
           <w:color w:val="6B7280"/>
           <w:sz w:val="18"/>
         </w:rPr>
-        <w:t xml:space="preserve">  P5用户券查询-查询入口</w:t>
+        <w:t xml:space="preserve">  P5用户券查询</w:t>
       </w:r>
     </w:p>
     <w:p>
@@ -15466,276 +15336,6 @@
         <w:t>（与用户基本信息 / 订单 / 资产并列）。导航路径：用户管理 / 用户详情 / 用户券查询。下方查询条件与列表字段不变。</w:t>
       </w:r>
     </w:p>
-    <w:p>
-      <w:pPr>
-        <w:pStyle w:val="Heading4"/>
-      </w:pPr>
-      <w:r>
-        <w:rPr>
-          <w:rFonts w:eastAsia="Microsoft YaHei" w:ascii="Microsoft YaHei" w:hAnsi="Microsoft YaHei"/>
-        </w:rPr>
-        <w:t xml:space="preserve">4.1.7.0 优惠券详情展示 </w:t>
-      </w:r>
-      <w:r>
-        <w:rPr>
-          <w:rFonts w:eastAsia="Microsoft YaHei" w:ascii="Microsoft YaHei" w:hAnsi="Microsoft YaHei"/>
-          <w:b w:val="0"/>
-        </w:rPr>
-        <w:t>本期新增</w:t>
-      </w:r>
-    </w:p>
-    <w:p>
-      <w:r>
-        <w:rPr>
-          <w:rFonts w:eastAsia="Microsoft YaHei" w:ascii="Microsoft YaHei" w:hAnsi="Microsoft YaHei"/>
-          <w:b/>
-        </w:rPr>
-        <w:t>页面原型与交互示意</w:t>
-      </w:r>
-      <w:r>
-        <w:rPr>
-          <w:rFonts w:eastAsia="Microsoft YaHei" w:ascii="Microsoft YaHei" w:hAnsi="Microsoft YaHei"/>
-          <w:b w:val="0"/>
-        </w:rPr>
-        <w:t>：输入用户 ID 或手机号并点击「查询」后，展示该用户的券账户详情页。页面分为上下两区域：</w:t>
-      </w:r>
-    </w:p>
-    <w:p>
-      <w:r>
-        <w:rPr>
-          <w:rFonts w:eastAsia="Microsoft YaHei" w:ascii="Microsoft YaHei" w:hAnsi="Microsoft YaHei"/>
-        </w:rPr>
-        <w:drawing>
-          <wp:inline xmlns:a="http://schemas.openxmlformats.org/drawingml/2006/main" xmlns:pic="http://schemas.openxmlformats.org/drawingml/2006/picture">
-            <wp:extent cx="5303520" cy="2541270"/>
-            <wp:docPr id="13" name="Picture 13"/>
-            <wp:cNvGraphicFramePr>
-              <a:graphicFrameLocks noChangeAspect="1"/>
-            </wp:cNvGraphicFramePr>
-            <a:graphic>
-              <a:graphicData uri="http://schemas.openxmlformats.org/drawingml/2006/picture">
-                <pic:pic>
-                  <pic:nvPicPr>
-                    <pic:cNvPr id="0" name="image.png"/>
-                    <pic:cNvPicPr/>
-                  </pic:nvPicPr>
-                  <pic:blipFill>
-                    <a:blip r:embed="rId25"/>
-                    <a:stretch>
-                      <a:fillRect/>
-                    </a:stretch>
-                  </pic:blipFill>
-                  <pic:spPr>
-                    <a:xfrm>
-                      <a:off x="0" y="0"/>
-                      <a:ext cx="5303520" cy="2541270"/>
-                    </a:xfrm>
-                    <a:prstGeom prst="rect"/>
-                  </pic:spPr>
-                </pic:pic>
-              </a:graphicData>
-            </a:graphic>
-          </wp:inline>
-        </w:drawing>
-      </w:r>
-      <w:r>
-        <w:rPr>
-          <w:rFonts w:eastAsia="Microsoft YaHei" w:ascii="Microsoft YaHei" w:hAnsi="Microsoft YaHei"/>
-          <w:i/>
-          <w:color w:val="6B7280"/>
-          <w:sz w:val="18"/>
-        </w:rPr>
-        <w:t xml:space="preserve">  P5优惠券详情展示</w:t>
-      </w:r>
-    </w:p>
-    <w:tbl>
-      <w:tblPr>
-        <w:tblStyle w:val="TableGrid"/>
-        <w:tblW w:type="auto" w:w="0"/>
-        <w:tblLook w:firstColumn="1" w:firstRow="1" w:lastColumn="0" w:lastRow="0" w:noHBand="0" w:noVBand="1" w:val="04A0"/>
-        <w:jc w:val="center"/>
-        <w:tblBorders>
-          <w:top w:val="single" w:sz="4" w:space="0" w:color="999999"/>
-          <w:left w:val="single" w:sz="4" w:space="0" w:color="999999"/>
-          <w:bottom w:val="single" w:sz="4" w:space="0" w:color="999999"/>
-          <w:right w:val="single" w:sz="4" w:space="0" w:color="999999"/>
-          <w:insideH w:val="single" w:sz="4" w:space="0" w:color="999999"/>
-          <w:insideV w:val="single" w:sz="4" w:space="0" w:color="999999"/>
-        </w:tblBorders>
-      </w:tblPr>
-      <w:tblGrid>
-        <w:gridCol w:w="4320"/>
-        <w:gridCol w:w="4320"/>
-      </w:tblGrid>
-      <w:tr>
-        <w:tc>
-          <w:tcPr>
-            <w:tcW w:type="dxa" w:w="4320"/>
-          </w:tcPr>
-          <w:p>
-            <w:r>
-              <w:rPr>
-                <w:b/>
-              </w:rPr>
-            </w:r>
-            <w:r>
-              <w:rPr>
-                <w:rFonts w:eastAsia="Microsoft YaHei" w:ascii="Microsoft YaHei" w:hAnsi="Microsoft YaHei"/>
-                <w:b/>
-              </w:rPr>
-              <w:t>区域</w:t>
-            </w:r>
-          </w:p>
-        </w:tc>
-        <w:tc>
-          <w:tcPr>
-            <w:tcW w:type="dxa" w:w="4320"/>
-          </w:tcPr>
-          <w:p>
-            <w:r>
-              <w:rPr>
-                <w:b/>
-              </w:rPr>
-            </w:r>
-            <w:r>
-              <w:rPr>
-                <w:rFonts w:eastAsia="Microsoft YaHei" w:ascii="Microsoft YaHei" w:hAnsi="Microsoft YaHei"/>
-                <w:b/>
-              </w:rPr>
-              <w:t>内容说明</w:t>
-            </w:r>
-          </w:p>
-        </w:tc>
-      </w:tr>
-      <w:tr>
-        <w:tc>
-          <w:tcPr>
-            <w:tcW w:type="dxa" w:w="4320"/>
-          </w:tcPr>
-          <w:p>
-            <w:r/>
-            <w:r>
-              <w:rPr>
-                <w:rFonts w:eastAsia="Microsoft YaHei" w:ascii="Microsoft YaHei" w:hAnsi="Microsoft YaHei"/>
-                <w:b/>
-              </w:rPr>
-              <w:t>用户信息头部</w:t>
-            </w:r>
-          </w:p>
-        </w:tc>
-        <w:tc>
-          <w:tcPr>
-            <w:tcW w:type="dxa" w:w="4320"/>
-          </w:tcPr>
-          <w:p>
-            <w:r/>
-            <w:r>
-              <w:rPr>
-                <w:rFonts w:eastAsia="Microsoft YaHei" w:ascii="Microsoft YaHei" w:hAnsi="Microsoft YaHei"/>
-                <w:b w:val="0"/>
-              </w:rPr>
-              <w:t>展示用户头像、ID（如 U6492）、性别、手机号、会员级别；下方元数据行：会员等级（VIP）、成单量、积分、注册时间、消费金额、储值余额、标签等。</w:t>
-            </w:r>
-          </w:p>
-        </w:tc>
-      </w:tr>
-      <w:tr>
-        <w:tc>
-          <w:tcPr>
-            <w:tcW w:type="dxa" w:w="4320"/>
-          </w:tcPr>
-          <w:p>
-            <w:r/>
-            <w:r>
-              <w:rPr>
-                <w:rFonts w:eastAsia="Microsoft YaHei" w:ascii="Microsoft YaHei" w:hAnsi="Microsoft YaHei"/>
-                <w:b/>
-              </w:rPr>
-              <w:t>Tab 栏</w:t>
-            </w:r>
-          </w:p>
-        </w:tc>
-        <w:tc>
-          <w:tcPr>
-            <w:tcW w:type="dxa" w:w="4320"/>
-          </w:tcPr>
-          <w:p>
-            <w:r/>
-            <w:r>
-              <w:rPr>
-                <w:rFonts w:eastAsia="Microsoft YaHei" w:ascii="Microsoft YaHei" w:hAnsi="Microsoft YaHei"/>
-                <w:b w:val="0"/>
-              </w:rPr>
-              <w:t>充值明细 / 储值明细 / 积分明细 / 分销信息 / AOT签到记录 / 管理功能；默认停留在「充值明细」（即券交易记录）Tab。</w:t>
-            </w:r>
-          </w:p>
-        </w:tc>
-      </w:tr>
-      <w:tr>
-        <w:tc>
-          <w:tcPr>
-            <w:tcW w:type="dxa" w:w="4320"/>
-          </w:tcPr>
-          <w:p>
-            <w:r/>
-            <w:r>
-              <w:rPr>
-                <w:rFonts w:eastAsia="Microsoft YaHei" w:ascii="Microsoft YaHei" w:hAnsi="Microsoft YaHei"/>
-                <w:b/>
-              </w:rPr>
-              <w:t>交易记录列表</w:t>
-            </w:r>
-          </w:p>
-        </w:tc>
-        <w:tc>
-          <w:tcPr>
-            <w:tcW w:type="dxa" w:w="4320"/>
-          </w:tcPr>
-          <w:p>
-            <w:r/>
-            <w:r>
-              <w:rPr>
-                <w:rFonts w:eastAsia="Microsoft YaHei" w:ascii="Microsoft YaHei" w:hAnsi="Microsoft YaHei"/>
-                <w:b w:val="0"/>
-              </w:rPr>
-              <w:t>列：交易时间、口袋编号（订单号）、商品活动、优惠金额、实付金额、支付方式；按交易时间倒序排列；支持分页（默认 20 条/页）。</w:t>
-            </w:r>
-          </w:p>
-        </w:tc>
-      </w:tr>
-      <w:tr>
-        <w:tc>
-          <w:tcPr>
-            <w:tcW w:type="dxa" w:w="4320"/>
-          </w:tcPr>
-          <w:p>
-            <w:r/>
-            <w:r>
-              <w:rPr>
-                <w:rFonts w:eastAsia="Microsoft YaHei" w:ascii="Microsoft YaHei" w:hAnsi="Microsoft YaHei"/>
-                <w:b/>
-              </w:rPr>
-              <w:t>操作按钮</w:t>
-            </w:r>
-          </w:p>
-        </w:tc>
-        <w:tc>
-          <w:tcPr>
-            <w:tcW w:type="dxa" w:w="4320"/>
-          </w:tcPr>
-          <w:p>
-            <w:r/>
-            <w:r>
-              <w:rPr>
-                <w:rFonts w:eastAsia="Microsoft YaHei" w:ascii="Microsoft YaHei" w:hAnsi="Microsoft YaHei"/>
-                <w:b w:val="0"/>
-              </w:rPr>
-              <w:t>顶部右侧：解绑设备 / 解冻用户账户 / 询单验证（快捷操作入口）。</w:t>
-            </w:r>
-          </w:p>
-        </w:tc>
-      </w:tr>
-    </w:tbl>
     <w:p>
       <w:pPr>
         <w:pStyle w:val="Heading4"/>
@@ -16530,7 +16130,7 @@
         <w:drawing>
           <wp:inline xmlns:a="http://schemas.openxmlformats.org/drawingml/2006/main" xmlns:pic="http://schemas.openxmlformats.org/drawingml/2006/picture">
             <wp:extent cx="5303520" cy="3211576"/>
-            <wp:docPr id="14" name="Picture 14"/>
+            <wp:docPr id="13" name="Picture 13"/>
             <wp:cNvGraphicFramePr>
               <a:graphicFrameLocks noChangeAspect="1"/>
             </wp:cNvGraphicFramePr>
@@ -16542,7 +16142,7 @@
                     <pic:cNvPicPr/>
                   </pic:nvPicPr>
                   <pic:blipFill>
-                    <a:blip r:embed="rId26"/>
+                    <a:blip r:embed="rId25"/>
                     <a:stretch>
                       <a:fillRect/>
                     </a:stretch>
@@ -16651,7 +16251,7 @@
         <w:drawing>
           <wp:inline xmlns:a="http://schemas.openxmlformats.org/drawingml/2006/main" xmlns:pic="http://schemas.openxmlformats.org/drawingml/2006/picture">
             <wp:extent cx="5303520" cy="3145282"/>
-            <wp:docPr id="15" name="Picture 15"/>
+            <wp:docPr id="14" name="Picture 14"/>
             <wp:cNvGraphicFramePr>
               <a:graphicFrameLocks noChangeAspect="1"/>
             </wp:cNvGraphicFramePr>
@@ -16663,7 +16263,7 @@
                     <pic:cNvPicPr/>
                   </pic:nvPicPr>
                   <pic:blipFill>
-                    <a:blip r:embed="rId27"/>
+                    <a:blip r:embed="rId26"/>
                     <a:stretch>
                       <a:fillRect/>
                     </a:stretch>
@@ -19391,6 +18991,171 @@
         <w:drawing>
           <wp:inline xmlns:a="http://schemas.openxmlformats.org/drawingml/2006/main" xmlns:pic="http://schemas.openxmlformats.org/drawingml/2006/picture">
             <wp:extent cx="5303520" cy="3314700"/>
+            <wp:docPr id="15" name="Picture 15"/>
+            <wp:cNvGraphicFramePr>
+              <a:graphicFrameLocks noChangeAspect="1"/>
+            </wp:cNvGraphicFramePr>
+            <a:graphic>
+              <a:graphicData uri="http://schemas.openxmlformats.org/drawingml/2006/picture">
+                <pic:pic>
+                  <pic:nvPicPr>
+                    <pic:cNvPr id="0" name="image.png"/>
+                    <pic:cNvPicPr/>
+                  </pic:nvPicPr>
+                  <pic:blipFill>
+                    <a:blip r:embed="rId27"/>
+                    <a:stretch>
+                      <a:fillRect/>
+                    </a:stretch>
+                  </pic:blipFill>
+                  <pic:spPr>
+                    <a:xfrm>
+                      <a:off x="0" y="0"/>
+                      <a:ext cx="5303520" cy="3314700"/>
+                    </a:xfrm>
+                    <a:prstGeom prst="rect"/>
+                  </pic:spPr>
+                </pic:pic>
+              </a:graphicData>
+            </a:graphic>
+          </wp:inline>
+        </w:drawing>
+      </w:r>
+      <w:r>
+        <w:rPr>
+          <w:rFonts w:eastAsia="Microsoft YaHei" w:ascii="Microsoft YaHei" w:hAnsi="Microsoft YaHei"/>
+          <w:i/>
+          <w:color w:val="6B7280"/>
+          <w:sz w:val="18"/>
+        </w:rPr>
+        <w:t xml:space="preserve">  App端原型</w:t>
+      </w:r>
+    </w:p>
+    <w:p>
+      <w:r>
+        <w:rPr>
+          <w:rFonts w:eastAsia="Microsoft YaHei" w:ascii="Microsoft YaHei" w:hAnsi="Microsoft YaHei"/>
+          <w:b/>
+        </w:rPr>
+        <w:t>App 端为部分新增</w:t>
+      </w:r>
+      <w:r>
+        <w:rPr>
+          <w:rFonts w:eastAsia="Microsoft YaHei" w:ascii="Microsoft YaHei" w:hAnsi="Microsoft YaHei"/>
+          <w:b w:val="0"/>
+        </w:rPr>
+        <w:t>。本期 App 需新建：</w:t>
+      </w:r>
+      <w:r>
+        <w:rPr>
+          <w:rFonts w:eastAsia="Microsoft YaHei" w:ascii="Microsoft YaHei" w:hAnsi="Microsoft YaHei"/>
+          <w:b/>
+        </w:rPr>
+        <w:t>商品详情页优惠券入口条与优惠详情弹窗</w:t>
+      </w:r>
+      <w:r>
+        <w:rPr>
+          <w:rFonts w:eastAsia="Microsoft YaHei" w:ascii="Microsoft YaHei" w:hAnsi="Microsoft YaHei"/>
+          <w:b w:val="0"/>
+        </w:rPr>
+        <w:t>、</w:t>
+      </w:r>
+      <w:r>
+        <w:rPr>
+          <w:rFonts w:eastAsia="Microsoft YaHei" w:ascii="Microsoft YaHei" w:hAnsi="Microsoft YaHei"/>
+          <w:b/>
+        </w:rPr>
+        <w:t>券规则页</w:t>
+      </w:r>
+      <w:r>
+        <w:rPr>
+          <w:rFonts w:eastAsia="Microsoft YaHei" w:ascii="Microsoft YaHei" w:hAnsi="Microsoft YaHei"/>
+          <w:b w:val="0"/>
+        </w:rPr>
+        <w:t>、</w:t>
+      </w:r>
+      <w:r>
+        <w:rPr>
+          <w:rFonts w:eastAsia="Microsoft YaHei" w:ascii="Microsoft YaHei" w:hAnsi="Microsoft YaHei"/>
+          <w:b/>
+        </w:rPr>
+        <w:t>我的优惠券页</w:t>
+      </w:r>
+      <w:r>
+        <w:rPr>
+          <w:rFonts w:eastAsia="Microsoft YaHei" w:ascii="Microsoft YaHei" w:hAnsi="Microsoft YaHei"/>
+          <w:b w:val="0"/>
+        </w:rPr>
+        <w:t>、</w:t>
+      </w:r>
+      <w:r>
+        <w:rPr>
+          <w:rFonts w:eastAsia="Microsoft YaHei" w:ascii="Microsoft YaHei" w:hAnsi="Microsoft YaHei"/>
+          <w:b/>
+        </w:rPr>
+        <w:t>确认订单选券/核销逻辑</w:t>
+      </w:r>
+      <w:r>
+        <w:rPr>
+          <w:rFonts w:eastAsia="Microsoft YaHei" w:ascii="Microsoft YaHei" w:hAnsi="Microsoft YaHei"/>
+          <w:b w:val="0"/>
+        </w:rPr>
+        <w:t>。以下逐页面逐功能点拆解。</w:t>
+      </w:r>
+    </w:p>
+    <w:p>
+      <w:pPr>
+        <w:pStyle w:val="Heading3"/>
+      </w:pPr>
+      <w:r>
+        <w:rPr>
+          <w:rFonts w:eastAsia="Microsoft YaHei" w:ascii="Microsoft YaHei" w:hAnsi="Microsoft YaHei"/>
+        </w:rPr>
+        <w:t xml:space="preserve">4.3.1 商品详情页优惠券入口与优惠详情弹窗 </w:t>
+      </w:r>
+      <w:r>
+        <w:rPr>
+          <w:rFonts w:eastAsia="Microsoft YaHei" w:ascii="Microsoft YaHei" w:hAnsi="Microsoft YaHei"/>
+          <w:b w:val="0"/>
+        </w:rPr>
+        <w:t>本期新增</w:t>
+      </w:r>
+    </w:p>
+    <w:p>
+      <w:pPr>
+        <w:pStyle w:val="Heading4"/>
+      </w:pPr>
+      <w:r>
+        <w:rPr>
+          <w:rFonts w:eastAsia="Microsoft YaHei" w:ascii="Microsoft YaHei" w:hAnsi="Microsoft YaHei"/>
+        </w:rPr>
+        <w:t>4.3.1.1 原型与交互示意</w:t>
+      </w:r>
+    </w:p>
+    <w:p>
+      <w:r>
+        <w:rPr>
+          <w:rFonts w:eastAsia="Microsoft YaHei" w:ascii="Microsoft YaHei" w:hAnsi="Microsoft YaHei"/>
+          <w:b/>
+        </w:rPr>
+        <w:t>入口链</w:t>
+      </w:r>
+      <w:r>
+        <w:rPr>
+          <w:rFonts w:eastAsia="Microsoft YaHei" w:ascii="Microsoft YaHei" w:hAnsi="Microsoft YaHei"/>
+          <w:b w:val="0"/>
+        </w:rPr>
+        <w:t>：商品详情页 → 优惠券入口条 → 优惠详情弹窗 → 券规则页。</w:t>
+      </w:r>
+    </w:p>
+    <w:p>
+      <w:r>
+        <w:rPr>
+          <w:rFonts w:eastAsia="Microsoft YaHei" w:ascii="Microsoft YaHei" w:hAnsi="Microsoft YaHei"/>
+        </w:rPr>
+        <w:drawing>
+          <wp:inline xmlns:a="http://schemas.openxmlformats.org/drawingml/2006/main" xmlns:pic="http://schemas.openxmlformats.org/drawingml/2006/picture">
+            <wp:extent cx="5303520" cy="11150991"/>
             <wp:docPr id="16" name="Picture 16"/>
             <wp:cNvGraphicFramePr>
               <a:graphicFrameLocks noChangeAspect="1"/>
@@ -19411,7 +19176,7 @@
                   <pic:spPr>
                     <a:xfrm>
                       <a:off x="0" y="0"/>
-                      <a:ext cx="5303520" cy="3314700"/>
+                      <a:ext cx="5303520" cy="11150991"/>
                     </a:xfrm>
                     <a:prstGeom prst="rect"/>
                   </pic:spPr>
@@ -19428,7 +19193,7 @@
           <w:color w:val="6B7280"/>
           <w:sz w:val="18"/>
         </w:rPr>
-        <w:t xml:space="preserve">  App端原型</w:t>
+        <w:t xml:space="preserve">  商品详情页优惠券入口条</w:t>
       </w:r>
     </w:p>
     <w:p>
@@ -19437,115 +19202,14 @@
           <w:rFonts w:eastAsia="Microsoft YaHei" w:ascii="Microsoft YaHei" w:hAnsi="Microsoft YaHei"/>
           <w:b/>
         </w:rPr>
-        <w:t>App 端为部分新增</w:t>
+        <w:t>优惠券入口条</w:t>
       </w:r>
       <w:r>
         <w:rPr>
           <w:rFonts w:eastAsia="Microsoft YaHei" w:ascii="Microsoft YaHei" w:hAnsi="Microsoft YaHei"/>
           <w:b w:val="0"/>
         </w:rPr>
-        <w:t>。本期 App 需新建：</w:t>
-      </w:r>
-      <w:r>
-        <w:rPr>
-          <w:rFonts w:eastAsia="Microsoft YaHei" w:ascii="Microsoft YaHei" w:hAnsi="Microsoft YaHei"/>
-          <w:b/>
-        </w:rPr>
-        <w:t>商品详情页优惠券入口条与优惠详情弹窗</w:t>
-      </w:r>
-      <w:r>
-        <w:rPr>
-          <w:rFonts w:eastAsia="Microsoft YaHei" w:ascii="Microsoft YaHei" w:hAnsi="Microsoft YaHei"/>
-          <w:b w:val="0"/>
-        </w:rPr>
-        <w:t>、</w:t>
-      </w:r>
-      <w:r>
-        <w:rPr>
-          <w:rFonts w:eastAsia="Microsoft YaHei" w:ascii="Microsoft YaHei" w:hAnsi="Microsoft YaHei"/>
-          <w:b/>
-        </w:rPr>
-        <w:t>券规则页</w:t>
-      </w:r>
-      <w:r>
-        <w:rPr>
-          <w:rFonts w:eastAsia="Microsoft YaHei" w:ascii="Microsoft YaHei" w:hAnsi="Microsoft YaHei"/>
-          <w:b w:val="0"/>
-        </w:rPr>
-        <w:t>、</w:t>
-      </w:r>
-      <w:r>
-        <w:rPr>
-          <w:rFonts w:eastAsia="Microsoft YaHei" w:ascii="Microsoft YaHei" w:hAnsi="Microsoft YaHei"/>
-          <w:b/>
-        </w:rPr>
-        <w:t>我的优惠券页</w:t>
-      </w:r>
-      <w:r>
-        <w:rPr>
-          <w:rFonts w:eastAsia="Microsoft YaHei" w:ascii="Microsoft YaHei" w:hAnsi="Microsoft YaHei"/>
-          <w:b w:val="0"/>
-        </w:rPr>
-        <w:t>、</w:t>
-      </w:r>
-      <w:r>
-        <w:rPr>
-          <w:rFonts w:eastAsia="Microsoft YaHei" w:ascii="Microsoft YaHei" w:hAnsi="Microsoft YaHei"/>
-          <w:b/>
-        </w:rPr>
-        <w:t>确认订单选券/核销逻辑</w:t>
-      </w:r>
-      <w:r>
-        <w:rPr>
-          <w:rFonts w:eastAsia="Microsoft YaHei" w:ascii="Microsoft YaHei" w:hAnsi="Microsoft YaHei"/>
-          <w:b w:val="0"/>
-        </w:rPr>
-        <w:t>。以下逐页面逐功能点拆解。</w:t>
-      </w:r>
-    </w:p>
-    <w:p>
-      <w:pPr>
-        <w:pStyle w:val="Heading3"/>
-      </w:pPr>
-      <w:r>
-        <w:rPr>
-          <w:rFonts w:eastAsia="Microsoft YaHei" w:ascii="Microsoft YaHei" w:hAnsi="Microsoft YaHei"/>
-        </w:rPr>
-        <w:t xml:space="preserve">4.3.1 商品详情页优惠券入口与优惠详情弹窗 </w:t>
-      </w:r>
-      <w:r>
-        <w:rPr>
-          <w:rFonts w:eastAsia="Microsoft YaHei" w:ascii="Microsoft YaHei" w:hAnsi="Microsoft YaHei"/>
-          <w:b w:val="0"/>
-        </w:rPr>
-        <w:t>本期新增</w:t>
-      </w:r>
-    </w:p>
-    <w:p>
-      <w:pPr>
-        <w:pStyle w:val="Heading4"/>
-      </w:pPr>
-      <w:r>
-        <w:rPr>
-          <w:rFonts w:eastAsia="Microsoft YaHei" w:ascii="Microsoft YaHei" w:hAnsi="Microsoft YaHei"/>
-        </w:rPr>
-        <w:t>4.3.1.1 原型与交互示意</w:t>
-      </w:r>
-    </w:p>
-    <w:p>
-      <w:r>
-        <w:rPr>
-          <w:rFonts w:eastAsia="Microsoft YaHei" w:ascii="Microsoft YaHei" w:hAnsi="Microsoft YaHei"/>
-          <w:b/>
-        </w:rPr>
-        <w:t>入口链</w:t>
-      </w:r>
-      <w:r>
-        <w:rPr>
-          <w:rFonts w:eastAsia="Microsoft YaHei" w:ascii="Microsoft YaHei" w:hAnsi="Microsoft YaHei"/>
-          <w:b w:val="0"/>
-        </w:rPr>
-        <w:t>：商品详情页 → 优惠券入口条 → 优惠详情弹窗 → 券规则页。</w:t>
+        <w:t>：位于商品详情页价格区下方，显示该商品可用的优惠券标签与数量（如「新人立减15元 等3张券可用」）。用户点击入口条 → 从屏幕底部拉起「优惠详情」弹窗。</w:t>
       </w:r>
     </w:p>
     <w:p>
@@ -19593,7 +19257,7 @@
           <w:color w:val="6B7280"/>
           <w:sz w:val="18"/>
         </w:rPr>
-        <w:t xml:space="preserve">  商品详情页优惠券入口条</w:t>
+        <w:t xml:space="preserve">  优惠详情弹窗</w:t>
       </w:r>
     </w:p>
     <w:p>
@@ -19602,14 +19266,373 @@
           <w:rFonts w:eastAsia="Microsoft YaHei" w:ascii="Microsoft YaHei" w:hAnsi="Microsoft YaHei"/>
           <w:b/>
         </w:rPr>
-        <w:t>优惠券入口条</w:t>
+        <w:t>优惠详情弹窗</w:t>
       </w:r>
       <w:r>
         <w:rPr>
           <w:rFonts w:eastAsia="Microsoft YaHei" w:ascii="Microsoft YaHei" w:hAnsi="Microsoft YaHei"/>
           <w:b w:val="0"/>
         </w:rPr>
-        <w:t>：位于商品详情页价格区下方，显示该商品可用的优惠券标签与数量（如「新人立减15元 等3张券可用」）。用户点击入口条 → 从屏幕底部拉起「优惠详情」弹窗。</w:t>
+        <w:t xml:space="preserve">：底部拉起，展示该商品当前可用的优惠券列表。每张券卡片展示：券名 / 面额 / 门槛 / 有效期，右下角自带 </w:t>
+      </w:r>
+      <w:r>
+        <w:rPr>
+          <w:rFonts w:eastAsia="Microsoft YaHei" w:ascii="Microsoft YaHei" w:hAnsi="Microsoft YaHei"/>
+          <w:b/>
+        </w:rPr>
+        <w:t>「券规则 ›」</w:t>
+      </w:r>
+      <w:r>
+        <w:rPr>
+          <w:rFonts w:eastAsia="Microsoft YaHei" w:ascii="Microsoft YaHei" w:hAnsi="Microsoft YaHei"/>
+          <w:b w:val="0"/>
+        </w:rPr>
+        <w:t xml:space="preserve"> 入口按钮。点击「券规则 ›」→ 跳转该券的券规则页（新页面或全屏弹窗）。</w:t>
+      </w:r>
+    </w:p>
+    <w:p>
+      <w:pPr>
+        <w:pStyle w:val="Heading4"/>
+      </w:pPr>
+      <w:r>
+        <w:rPr>
+          <w:rFonts w:eastAsia="Microsoft YaHei" w:ascii="Microsoft YaHei" w:hAnsi="Microsoft YaHei"/>
+        </w:rPr>
+        <w:t>4.3.1.2 详细逻辑规则</w:t>
+      </w:r>
+    </w:p>
+    <w:p>
+      <w:r>
+        <w:rPr>
+          <w:rFonts w:eastAsia="Microsoft YaHei" w:ascii="Microsoft YaHei" w:hAnsi="Microsoft YaHei"/>
+          <w:b/>
+        </w:rPr>
+        <w:t>界面与展示规则</w:t>
+      </w:r>
+      <w:r>
+        <w:rPr>
+          <w:rFonts w:eastAsia="Microsoft YaHei" w:ascii="Microsoft YaHei" w:hAnsi="Microsoft YaHei"/>
+          <w:b w:val="0"/>
+        </w:rPr>
+        <w:t>：</w:t>
+      </w:r>
+    </w:p>
+    <w:p>
+      <w:pPr>
+        <w:pStyle w:val="ListBullet"/>
+      </w:pPr>
+      <w:r>
+        <w:rPr>
+          <w:rFonts w:eastAsia="Microsoft YaHei" w:ascii="Microsoft YaHei" w:hAnsi="Microsoft YaHei"/>
+          <w:b w:val="0"/>
+        </w:rPr>
+        <w:t>入口条显示条件：当前商品有≥1 张可用券（未过期、满足门槛、适用范围包含本商品）时展示；无可用券时隐藏入口条。</w:t>
+      </w:r>
+    </w:p>
+    <w:p>
+      <w:pPr>
+        <w:pStyle w:val="ListBullet"/>
+      </w:pPr>
+      <w:r>
+        <w:rPr>
+          <w:rFonts w:eastAsia="Microsoft YaHei" w:ascii="Microsoft YaHei" w:hAnsi="Microsoft YaHei"/>
+          <w:b w:val="0"/>
+        </w:rPr>
+        <w:t>入口条文案：优先展示面额最大的券名 + 「等N张券可用」；如只有1张则直接展示券名。</w:t>
+      </w:r>
+    </w:p>
+    <w:p>
+      <w:pPr>
+        <w:pStyle w:val="ListBullet"/>
+      </w:pPr>
+      <w:r>
+        <w:rPr>
+          <w:rFonts w:eastAsia="Microsoft YaHei" w:ascii="Microsoft YaHei" w:hAnsi="Microsoft YaHei"/>
+          <w:b w:val="0"/>
+        </w:rPr>
+        <w:t>优惠详情弹窗：列表展示当前商品所有可用券（含用户已持有和未持有的券），按面额从大到小排序。</w:t>
+      </w:r>
+    </w:p>
+    <w:p>
+      <w:pPr>
+        <w:pStyle w:val="ListBullet"/>
+      </w:pPr>
+      <w:r>
+        <w:rPr>
+          <w:rFonts w:eastAsia="Microsoft YaHei" w:ascii="Microsoft YaHei" w:hAnsi="Microsoft YaHei"/>
+          <w:b w:val="0"/>
+        </w:rPr>
+        <w:t xml:space="preserve">弹窗内券卡片右下角固定展示 </w:t>
+      </w:r>
+      <w:r>
+        <w:rPr>
+          <w:rFonts w:eastAsia="Microsoft YaHei" w:ascii="Microsoft YaHei" w:hAnsi="Microsoft YaHei"/>
+          <w:b/>
+        </w:rPr>
+        <w:t>「券规则 ›」</w:t>
+      </w:r>
+      <w:r>
+        <w:rPr>
+          <w:rFonts w:eastAsia="Microsoft YaHei" w:ascii="Microsoft YaHei" w:hAnsi="Microsoft YaHei"/>
+          <w:b w:val="0"/>
+        </w:rPr>
+        <w:t xml:space="preserve"> 文字按钮，点击跳转券规则页。</w:t>
+      </w:r>
+    </w:p>
+    <w:p>
+      <w:pPr>
+        <w:pStyle w:val="ListBullet"/>
+      </w:pPr>
+      <w:r>
+        <w:rPr>
+          <w:rFonts w:eastAsia="Microsoft YaHei" w:ascii="Microsoft YaHei" w:hAnsi="Microsoft YaHei"/>
+          <w:b w:val="0"/>
+        </w:rPr>
+        <w:t>弹窗顶部有关闭按钮（×）或点击蒙层关闭。</w:t>
+      </w:r>
+    </w:p>
+    <w:p>
+      <w:r>
+        <w:rPr>
+          <w:rFonts w:eastAsia="Microsoft YaHei" w:ascii="Microsoft YaHei" w:hAnsi="Microsoft YaHei"/>
+          <w:b/>
+        </w:rPr>
+        <w:t>业务逻辑与边界条件</w:t>
+      </w:r>
+      <w:r>
+        <w:rPr>
+          <w:rFonts w:eastAsia="Microsoft YaHei" w:ascii="Microsoft YaHei" w:hAnsi="Microsoft YaHei"/>
+          <w:b w:val="0"/>
+        </w:rPr>
+        <w:t>：</w:t>
+      </w:r>
+    </w:p>
+    <w:p>
+      <w:pPr>
+        <w:pStyle w:val="ListBullet"/>
+      </w:pPr>
+      <w:r>
+        <w:rPr>
+          <w:rFonts w:eastAsia="Microsoft YaHei" w:ascii="Microsoft YaHei" w:hAnsi="Microsoft YaHei"/>
+          <w:b w:val="0"/>
+        </w:rPr>
+        <w:t xml:space="preserve">券的「可用」判定：未过期 + 当前商品在券适用范围內 + 用户当前端口在 </w:t>
+      </w:r>
+      <w:r>
+        <w:rPr>
+          <w:rFonts w:ascii="Microsoft YaHei" w:hAnsi="Microsoft YaHei" w:eastAsia="Microsoft YaHei"/>
+          <w:color w:val="BE123C"/>
+        </w:rPr>
+        <w:t>usable_ports</w:t>
+      </w:r>
+      <w:r>
+        <w:rPr>
+          <w:rFonts w:eastAsia="Microsoft YaHei" w:ascii="Microsoft YaHei" w:hAnsi="Microsoft YaHei"/>
+          <w:b w:val="0"/>
+        </w:rPr>
+        <w:t xml:space="preserve"> 内（端口不匹配时仍展示但置灰，点击提示「此券仅支持在 {usable_ports 端口名称} 使用」，规则同 §4.3.5）。</w:t>
+      </w:r>
+    </w:p>
+    <w:p>
+      <w:pPr>
+        <w:pStyle w:val="ListBullet"/>
+      </w:pPr>
+      <w:r>
+        <w:rPr>
+          <w:rFonts w:eastAsia="Microsoft YaHei" w:ascii="Microsoft YaHei" w:hAnsi="Microsoft YaHei"/>
+          <w:b w:val="0"/>
+        </w:rPr>
+        <w:t>已持有券与未持有券：已持有的券在卡片上标记「已领取」或展示领取状态；未持有的券仅展示信息，本期不提供「立即领取」按钮（领券功能已删除，见 §十一 二期待办 11.2.1）。</w:t>
+      </w:r>
+    </w:p>
+    <w:p>
+      <w:pPr>
+        <w:pStyle w:val="ListBullet"/>
+      </w:pPr>
+      <w:r>
+        <w:rPr>
+          <w:rFonts w:eastAsia="Microsoft YaHei" w:ascii="Microsoft YaHei" w:hAnsi="Microsoft YaHei"/>
+          <w:b w:val="0"/>
+        </w:rPr>
+        <w:t>空态：无可用券时商品详情页不展示优惠券入口条。</w:t>
+      </w:r>
+    </w:p>
+    <w:p>
+      <w:pPr>
+        <w:pStyle w:val="Heading4"/>
+      </w:pPr>
+      <w:r>
+        <w:rPr>
+          <w:rFonts w:eastAsia="Microsoft YaHei" w:ascii="Microsoft YaHei" w:hAnsi="Microsoft YaHei"/>
+        </w:rPr>
+        <w:t>4.3.1.3 数据来源（字段级）</w:t>
+      </w:r>
+    </w:p>
+    <w:tbl>
+      <w:tblPr>
+        <w:tblStyle w:val="TableGrid"/>
+        <w:tblW w:type="auto" w:w="0"/>
+        <w:tblLook w:firstColumn="1" w:firstRow="1" w:lastColumn="0" w:lastRow="0" w:noHBand="0" w:noVBand="1" w:val="04A0"/>
+        <w:jc w:val="center"/>
+        <w:tblBorders>
+          <w:top w:val="single" w:sz="4" w:space="0" w:color="999999"/>
+          <w:left w:val="single" w:sz="4" w:space="0" w:color="999999"/>
+          <w:bottom w:val="single" w:sz="4" w:space="0" w:color="999999"/>
+          <w:right w:val="single" w:sz="4" w:space="0" w:color="999999"/>
+          <w:insideH w:val="single" w:sz="4" w:space="0" w:color="999999"/>
+          <w:insideV w:val="single" w:sz="4" w:space="0" w:color="999999"/>
+        </w:tblBorders>
+      </w:tblPr>
+      <w:tblGrid>
+        <w:gridCol w:w="4320"/>
+        <w:gridCol w:w="4320"/>
+      </w:tblGrid>
+      <w:tr>
+        <w:tc>
+          <w:tcPr>
+            <w:tcW w:type="dxa" w:w="4320"/>
+          </w:tcPr>
+          <w:p>
+            <w:r>
+              <w:rPr>
+                <w:b/>
+              </w:rPr>
+            </w:r>
+            <w:r>
+              <w:rPr>
+                <w:rFonts w:eastAsia="Microsoft YaHei" w:ascii="Microsoft YaHei" w:hAnsi="Microsoft YaHei"/>
+                <w:b/>
+              </w:rPr>
+              <w:t>字段名称</w:t>
+            </w:r>
+          </w:p>
+        </w:tc>
+        <w:tc>
+          <w:tcPr>
+            <w:tcW w:type="dxa" w:w="4320"/>
+          </w:tcPr>
+          <w:p>
+            <w:r>
+              <w:rPr>
+                <w:b/>
+              </w:rPr>
+            </w:r>
+            <w:r>
+              <w:rPr>
+                <w:rFonts w:eastAsia="Microsoft YaHei" w:ascii="Microsoft YaHei" w:hAnsi="Microsoft YaHei"/>
+                <w:b/>
+              </w:rPr>
+              <w:t>取值逻辑说明</w:t>
+            </w:r>
+          </w:p>
+        </w:tc>
+      </w:tr>
+      <w:tr>
+        <w:tc>
+          <w:tcPr>
+            <w:tcW w:type="dxa" w:w="4320"/>
+          </w:tcPr>
+          <w:p>
+            <w:r/>
+            <w:r>
+              <w:rPr>
+                <w:rFonts w:eastAsia="Microsoft YaHei" w:ascii="Microsoft YaHei" w:hAnsi="Microsoft YaHei"/>
+                <w:b w:val="0"/>
+              </w:rPr>
+              <w:t>可用券列表</w:t>
+            </w:r>
+          </w:p>
+        </w:tc>
+        <w:tc>
+          <w:tcPr>
+            <w:tcW w:type="dxa" w:w="4320"/>
+          </w:tcPr>
+          <w:p>
+            <w:r/>
+            <w:r>
+              <w:rPr>
+                <w:rFonts w:eastAsia="Microsoft YaHei" w:ascii="Microsoft YaHei" w:hAnsi="Microsoft YaHei"/>
+                <w:b w:val="0"/>
+              </w:rPr>
+              <w:t>调接口查《券模板表》+《用户券表》：商品在适用范围 + 未过期 + 端口匹配</w:t>
+            </w:r>
+          </w:p>
+        </w:tc>
+      </w:tr>
+      <w:tr>
+        <w:tc>
+          <w:tcPr>
+            <w:tcW w:type="dxa" w:w="4320"/>
+          </w:tcPr>
+          <w:p>
+            <w:r/>
+            <w:r>
+              <w:rPr>
+                <w:rFonts w:eastAsia="Microsoft YaHei" w:ascii="Microsoft YaHei" w:hAnsi="Microsoft YaHei"/>
+                <w:b w:val="0"/>
+              </w:rPr>
+              <w:t>券规则说明</w:t>
+            </w:r>
+          </w:p>
+        </w:tc>
+        <w:tc>
+          <w:tcPr>
+            <w:tcW w:type="dxa" w:w="4320"/>
+          </w:tcPr>
+          <w:p>
+            <w:r/>
+            <w:r>
+              <w:rPr>
+                <w:rFonts w:eastAsia="Microsoft YaHei" w:ascii="Microsoft YaHei" w:hAnsi="Microsoft YaHei"/>
+                <w:b w:val="0"/>
+              </w:rPr>
+              <w:t>取《券模板表》</w:t>
+            </w:r>
+            <w:r>
+              <w:rPr>
+                <w:rFonts w:ascii="Microsoft YaHei" w:hAnsi="Microsoft YaHei" w:eastAsia="Microsoft YaHei"/>
+                <w:color w:val="BE123C"/>
+              </w:rPr>
+              <w:t>rule_desc</w:t>
+            </w:r>
+            <w:r>
+              <w:rPr>
+                <w:rFonts w:eastAsia="Microsoft YaHei" w:ascii="Microsoft YaHei" w:hAnsi="Microsoft YaHei"/>
+                <w:b w:val="0"/>
+              </w:rPr>
+              <w:t xml:space="preserve"> 字段（HTML 富文本）</w:t>
+            </w:r>
+          </w:p>
+        </w:tc>
+      </w:tr>
+    </w:tbl>
+    <w:p>
+      <w:pPr>
+        <w:pStyle w:val="Heading3"/>
+      </w:pPr>
+      <w:r>
+        <w:rPr>
+          <w:rFonts w:eastAsia="Microsoft YaHei" w:ascii="Microsoft YaHei" w:hAnsi="Microsoft YaHei"/>
+        </w:rPr>
+        <w:t xml:space="preserve">4.3.2 券规则页 </w:t>
+      </w:r>
+      <w:r>
+        <w:rPr>
+          <w:rFonts w:eastAsia="Microsoft YaHei" w:ascii="Microsoft YaHei" w:hAnsi="Microsoft YaHei"/>
+          <w:b w:val="0"/>
+        </w:rPr>
+        <w:t>本期新增</w:t>
+      </w:r>
+    </w:p>
+    <w:p>
+      <w:pPr>
+        <w:pStyle w:val="Heading4"/>
+      </w:pPr>
+      <w:r>
+        <w:rPr>
+          <w:rFonts w:eastAsia="Microsoft YaHei" w:ascii="Microsoft YaHei" w:hAnsi="Microsoft YaHei"/>
+        </w:rPr>
+        <w:t>4.3.2.1 原型与交互示意</w:t>
       </w:r>
     </w:p>
     <w:p>
@@ -19657,37 +19680,44 @@
           <w:color w:val="6B7280"/>
           <w:sz w:val="18"/>
         </w:rPr>
-        <w:t xml:space="preserve">  优惠详情弹窗</w:t>
+        <w:t xml:space="preserve">  券规则页</w:t>
       </w:r>
     </w:p>
     <w:p>
       <w:r>
         <w:rPr>
           <w:rFonts w:eastAsia="Microsoft YaHei" w:ascii="Microsoft YaHei" w:hAnsi="Microsoft YaHei"/>
+          <w:b w:val="0"/>
+        </w:rPr>
+        <w:t>券规则页为独立页面（或全屏弹窗），展示单张优惠券的完整规则说明。内容来自后端券模板的「券规则说明」富文本字段（</w:t>
+      </w:r>
+      <w:r>
+        <w:rPr>
+          <w:rFonts w:ascii="Microsoft YaHei" w:hAnsi="Microsoft YaHei" w:eastAsia="Microsoft YaHei"/>
+          <w:color w:val="BE123C"/>
+        </w:rPr>
+        <w:t>rule_desc</w:t>
+      </w:r>
+      <w:r>
+        <w:rPr>
+          <w:rFonts w:eastAsia="Microsoft YaHei" w:ascii="Microsoft YaHei" w:hAnsi="Microsoft YaHei"/>
+          <w:b w:val="0"/>
+        </w:rPr>
+        <w:t>），C 端按纯文本/HTML 直接渲染，</w:t>
+      </w:r>
+      <w:r>
+        <w:rPr>
+          <w:rFonts w:eastAsia="Microsoft YaHei" w:ascii="Microsoft YaHei" w:hAnsi="Microsoft YaHei"/>
           <w:b/>
         </w:rPr>
-        <w:t>优惠详情弹窗</w:t>
+        <w:t>不再画成固定的「有效期/适用范围/叠加规则…」结构化页面</w:t>
       </w:r>
       <w:r>
         <w:rPr>
           <w:rFonts w:eastAsia="Microsoft YaHei" w:ascii="Microsoft YaHei" w:hAnsi="Microsoft YaHei"/>
           <w:b w:val="0"/>
         </w:rPr>
-        <w:t xml:space="preserve">：底部拉起，展示该商品当前可用的优惠券列表。每张券卡片展示：券名 / 面额 / 门槛 / 有效期，右下角自带 </w:t>
-      </w:r>
-      <w:r>
-        <w:rPr>
-          <w:rFonts w:eastAsia="Microsoft YaHei" w:ascii="Microsoft YaHei" w:hAnsi="Microsoft YaHei"/>
-          <w:b/>
-        </w:rPr>
-        <w:t>「券规则 ›」</w:t>
-      </w:r>
-      <w:r>
-        <w:rPr>
-          <w:rFonts w:eastAsia="Microsoft YaHei" w:ascii="Microsoft YaHei" w:hAnsi="Microsoft YaHei"/>
-          <w:b w:val="0"/>
-        </w:rPr>
-        <w:t xml:space="preserve"> 入口按钮。点击「券规则 ›」→ 跳转该券的券规则页（新页面或全屏弹窗）。</w:t>
+        <w:t>。</w:t>
       </w:r>
     </w:p>
     <w:p>
@@ -19698,7 +19728,7 @@
         <w:rPr>
           <w:rFonts w:eastAsia="Microsoft YaHei" w:ascii="Microsoft YaHei" w:hAnsi="Microsoft YaHei"/>
         </w:rPr>
-        <w:t>4.3.1.2 详细逻辑规则</w:t>
+        <w:t>4.3.2.2 详细逻辑规则</w:t>
       </w:r>
     </w:p>
     <w:p>
@@ -19726,7 +19756,7 @@
           <w:rFonts w:eastAsia="Microsoft YaHei" w:ascii="Microsoft YaHei" w:hAnsi="Microsoft YaHei"/>
           <w:b w:val="0"/>
         </w:rPr>
-        <w:t>入口条显示条件：当前商品有≥1 张可用券（未过期、满足门槛、适用范围包含本商品）时展示；无可用券时隐藏入口条。</w:t>
+        <w:t>页面标题：「券规则说明」。</w:t>
       </w:r>
     </w:p>
     <w:p>
@@ -19738,7 +19768,21 @@
           <w:rFonts w:eastAsia="Microsoft YaHei" w:ascii="Microsoft YaHei" w:hAnsi="Microsoft YaHei"/>
           <w:b w:val="0"/>
         </w:rPr>
-        <w:t>入口条文案：优先展示面额最大的券名 + 「等N张券可用」；如只有1张则直接展示券名。</w:t>
+        <w:t>内容区：渲染《券模板表》</w:t>
+      </w:r>
+      <w:r>
+        <w:rPr>
+          <w:rFonts w:ascii="Microsoft YaHei" w:hAnsi="Microsoft YaHei" w:eastAsia="Microsoft YaHei"/>
+          <w:color w:val="BE123C"/>
+        </w:rPr>
+        <w:t>rule_desc</w:t>
+      </w:r>
+      <w:r>
+        <w:rPr>
+          <w:rFonts w:eastAsia="Microsoft YaHei" w:ascii="Microsoft YaHei" w:hAnsi="Microsoft YaHei"/>
+          <w:b w:val="0"/>
+        </w:rPr>
+        <w:t xml:space="preserve"> 字段的 HTML 内容（支持文本、图片、富文本样式）。</w:t>
       </w:r>
     </w:p>
     <w:p>
@@ -19750,7 +19794,7 @@
           <w:rFonts w:eastAsia="Microsoft YaHei" w:ascii="Microsoft YaHei" w:hAnsi="Microsoft YaHei"/>
           <w:b w:val="0"/>
         </w:rPr>
-        <w:t>优惠详情弹窗：列表展示当前商品所有可用券（含用户已持有和未持有的券），按面额从大到小排序。</w:t>
+        <w:t>内容为空时：显示「—」或「暂无规则说明」。</w:t>
       </w:r>
     </w:p>
     <w:p>
@@ -19762,13 +19806,107 @@
           <w:rFonts w:eastAsia="Microsoft YaHei" w:ascii="Microsoft YaHei" w:hAnsi="Microsoft YaHei"/>
           <w:b w:val="0"/>
         </w:rPr>
-        <w:t xml:space="preserve">弹窗内券卡片右下角固定展示 </w:t>
-      </w:r>
+        <w:t>底部固定按钮：「知道了」或左滑返回关闭页面。</w:t>
+      </w:r>
+    </w:p>
+    <w:p>
       <w:r>
         <w:rPr>
           <w:rFonts w:eastAsia="Microsoft YaHei" w:ascii="Microsoft YaHei" w:hAnsi="Microsoft YaHei"/>
           <w:b/>
         </w:rPr>
+        <w:t>入口说明</w:t>
+      </w:r>
+      <w:r>
+        <w:rPr>
+          <w:rFonts w:eastAsia="Microsoft YaHei" w:ascii="Microsoft YaHei" w:hAnsi="Microsoft YaHei"/>
+          <w:b w:val="0"/>
+        </w:rPr>
+        <w:t>（明确链路）：</w:t>
+      </w:r>
+    </w:p>
+    <w:p>
+      <w:pPr>
+        <w:pStyle w:val="ListNumber"/>
+      </w:pPr>
+      <w:r>
+        <w:rPr>
+          <w:rFonts w:eastAsia="Microsoft YaHei" w:ascii="Microsoft YaHei" w:hAnsi="Microsoft YaHei"/>
+          <w:b w:val="0"/>
+        </w:rPr>
+        <w:t xml:space="preserve">用户进入 </w:t>
+      </w:r>
+      <w:r>
+        <w:rPr>
+          <w:rFonts w:eastAsia="Microsoft YaHei" w:ascii="Microsoft YaHei" w:hAnsi="Microsoft YaHei"/>
+          <w:b/>
+        </w:rPr>
+        <w:t>商品详情页</w:t>
+      </w:r>
+      <w:r>
+        <w:rPr>
+          <w:rFonts w:eastAsia="Microsoft YaHei" w:ascii="Microsoft YaHei" w:hAnsi="Microsoft YaHei"/>
+          <w:b w:val="0"/>
+        </w:rPr>
+        <w:t xml:space="preserve"> → 看到 </w:t>
+      </w:r>
+      <w:r>
+        <w:rPr>
+          <w:rFonts w:eastAsia="Microsoft YaHei" w:ascii="Microsoft YaHei" w:hAnsi="Microsoft YaHei"/>
+          <w:b/>
+        </w:rPr>
+        <w:t>优惠券入口条</w:t>
+      </w:r>
+      <w:r>
+        <w:rPr>
+          <w:rFonts w:eastAsia="Microsoft YaHei" w:ascii="Microsoft YaHei" w:hAnsi="Microsoft YaHei"/>
+          <w:b w:val="0"/>
+        </w:rPr>
+        <w:t>（显示可用券标签/数量）。</w:t>
+      </w:r>
+    </w:p>
+    <w:p>
+      <w:pPr>
+        <w:pStyle w:val="ListNumber"/>
+      </w:pPr>
+      <w:r>
+        <w:rPr>
+          <w:rFonts w:eastAsia="Microsoft YaHei" w:ascii="Microsoft YaHei" w:hAnsi="Microsoft YaHei"/>
+          <w:b w:val="0"/>
+        </w:rPr>
+        <w:t xml:space="preserve">点击入口条 → 底部拉起 </w:t>
+      </w:r>
+      <w:r>
+        <w:rPr>
+          <w:rFonts w:eastAsia="Microsoft YaHei" w:ascii="Microsoft YaHei" w:hAnsi="Microsoft YaHei"/>
+          <w:b/>
+        </w:rPr>
+        <w:t>「优惠详情」弹窗</w:t>
+      </w:r>
+      <w:r>
+        <w:rPr>
+          <w:rFonts w:eastAsia="Microsoft YaHei" w:ascii="Microsoft YaHei" w:hAnsi="Microsoft YaHei"/>
+          <w:b w:val="0"/>
+        </w:rPr>
+        <w:t>（展示可用券列表）。</w:t>
+      </w:r>
+    </w:p>
+    <w:p>
+      <w:pPr>
+        <w:pStyle w:val="ListNumber"/>
+      </w:pPr>
+      <w:r>
+        <w:rPr>
+          <w:rFonts w:eastAsia="Microsoft YaHei" w:ascii="Microsoft YaHei" w:hAnsi="Microsoft YaHei"/>
+          <w:b w:val="0"/>
+        </w:rPr>
+        <w:t xml:space="preserve">在弹窗内点击任意券卡片的 </w:t>
+      </w:r>
+      <w:r>
+        <w:rPr>
+          <w:rFonts w:eastAsia="Microsoft YaHei" w:ascii="Microsoft YaHei" w:hAnsi="Microsoft YaHei"/>
+          <w:b/>
+        </w:rPr>
         <w:t>「券规则 ›」</w:t>
       </w:r>
       <w:r>
@@ -19776,7 +19914,37 @@
           <w:rFonts w:eastAsia="Microsoft YaHei" w:ascii="Microsoft YaHei" w:hAnsi="Microsoft YaHei"/>
           <w:b w:val="0"/>
         </w:rPr>
-        <w:t xml:space="preserve"> 文字按钮，点击跳转券规则页。</w:t>
+        <w:t xml:space="preserve"> 按钮 → 跳转 </w:t>
+      </w:r>
+      <w:r>
+        <w:rPr>
+          <w:rFonts w:eastAsia="Microsoft YaHei" w:ascii="Microsoft YaHei" w:hAnsi="Microsoft YaHei"/>
+          <w:b/>
+        </w:rPr>
+        <w:t>券规则页</w:t>
+      </w:r>
+      <w:r>
+        <w:rPr>
+          <w:rFonts w:eastAsia="Microsoft YaHei" w:ascii="Microsoft YaHei" w:hAnsi="Microsoft YaHei"/>
+          <w:b w:val="0"/>
+        </w:rPr>
+        <w:t>（本页）。</w:t>
+      </w:r>
+    </w:p>
+    <w:p>
+      <w:r>
+        <w:rPr>
+          <w:rFonts w:eastAsia="Microsoft YaHei" w:ascii="Microsoft YaHei" w:hAnsi="Microsoft YaHei"/>
+          <w:b/>
+        </w:rPr>
+        <w:t>业务逻辑与边界条件</w:t>
+      </w:r>
+      <w:r>
+        <w:rPr>
+          <w:rFonts w:eastAsia="Microsoft YaHei" w:ascii="Microsoft YaHei" w:hAnsi="Microsoft YaHei"/>
+          <w:b w:val="0"/>
+        </w:rPr>
+        <w:t>：</w:t>
       </w:r>
     </w:p>
     <w:p>
@@ -19788,23 +19956,7 @@
           <w:rFonts w:eastAsia="Microsoft YaHei" w:ascii="Microsoft YaHei" w:hAnsi="Microsoft YaHei"/>
           <w:b w:val="0"/>
         </w:rPr>
-        <w:t>弹窗顶部有关闭按钮（×）或点击蒙层关闭。</w:t>
-      </w:r>
-    </w:p>
-    <w:p>
-      <w:r>
-        <w:rPr>
-          <w:rFonts w:eastAsia="Microsoft YaHei" w:ascii="Microsoft YaHei" w:hAnsi="Microsoft YaHei"/>
-          <w:b/>
-        </w:rPr>
-        <w:t>业务逻辑与边界条件</w:t>
-      </w:r>
-      <w:r>
-        <w:rPr>
-          <w:rFonts w:eastAsia="Microsoft YaHei" w:ascii="Microsoft YaHei" w:hAnsi="Microsoft YaHei"/>
-          <w:b w:val="0"/>
-        </w:rPr>
-        <w:t>：</w:t>
+        <w:t>券规则页仅展示、无操作；不涉及领券/用券/核销逻辑。</w:t>
       </w:r>
     </w:p>
     <w:p>
@@ -19816,21 +19968,7 @@
           <w:rFonts w:eastAsia="Microsoft YaHei" w:ascii="Microsoft YaHei" w:hAnsi="Microsoft YaHei"/>
           <w:b w:val="0"/>
         </w:rPr>
-        <w:t xml:space="preserve">券的「可用」判定：未过期 + 当前商品在券适用范围內 + 用户当前端口在 </w:t>
-      </w:r>
-      <w:r>
-        <w:rPr>
-          <w:rFonts w:ascii="Microsoft YaHei" w:hAnsi="Microsoft YaHei" w:eastAsia="Microsoft YaHei"/>
-          <w:color w:val="BE123C"/>
-        </w:rPr>
-        <w:t>usable_ports</w:t>
-      </w:r>
-      <w:r>
-        <w:rPr>
-          <w:rFonts w:eastAsia="Microsoft YaHei" w:ascii="Microsoft YaHei" w:hAnsi="Microsoft YaHei"/>
-          <w:b w:val="0"/>
-        </w:rPr>
-        <w:t xml:space="preserve"> 内（端口不匹配时仍展示但置灰，点击提示「此券仅支持在 {usable_ports 端口名称} 使用」，规则同 §4.3.5）。</w:t>
+        <w:t>券规则内容与券模板绑定，同一张券的所有用户看到相同的规则说明。</w:t>
       </w:r>
     </w:p>
     <w:p>
@@ -19842,19 +19980,7 @@
           <w:rFonts w:eastAsia="Microsoft YaHei" w:ascii="Microsoft YaHei" w:hAnsi="Microsoft YaHei"/>
           <w:b w:val="0"/>
         </w:rPr>
-        <w:t>已持有券与未持有券：已持有的券在卡片上标记「已领取」或展示领取状态；未持有的券仅展示信息，本期不提供「立即领取」按钮（领券功能已删除，见 §十一 二期待办 11.2.1）。</w:t>
-      </w:r>
-    </w:p>
-    <w:p>
-      <w:pPr>
-        <w:pStyle w:val="ListBullet"/>
-      </w:pPr>
-      <w:r>
-        <w:rPr>
-          <w:rFonts w:eastAsia="Microsoft YaHei" w:ascii="Microsoft YaHei" w:hAnsi="Microsoft YaHei"/>
-          <w:b w:val="0"/>
-        </w:rPr>
-        <w:t>空态：无可用券时商品详情页不展示优惠券入口条。</w:t>
+        <w:t>纯文本长度 ≤2000 字，超出前端截断（与 §4.1.3 D2 表单字段表「券规则说明」校验一致）。</w:t>
       </w:r>
     </w:p>
     <w:p>
@@ -19865,7 +19991,7 @@
         <w:rPr>
           <w:rFonts w:eastAsia="Microsoft YaHei" w:ascii="Microsoft YaHei" w:hAnsi="Microsoft YaHei"/>
         </w:rPr>
-        <w:t>4.3.1.3 数据来源（字段级）</w:t>
+        <w:t>4.3.2.3 数据来源（字段级）</w:t>
       </w:r>
     </w:p>
     <w:tbl>
@@ -19939,38 +20065,6 @@
                 <w:rFonts w:eastAsia="Microsoft YaHei" w:ascii="Microsoft YaHei" w:hAnsi="Microsoft YaHei"/>
                 <w:b w:val="0"/>
               </w:rPr>
-              <w:t>可用券列表</w:t>
-            </w:r>
-          </w:p>
-        </w:tc>
-        <w:tc>
-          <w:tcPr>
-            <w:tcW w:type="dxa" w:w="4320"/>
-          </w:tcPr>
-          <w:p>
-            <w:r/>
-            <w:r>
-              <w:rPr>
-                <w:rFonts w:eastAsia="Microsoft YaHei" w:ascii="Microsoft YaHei" w:hAnsi="Microsoft YaHei"/>
-                <w:b w:val="0"/>
-              </w:rPr>
-              <w:t>调接口查《券模板表》+《用户券表》：商品在适用范围 + 未过期 + 端口匹配</w:t>
-            </w:r>
-          </w:p>
-        </w:tc>
-      </w:tr>
-      <w:tr>
-        <w:tc>
-          <w:tcPr>
-            <w:tcW w:type="dxa" w:w="4320"/>
-          </w:tcPr>
-          <w:p>
-            <w:r/>
-            <w:r>
-              <w:rPr>
-                <w:rFonts w:eastAsia="Microsoft YaHei" w:ascii="Microsoft YaHei" w:hAnsi="Microsoft YaHei"/>
-                <w:b w:val="0"/>
-              </w:rPr>
               <w:t>券规则说明</w:t>
             </w:r>
           </w:p>
@@ -20014,7 +20108,7 @@
         <w:rPr>
           <w:rFonts w:eastAsia="Microsoft YaHei" w:ascii="Microsoft YaHei" w:hAnsi="Microsoft YaHei"/>
         </w:rPr>
-        <w:t xml:space="preserve">4.3.2 券规则页 </w:t>
+        <w:t>4.3.4 我的优惠券（三态）</w:t>
       </w:r>
       <w:r>
         <w:rPr>
@@ -20032,7 +20126,7 @@
         <w:rPr>
           <w:rFonts w:eastAsia="Microsoft YaHei" w:ascii="Microsoft YaHei" w:hAnsi="Microsoft YaHei"/>
         </w:rPr>
-        <w:t>4.3.2.1 原型与交互示意</w:t>
+        <w:t>4.3.4.1 原型与交互示意</w:t>
       </w:r>
     </w:p>
     <w:p>
@@ -20042,7 +20136,7 @@
         </w:rPr>
         <w:drawing>
           <wp:inline xmlns:a="http://schemas.openxmlformats.org/drawingml/2006/main" xmlns:pic="http://schemas.openxmlformats.org/drawingml/2006/picture">
-            <wp:extent cx="5303520" cy="11150991"/>
+            <wp:extent cx="5303520" cy="3314700"/>
             <wp:docPr id="19" name="Picture 19"/>
             <wp:cNvGraphicFramePr>
               <a:graphicFrameLocks noChangeAspect="1"/>
@@ -20056,500 +20150,6 @@
                   </pic:nvPicPr>
                   <pic:blipFill>
                     <a:blip r:embed="rId31"/>
-                    <a:stretch>
-                      <a:fillRect/>
-                    </a:stretch>
-                  </pic:blipFill>
-                  <pic:spPr>
-                    <a:xfrm>
-                      <a:off x="0" y="0"/>
-                      <a:ext cx="5303520" cy="11150991"/>
-                    </a:xfrm>
-                    <a:prstGeom prst="rect"/>
-                  </pic:spPr>
-                </pic:pic>
-              </a:graphicData>
-            </a:graphic>
-          </wp:inline>
-        </w:drawing>
-      </w:r>
-      <w:r>
-        <w:rPr>
-          <w:rFonts w:eastAsia="Microsoft YaHei" w:ascii="Microsoft YaHei" w:hAnsi="Microsoft YaHei"/>
-          <w:i/>
-          <w:color w:val="6B7280"/>
-          <w:sz w:val="18"/>
-        </w:rPr>
-        <w:t xml:space="preserve">  券规则页</w:t>
-      </w:r>
-    </w:p>
-    <w:p>
-      <w:r>
-        <w:rPr>
-          <w:rFonts w:eastAsia="Microsoft YaHei" w:ascii="Microsoft YaHei" w:hAnsi="Microsoft YaHei"/>
-          <w:b w:val="0"/>
-        </w:rPr>
-        <w:t>券规则页为独立页面（或全屏弹窗），展示单张优惠券的完整规则说明。内容来自后端券模板的「券规则说明」富文本字段（</w:t>
-      </w:r>
-      <w:r>
-        <w:rPr>
-          <w:rFonts w:ascii="Microsoft YaHei" w:hAnsi="Microsoft YaHei" w:eastAsia="Microsoft YaHei"/>
-          <w:color w:val="BE123C"/>
-        </w:rPr>
-        <w:t>rule_desc</w:t>
-      </w:r>
-      <w:r>
-        <w:rPr>
-          <w:rFonts w:eastAsia="Microsoft YaHei" w:ascii="Microsoft YaHei" w:hAnsi="Microsoft YaHei"/>
-          <w:b w:val="0"/>
-        </w:rPr>
-        <w:t>），C 端按纯文本/HTML 直接渲染，</w:t>
-      </w:r>
-      <w:r>
-        <w:rPr>
-          <w:rFonts w:eastAsia="Microsoft YaHei" w:ascii="Microsoft YaHei" w:hAnsi="Microsoft YaHei"/>
-          <w:b/>
-        </w:rPr>
-        <w:t>不再画成固定的「有效期/适用范围/叠加规则…」结构化页面</w:t>
-      </w:r>
-      <w:r>
-        <w:rPr>
-          <w:rFonts w:eastAsia="Microsoft YaHei" w:ascii="Microsoft YaHei" w:hAnsi="Microsoft YaHei"/>
-          <w:b w:val="0"/>
-        </w:rPr>
-        <w:t>。</w:t>
-      </w:r>
-    </w:p>
-    <w:p>
-      <w:pPr>
-        <w:pStyle w:val="Heading4"/>
-      </w:pPr>
-      <w:r>
-        <w:rPr>
-          <w:rFonts w:eastAsia="Microsoft YaHei" w:ascii="Microsoft YaHei" w:hAnsi="Microsoft YaHei"/>
-        </w:rPr>
-        <w:t>4.3.2.2 详细逻辑规则</w:t>
-      </w:r>
-    </w:p>
-    <w:p>
-      <w:r>
-        <w:rPr>
-          <w:rFonts w:eastAsia="Microsoft YaHei" w:ascii="Microsoft YaHei" w:hAnsi="Microsoft YaHei"/>
-          <w:b/>
-        </w:rPr>
-        <w:t>界面与展示规则</w:t>
-      </w:r>
-      <w:r>
-        <w:rPr>
-          <w:rFonts w:eastAsia="Microsoft YaHei" w:ascii="Microsoft YaHei" w:hAnsi="Microsoft YaHei"/>
-          <w:b w:val="0"/>
-        </w:rPr>
-        <w:t>：</w:t>
-      </w:r>
-    </w:p>
-    <w:p>
-      <w:pPr>
-        <w:pStyle w:val="ListBullet"/>
-      </w:pPr>
-      <w:r>
-        <w:rPr>
-          <w:rFonts w:eastAsia="Microsoft YaHei" w:ascii="Microsoft YaHei" w:hAnsi="Microsoft YaHei"/>
-          <w:b w:val="0"/>
-        </w:rPr>
-        <w:t>页面标题：「券规则说明」。</w:t>
-      </w:r>
-    </w:p>
-    <w:p>
-      <w:pPr>
-        <w:pStyle w:val="ListBullet"/>
-      </w:pPr>
-      <w:r>
-        <w:rPr>
-          <w:rFonts w:eastAsia="Microsoft YaHei" w:ascii="Microsoft YaHei" w:hAnsi="Microsoft YaHei"/>
-          <w:b w:val="0"/>
-        </w:rPr>
-        <w:t>内容区：渲染《券模板表》</w:t>
-      </w:r>
-      <w:r>
-        <w:rPr>
-          <w:rFonts w:ascii="Microsoft YaHei" w:hAnsi="Microsoft YaHei" w:eastAsia="Microsoft YaHei"/>
-          <w:color w:val="BE123C"/>
-        </w:rPr>
-        <w:t>rule_desc</w:t>
-      </w:r>
-      <w:r>
-        <w:rPr>
-          <w:rFonts w:eastAsia="Microsoft YaHei" w:ascii="Microsoft YaHei" w:hAnsi="Microsoft YaHei"/>
-          <w:b w:val="0"/>
-        </w:rPr>
-        <w:t xml:space="preserve"> 字段的 HTML 内容（支持文本、图片、富文本样式）。</w:t>
-      </w:r>
-    </w:p>
-    <w:p>
-      <w:pPr>
-        <w:pStyle w:val="ListBullet"/>
-      </w:pPr>
-      <w:r>
-        <w:rPr>
-          <w:rFonts w:eastAsia="Microsoft YaHei" w:ascii="Microsoft YaHei" w:hAnsi="Microsoft YaHei"/>
-          <w:b w:val="0"/>
-        </w:rPr>
-        <w:t>内容为空时：显示「—」或「暂无规则说明」。</w:t>
-      </w:r>
-    </w:p>
-    <w:p>
-      <w:pPr>
-        <w:pStyle w:val="ListBullet"/>
-      </w:pPr>
-      <w:r>
-        <w:rPr>
-          <w:rFonts w:eastAsia="Microsoft YaHei" w:ascii="Microsoft YaHei" w:hAnsi="Microsoft YaHei"/>
-          <w:b w:val="0"/>
-        </w:rPr>
-        <w:t>底部固定按钮：「知道了」或左滑返回关闭页面。</w:t>
-      </w:r>
-    </w:p>
-    <w:p>
-      <w:r>
-        <w:rPr>
-          <w:rFonts w:eastAsia="Microsoft YaHei" w:ascii="Microsoft YaHei" w:hAnsi="Microsoft YaHei"/>
-          <w:b/>
-        </w:rPr>
-        <w:t>入口说明</w:t>
-      </w:r>
-      <w:r>
-        <w:rPr>
-          <w:rFonts w:eastAsia="Microsoft YaHei" w:ascii="Microsoft YaHei" w:hAnsi="Microsoft YaHei"/>
-          <w:b w:val="0"/>
-        </w:rPr>
-        <w:t>（明确链路）：</w:t>
-      </w:r>
-    </w:p>
-    <w:p>
-      <w:pPr>
-        <w:pStyle w:val="ListNumber"/>
-      </w:pPr>
-      <w:r>
-        <w:rPr>
-          <w:rFonts w:eastAsia="Microsoft YaHei" w:ascii="Microsoft YaHei" w:hAnsi="Microsoft YaHei"/>
-          <w:b w:val="0"/>
-        </w:rPr>
-        <w:t xml:space="preserve">用户进入 </w:t>
-      </w:r>
-      <w:r>
-        <w:rPr>
-          <w:rFonts w:eastAsia="Microsoft YaHei" w:ascii="Microsoft YaHei" w:hAnsi="Microsoft YaHei"/>
-          <w:b/>
-        </w:rPr>
-        <w:t>商品详情页</w:t>
-      </w:r>
-      <w:r>
-        <w:rPr>
-          <w:rFonts w:eastAsia="Microsoft YaHei" w:ascii="Microsoft YaHei" w:hAnsi="Microsoft YaHei"/>
-          <w:b w:val="0"/>
-        </w:rPr>
-        <w:t xml:space="preserve"> → 看到 </w:t>
-      </w:r>
-      <w:r>
-        <w:rPr>
-          <w:rFonts w:eastAsia="Microsoft YaHei" w:ascii="Microsoft YaHei" w:hAnsi="Microsoft YaHei"/>
-          <w:b/>
-        </w:rPr>
-        <w:t>优惠券入口条</w:t>
-      </w:r>
-      <w:r>
-        <w:rPr>
-          <w:rFonts w:eastAsia="Microsoft YaHei" w:ascii="Microsoft YaHei" w:hAnsi="Microsoft YaHei"/>
-          <w:b w:val="0"/>
-        </w:rPr>
-        <w:t>（显示可用券标签/数量）。</w:t>
-      </w:r>
-    </w:p>
-    <w:p>
-      <w:pPr>
-        <w:pStyle w:val="ListNumber"/>
-      </w:pPr>
-      <w:r>
-        <w:rPr>
-          <w:rFonts w:eastAsia="Microsoft YaHei" w:ascii="Microsoft YaHei" w:hAnsi="Microsoft YaHei"/>
-          <w:b w:val="0"/>
-        </w:rPr>
-        <w:t xml:space="preserve">点击入口条 → 底部拉起 </w:t>
-      </w:r>
-      <w:r>
-        <w:rPr>
-          <w:rFonts w:eastAsia="Microsoft YaHei" w:ascii="Microsoft YaHei" w:hAnsi="Microsoft YaHei"/>
-          <w:b/>
-        </w:rPr>
-        <w:t>「优惠详情」弹窗</w:t>
-      </w:r>
-      <w:r>
-        <w:rPr>
-          <w:rFonts w:eastAsia="Microsoft YaHei" w:ascii="Microsoft YaHei" w:hAnsi="Microsoft YaHei"/>
-          <w:b w:val="0"/>
-        </w:rPr>
-        <w:t>（展示可用券列表）。</w:t>
-      </w:r>
-    </w:p>
-    <w:p>
-      <w:pPr>
-        <w:pStyle w:val="ListNumber"/>
-      </w:pPr>
-      <w:r>
-        <w:rPr>
-          <w:rFonts w:eastAsia="Microsoft YaHei" w:ascii="Microsoft YaHei" w:hAnsi="Microsoft YaHei"/>
-          <w:b w:val="0"/>
-        </w:rPr>
-        <w:t xml:space="preserve">在弹窗内点击任意券卡片的 </w:t>
-      </w:r>
-      <w:r>
-        <w:rPr>
-          <w:rFonts w:eastAsia="Microsoft YaHei" w:ascii="Microsoft YaHei" w:hAnsi="Microsoft YaHei"/>
-          <w:b/>
-        </w:rPr>
-        <w:t>「券规则 ›」</w:t>
-      </w:r>
-      <w:r>
-        <w:rPr>
-          <w:rFonts w:eastAsia="Microsoft YaHei" w:ascii="Microsoft YaHei" w:hAnsi="Microsoft YaHei"/>
-          <w:b w:val="0"/>
-        </w:rPr>
-        <w:t xml:space="preserve"> 按钮 → 跳转 </w:t>
-      </w:r>
-      <w:r>
-        <w:rPr>
-          <w:rFonts w:eastAsia="Microsoft YaHei" w:ascii="Microsoft YaHei" w:hAnsi="Microsoft YaHei"/>
-          <w:b/>
-        </w:rPr>
-        <w:t>券规则页</w:t>
-      </w:r>
-      <w:r>
-        <w:rPr>
-          <w:rFonts w:eastAsia="Microsoft YaHei" w:ascii="Microsoft YaHei" w:hAnsi="Microsoft YaHei"/>
-          <w:b w:val="0"/>
-        </w:rPr>
-        <w:t>（本页）。</w:t>
-      </w:r>
-    </w:p>
-    <w:p>
-      <w:r>
-        <w:rPr>
-          <w:rFonts w:eastAsia="Microsoft YaHei" w:ascii="Microsoft YaHei" w:hAnsi="Microsoft YaHei"/>
-          <w:b/>
-        </w:rPr>
-        <w:t>业务逻辑与边界条件</w:t>
-      </w:r>
-      <w:r>
-        <w:rPr>
-          <w:rFonts w:eastAsia="Microsoft YaHei" w:ascii="Microsoft YaHei" w:hAnsi="Microsoft YaHei"/>
-          <w:b w:val="0"/>
-        </w:rPr>
-        <w:t>：</w:t>
-      </w:r>
-    </w:p>
-    <w:p>
-      <w:pPr>
-        <w:pStyle w:val="ListBullet"/>
-      </w:pPr>
-      <w:r>
-        <w:rPr>
-          <w:rFonts w:eastAsia="Microsoft YaHei" w:ascii="Microsoft YaHei" w:hAnsi="Microsoft YaHei"/>
-          <w:b w:val="0"/>
-        </w:rPr>
-        <w:t>券规则页仅展示、无操作；不涉及领券/用券/核销逻辑。</w:t>
-      </w:r>
-    </w:p>
-    <w:p>
-      <w:pPr>
-        <w:pStyle w:val="ListBullet"/>
-      </w:pPr>
-      <w:r>
-        <w:rPr>
-          <w:rFonts w:eastAsia="Microsoft YaHei" w:ascii="Microsoft YaHei" w:hAnsi="Microsoft YaHei"/>
-          <w:b w:val="0"/>
-        </w:rPr>
-        <w:t>券规则内容与券模板绑定，同一张券的所有用户看到相同的规则说明。</w:t>
-      </w:r>
-    </w:p>
-    <w:p>
-      <w:pPr>
-        <w:pStyle w:val="ListBullet"/>
-      </w:pPr>
-      <w:r>
-        <w:rPr>
-          <w:rFonts w:eastAsia="Microsoft YaHei" w:ascii="Microsoft YaHei" w:hAnsi="Microsoft YaHei"/>
-          <w:b w:val="0"/>
-        </w:rPr>
-        <w:t>纯文本长度 ≤2000 字，超出前端截断（与 §4.1.3 D2 表单字段表「券规则说明」校验一致）。</w:t>
-      </w:r>
-    </w:p>
-    <w:p>
-      <w:pPr>
-        <w:pStyle w:val="Heading4"/>
-      </w:pPr>
-      <w:r>
-        <w:rPr>
-          <w:rFonts w:eastAsia="Microsoft YaHei" w:ascii="Microsoft YaHei" w:hAnsi="Microsoft YaHei"/>
-        </w:rPr>
-        <w:t>4.3.2.3 数据来源（字段级）</w:t>
-      </w:r>
-    </w:p>
-    <w:tbl>
-      <w:tblPr>
-        <w:tblStyle w:val="TableGrid"/>
-        <w:tblW w:type="auto" w:w="0"/>
-        <w:tblLook w:firstColumn="1" w:firstRow="1" w:lastColumn="0" w:lastRow="0" w:noHBand="0" w:noVBand="1" w:val="04A0"/>
-        <w:jc w:val="center"/>
-        <w:tblBorders>
-          <w:top w:val="single" w:sz="4" w:space="0" w:color="999999"/>
-          <w:left w:val="single" w:sz="4" w:space="0" w:color="999999"/>
-          <w:bottom w:val="single" w:sz="4" w:space="0" w:color="999999"/>
-          <w:right w:val="single" w:sz="4" w:space="0" w:color="999999"/>
-          <w:insideH w:val="single" w:sz="4" w:space="0" w:color="999999"/>
-          <w:insideV w:val="single" w:sz="4" w:space="0" w:color="999999"/>
-        </w:tblBorders>
-      </w:tblPr>
-      <w:tblGrid>
-        <w:gridCol w:w="4320"/>
-        <w:gridCol w:w="4320"/>
-      </w:tblGrid>
-      <w:tr>
-        <w:tc>
-          <w:tcPr>
-            <w:tcW w:type="dxa" w:w="4320"/>
-          </w:tcPr>
-          <w:p>
-            <w:r>
-              <w:rPr>
-                <w:b/>
-              </w:rPr>
-            </w:r>
-            <w:r>
-              <w:rPr>
-                <w:rFonts w:eastAsia="Microsoft YaHei" w:ascii="Microsoft YaHei" w:hAnsi="Microsoft YaHei"/>
-                <w:b/>
-              </w:rPr>
-              <w:t>字段名称</w:t>
-            </w:r>
-          </w:p>
-        </w:tc>
-        <w:tc>
-          <w:tcPr>
-            <w:tcW w:type="dxa" w:w="4320"/>
-          </w:tcPr>
-          <w:p>
-            <w:r>
-              <w:rPr>
-                <w:b/>
-              </w:rPr>
-            </w:r>
-            <w:r>
-              <w:rPr>
-                <w:rFonts w:eastAsia="Microsoft YaHei" w:ascii="Microsoft YaHei" w:hAnsi="Microsoft YaHei"/>
-                <w:b/>
-              </w:rPr>
-              <w:t>取值逻辑说明</w:t>
-            </w:r>
-          </w:p>
-        </w:tc>
-      </w:tr>
-      <w:tr>
-        <w:tc>
-          <w:tcPr>
-            <w:tcW w:type="dxa" w:w="4320"/>
-          </w:tcPr>
-          <w:p>
-            <w:r/>
-            <w:r>
-              <w:rPr>
-                <w:rFonts w:eastAsia="Microsoft YaHei" w:ascii="Microsoft YaHei" w:hAnsi="Microsoft YaHei"/>
-                <w:b w:val="0"/>
-              </w:rPr>
-              <w:t>券规则说明</w:t>
-            </w:r>
-          </w:p>
-        </w:tc>
-        <w:tc>
-          <w:tcPr>
-            <w:tcW w:type="dxa" w:w="4320"/>
-          </w:tcPr>
-          <w:p>
-            <w:r/>
-            <w:r>
-              <w:rPr>
-                <w:rFonts w:eastAsia="Microsoft YaHei" w:ascii="Microsoft YaHei" w:hAnsi="Microsoft YaHei"/>
-                <w:b w:val="0"/>
-              </w:rPr>
-              <w:t>取《券模板表》</w:t>
-            </w:r>
-            <w:r>
-              <w:rPr>
-                <w:rFonts w:ascii="Microsoft YaHei" w:hAnsi="Microsoft YaHei" w:eastAsia="Microsoft YaHei"/>
-                <w:color w:val="BE123C"/>
-              </w:rPr>
-              <w:t>rule_desc</w:t>
-            </w:r>
-            <w:r>
-              <w:rPr>
-                <w:rFonts w:eastAsia="Microsoft YaHei" w:ascii="Microsoft YaHei" w:hAnsi="Microsoft YaHei"/>
-                <w:b w:val="0"/>
-              </w:rPr>
-              <w:t xml:space="preserve"> 字段（HTML 富文本）</w:t>
-            </w:r>
-          </w:p>
-        </w:tc>
-      </w:tr>
-    </w:tbl>
-    <w:p>
-      <w:pPr>
-        <w:pStyle w:val="Heading3"/>
-      </w:pPr>
-      <w:r>
-        <w:rPr>
-          <w:rFonts w:eastAsia="Microsoft YaHei" w:ascii="Microsoft YaHei" w:hAnsi="Microsoft YaHei"/>
-        </w:rPr>
-        <w:t>4.3.4 我的优惠券（三态）</w:t>
-      </w:r>
-      <w:r>
-        <w:rPr>
-          <w:rFonts w:eastAsia="Microsoft YaHei" w:ascii="Microsoft YaHei" w:hAnsi="Microsoft YaHei"/>
-          <w:b w:val="0"/>
-        </w:rPr>
-        <w:t>本期新增</w:t>
-      </w:r>
-    </w:p>
-    <w:p>
-      <w:pPr>
-        <w:pStyle w:val="Heading4"/>
-      </w:pPr>
-      <w:r>
-        <w:rPr>
-          <w:rFonts w:eastAsia="Microsoft YaHei" w:ascii="Microsoft YaHei" w:hAnsi="Microsoft YaHei"/>
-        </w:rPr>
-        <w:t>4.3.4.1 原型与交互示意</w:t>
-      </w:r>
-    </w:p>
-    <w:p>
-      <w:r>
-        <w:rPr>
-          <w:rFonts w:eastAsia="Microsoft YaHei" w:ascii="Microsoft YaHei" w:hAnsi="Microsoft YaHei"/>
-        </w:rPr>
-        <w:drawing>
-          <wp:inline xmlns:a="http://schemas.openxmlformats.org/drawingml/2006/main" xmlns:pic="http://schemas.openxmlformats.org/drawingml/2006/picture">
-            <wp:extent cx="5303520" cy="3314700"/>
-            <wp:docPr id="20" name="Picture 20"/>
-            <wp:cNvGraphicFramePr>
-              <a:graphicFrameLocks noChangeAspect="1"/>
-            </wp:cNvGraphicFramePr>
-            <a:graphic>
-              <a:graphicData uri="http://schemas.openxmlformats.org/drawingml/2006/picture">
-                <pic:pic>
-                  <pic:nvPicPr>
-                    <pic:cNvPr id="0" name="image.png"/>
-                    <pic:cNvPicPr/>
-                  </pic:nvPicPr>
-                  <pic:blipFill>
-                    <a:blip r:embed="rId32"/>
                     <a:stretch>
                       <a:fillRect/>
                     </a:stretch>
@@ -21990,7 +21590,7 @@
         <w:drawing>
           <wp:inline xmlns:a="http://schemas.openxmlformats.org/drawingml/2006/main" xmlns:pic="http://schemas.openxmlformats.org/drawingml/2006/picture">
             <wp:extent cx="5303520" cy="11150991"/>
-            <wp:docPr id="21" name="Picture 21"/>
+            <wp:docPr id="20" name="Picture 20"/>
             <wp:cNvGraphicFramePr>
               <a:graphicFrameLocks noChangeAspect="1"/>
             </wp:cNvGraphicFramePr>
@@ -22002,7 +21602,7 @@
                     <pic:cNvPicPr/>
                   </pic:nvPicPr>
                   <pic:blipFill>
-                    <a:blip r:embed="rId33"/>
+                    <a:blip r:embed="rId32"/>
                     <a:stretch>
                       <a:fillRect/>
                     </a:stretch>
@@ -22693,7 +22293,7 @@
         <w:drawing>
           <wp:inline xmlns:a="http://schemas.openxmlformats.org/drawingml/2006/main" xmlns:pic="http://schemas.openxmlformats.org/drawingml/2006/picture">
             <wp:extent cx="5303520" cy="15066818"/>
-            <wp:docPr id="22" name="Picture 22"/>
+            <wp:docPr id="21" name="Picture 21"/>
             <wp:cNvGraphicFramePr>
               <a:graphicFrameLocks noChangeAspect="1"/>
             </wp:cNvGraphicFramePr>
@@ -22705,7 +22305,7 @@
                     <pic:cNvPicPr/>
                   </pic:nvPicPr>
                   <pic:blipFill>
-                    <a:blip r:embed="rId34"/>
+                    <a:blip r:embed="rId33"/>
                     <a:stretch>
                       <a:fillRect/>
                     </a:stretch>
@@ -23984,7 +23584,7 @@
         </w:rPr>
         <w:t xml:space="preserve">本需求埋点事件与属性严格遵循 </w:t>
       </w:r>
-      <w:hyperlink r:id="rId35">
+      <w:hyperlink r:id="rId34">
         <w:r>
           <w:rPr>
             <w:rStyle w:val="Hyperlink"/>
@@ -25279,314 +24879,6 @@
           </w:p>
         </w:tc>
       </w:tr>
-      <w:tr>
-        <w:tc>
-          <w:tcPr>
-            <w:tcW w:type="dxa" w:w="1728"/>
-          </w:tcPr>
-          <w:p>
-            <w:r/>
-            <w:r>
-              <w:rPr>
-                <w:rFonts w:eastAsia="Microsoft YaHei" w:ascii="Microsoft YaHei" w:hAnsi="Microsoft YaHei"/>
-                <w:b w:val="0"/>
-              </w:rPr>
-              <w:t>10.2</w:t>
-            </w:r>
-          </w:p>
-        </w:tc>
-        <w:tc>
-          <w:tcPr>
-            <w:tcW w:type="dxa" w:w="1728"/>
-          </w:tcPr>
-          <w:p>
-            <w:r/>
-            <w:r>
-              <w:rPr>
-                <w:rFonts w:eastAsia="Microsoft YaHei" w:ascii="Microsoft YaHei" w:hAnsi="Microsoft YaHei"/>
-                <w:b w:val="0"/>
-              </w:rPr>
-              <w:t>会员中心-批量送券</w:t>
-            </w:r>
-          </w:p>
-        </w:tc>
-        <w:tc>
-          <w:tcPr>
-            <w:tcW w:type="dxa" w:w="1728"/>
-          </w:tcPr>
-          <w:p>
-            <w:r/>
-            <w:r>
-              <w:rPr>
-                <w:rFonts w:eastAsia="Microsoft YaHei" w:ascii="Microsoft YaHei" w:hAnsi="Microsoft YaHei"/>
-                <w:b w:val="0"/>
-              </w:rPr>
-              <w:t>平台端后台 · 会员中心</w:t>
-            </w:r>
-          </w:p>
-        </w:tc>
-        <w:tc>
-          <w:tcPr>
-            <w:tcW w:type="dxa" w:w="1728"/>
-          </w:tcPr>
-          <w:p>
-            <w:r/>
-            <w:r>
-              <w:rPr>
-                <w:rFonts w:eastAsia="Microsoft YaHei" w:ascii="Microsoft YaHei" w:hAnsi="Microsoft YaHei"/>
-                <w:b w:val="0"/>
-              </w:rPr>
-              <w:t>是</w:t>
-            </w:r>
-          </w:p>
-        </w:tc>
-        <w:tc>
-          <w:tcPr>
-            <w:tcW w:type="dxa" w:w="1728"/>
-          </w:tcPr>
-          <w:p>
-            <w:r/>
-            <w:r>
-              <w:rPr>
-                <w:rFonts w:eastAsia="Microsoft YaHei" w:ascii="Microsoft YaHei" w:hAnsi="Microsoft YaHei"/>
-                <w:b w:val="0"/>
-              </w:rPr>
-              <w:t>按标签圈选批量发券，原型详见 10.2</w:t>
-            </w:r>
-          </w:p>
-        </w:tc>
-      </w:tr>
-      <w:tr>
-        <w:tc>
-          <w:tcPr>
-            <w:tcW w:type="dxa" w:w="1728"/>
-          </w:tcPr>
-          <w:p>
-            <w:r/>
-            <w:r>
-              <w:rPr>
-                <w:rFonts w:eastAsia="Microsoft YaHei" w:ascii="Microsoft YaHei" w:hAnsi="Microsoft YaHei"/>
-                <w:b w:val="0"/>
-              </w:rPr>
-              <w:t>10.3</w:t>
-            </w:r>
-          </w:p>
-        </w:tc>
-        <w:tc>
-          <w:tcPr>
-            <w:tcW w:type="dxa" w:w="1728"/>
-          </w:tcPr>
-          <w:p>
-            <w:r/>
-            <w:r>
-              <w:rPr>
-                <w:rFonts w:eastAsia="Microsoft YaHei" w:ascii="Microsoft YaHei" w:hAnsi="Microsoft YaHei"/>
-                <w:b w:val="0"/>
-              </w:rPr>
-              <w:t>关联直播原型</w:t>
-            </w:r>
-          </w:p>
-        </w:tc>
-        <w:tc>
-          <w:tcPr>
-            <w:tcW w:type="dxa" w:w="1728"/>
-          </w:tcPr>
-          <w:p>
-            <w:r/>
-            <w:r>
-              <w:rPr>
-                <w:rFonts w:eastAsia="Microsoft YaHei" w:ascii="Microsoft YaHei" w:hAnsi="Microsoft YaHei"/>
-                <w:b w:val="0"/>
-              </w:rPr>
-              <w:t>平台端后台 · 直播间管理 / 直播商品池</w:t>
-            </w:r>
-          </w:p>
-        </w:tc>
-        <w:tc>
-          <w:tcPr>
-            <w:tcW w:type="dxa" w:w="1728"/>
-          </w:tcPr>
-          <w:p>
-            <w:r/>
-            <w:r>
-              <w:rPr>
-                <w:rFonts w:eastAsia="Microsoft YaHei" w:ascii="Microsoft YaHei" w:hAnsi="Microsoft YaHei"/>
-                <w:b w:val="0"/>
-              </w:rPr>
-              <w:t>是</w:t>
-            </w:r>
-          </w:p>
-        </w:tc>
-        <w:tc>
-          <w:tcPr>
-            <w:tcW w:type="dxa" w:w="1728"/>
-          </w:tcPr>
-          <w:p>
-            <w:r/>
-            <w:r>
-              <w:rPr>
-                <w:rFonts w:eastAsia="Microsoft YaHei" w:ascii="Microsoft YaHei" w:hAnsi="Microsoft YaHei"/>
-                <w:b w:val="0"/>
-              </w:rPr>
-              <w:t>直播间绑定券模板，原型详见 10.3</w:t>
-            </w:r>
-          </w:p>
-        </w:tc>
-      </w:tr>
-      <w:tr>
-        <w:tc>
-          <w:tcPr>
-            <w:tcW w:type="dxa" w:w="1728"/>
-          </w:tcPr>
-          <w:p>
-            <w:r/>
-            <w:r>
-              <w:rPr>
-                <w:rFonts w:eastAsia="Microsoft YaHei" w:ascii="Microsoft YaHei" w:hAnsi="Microsoft YaHei"/>
-                <w:b w:val="0"/>
-              </w:rPr>
-              <w:t>10.4</w:t>
-            </w:r>
-          </w:p>
-        </w:tc>
-        <w:tc>
-          <w:tcPr>
-            <w:tcW w:type="dxa" w:w="1728"/>
-          </w:tcPr>
-          <w:p>
-            <w:r/>
-            <w:r>
-              <w:rPr>
-                <w:rFonts w:eastAsia="Microsoft YaHei" w:ascii="Microsoft YaHei" w:hAnsi="Microsoft YaHei"/>
-                <w:b w:val="0"/>
-              </w:rPr>
-              <w:t>订单关联优惠券</w:t>
-            </w:r>
-          </w:p>
-        </w:tc>
-        <w:tc>
-          <w:tcPr>
-            <w:tcW w:type="dxa" w:w="1728"/>
-          </w:tcPr>
-          <w:p>
-            <w:r/>
-            <w:r>
-              <w:rPr>
-                <w:rFonts w:eastAsia="Microsoft YaHei" w:ascii="Microsoft YaHei" w:hAnsi="Microsoft YaHei"/>
-                <w:b w:val="0"/>
-              </w:rPr>
-              <w:t>平台端后台 · 订单 / 优惠券</w:t>
-            </w:r>
-          </w:p>
-        </w:tc>
-        <w:tc>
-          <w:tcPr>
-            <w:tcW w:type="dxa" w:w="1728"/>
-          </w:tcPr>
-          <w:p>
-            <w:r/>
-            <w:r>
-              <w:rPr>
-                <w:rFonts w:eastAsia="Microsoft YaHei" w:ascii="Microsoft YaHei" w:hAnsi="Microsoft YaHei"/>
-                <w:b w:val="0"/>
-              </w:rPr>
-              <w:t>是</w:t>
-            </w:r>
-          </w:p>
-        </w:tc>
-        <w:tc>
-          <w:tcPr>
-            <w:tcW w:type="dxa" w:w="1728"/>
-          </w:tcPr>
-          <w:p>
-            <w:r/>
-            <w:r>
-              <w:rPr>
-                <w:rFonts w:eastAsia="Microsoft YaHei" w:ascii="Microsoft YaHei" w:hAnsi="Microsoft YaHei"/>
-                <w:b w:val="0"/>
-              </w:rPr>
-              <w:t>券与订单映射看板，原型详见 10.4</w:t>
-            </w:r>
-          </w:p>
-        </w:tc>
-      </w:tr>
-      <w:tr>
-        <w:tc>
-          <w:tcPr>
-            <w:tcW w:type="dxa" w:w="1728"/>
-          </w:tcPr>
-          <w:p>
-            <w:r/>
-            <w:r>
-              <w:rPr>
-                <w:rFonts w:eastAsia="Microsoft YaHei" w:ascii="Microsoft YaHei" w:hAnsi="Microsoft YaHei"/>
-                <w:b w:val="0"/>
-              </w:rPr>
-              <w:t>10.7</w:t>
-            </w:r>
-          </w:p>
-        </w:tc>
-        <w:tc>
-          <w:tcPr>
-            <w:tcW w:type="dxa" w:w="1728"/>
-          </w:tcPr>
-          <w:p>
-            <w:r/>
-            <w:r>
-              <w:rPr>
-                <w:rFonts w:eastAsia="Microsoft YaHei" w:ascii="Microsoft YaHei" w:hAnsi="Microsoft YaHei"/>
-                <w:b w:val="0"/>
-              </w:rPr>
-              <w:t>优惠券关联业绩报表</w:t>
-            </w:r>
-          </w:p>
-        </w:tc>
-        <w:tc>
-          <w:tcPr>
-            <w:tcW w:type="dxa" w:w="1728"/>
-          </w:tcPr>
-          <w:p>
-            <w:r/>
-            <w:r>
-              <w:rPr>
-                <w:rFonts w:eastAsia="Microsoft YaHei" w:ascii="Microsoft YaHei" w:hAnsi="Microsoft YaHei"/>
-                <w:b w:val="0"/>
-              </w:rPr>
-              <w:t>平台端后台 · 业绩报表 ⚠️ 菜单路径待确认</w:t>
-            </w:r>
-          </w:p>
-        </w:tc>
-        <w:tc>
-          <w:tcPr>
-            <w:tcW w:type="dxa" w:w="1728"/>
-          </w:tcPr>
-          <w:p>
-            <w:r/>
-            <w:r>
-              <w:rPr>
-                <w:rFonts w:eastAsia="Microsoft YaHei" w:ascii="Microsoft YaHei" w:hAnsi="Microsoft YaHei"/>
-                <w:b w:val="0"/>
-              </w:rPr>
-              <w:t>否</w:t>
-            </w:r>
-          </w:p>
-        </w:tc>
-        <w:tc>
-          <w:tcPr>
-            <w:tcW w:type="dxa" w:w="1728"/>
-          </w:tcPr>
-          <w:p>
-            <w:r/>
-            <w:r>
-              <w:rPr>
-                <w:rFonts w:eastAsia="Microsoft YaHei" w:ascii="Microsoft YaHei" w:hAnsi="Microsoft YaHei"/>
-                <w:b w:val="0"/>
-              </w:rPr>
-              <w:t>付款完成计优惠金额入业绩，退款不冲减，详见 10.7</w:t>
-            </w:r>
-          </w:p>
-        </w:tc>
-      </w:tr>
     </w:tbl>
     <w:p>
       <w:pPr>
@@ -26836,7 +26128,7 @@
         </w:rPr>
         <w:t>：</w:t>
       </w:r>
-      <w:hyperlink r:id="rId36">
+      <w:hyperlink r:id="rId35">
         <w:r>
           <w:rPr>
             <w:rStyle w:val="Hyperlink"/>
@@ -26862,59 +26154,12 @@
       </w:r>
     </w:p>
     <w:p>
-      <w:pPr>
-        <w:jc w:val="center"/>
-      </w:pPr>
-      <w:r>
-        <w:rPr>
-          <w:rFonts w:eastAsia="Microsoft YaHei" w:ascii="Microsoft YaHei" w:hAnsi="Microsoft YaHei"/>
-        </w:rPr>
-        <w:drawing>
-          <wp:inline xmlns:a="http://schemas.openxmlformats.org/drawingml/2006/main" xmlns:pic="http://schemas.openxmlformats.org/drawingml/2006/picture">
-            <wp:extent cx="5303520" cy="3729038"/>
-            <wp:docPr id="23" name="Picture 23"/>
-            <wp:cNvGraphicFramePr>
-              <a:graphicFrameLocks noChangeAspect="1"/>
-            </wp:cNvGraphicFramePr>
-            <a:graphic>
-              <a:graphicData uri="http://schemas.openxmlformats.org/drawingml/2006/picture">
-                <pic:pic>
-                  <pic:nvPicPr>
-                    <pic:cNvPr id="0" name="image.png"/>
-                    <pic:cNvPicPr/>
-                  </pic:nvPicPr>
-                  <pic:blipFill>
-                    <a:blip r:embed="rId37"/>
-                    <a:stretch>
-                      <a:fillRect/>
-                    </a:stretch>
-                  </pic:blipFill>
-                  <pic:spPr>
-                    <a:xfrm>
-                      <a:off x="0" y="0"/>
-                      <a:ext cx="5303520" cy="3729038"/>
-                    </a:xfrm>
-                    <a:prstGeom prst="rect"/>
-                  </pic:spPr>
-                </pic:pic>
-              </a:graphicData>
-            </a:graphic>
-          </wp:inline>
-        </w:drawing>
-      </w:r>
-    </w:p>
-    <w:p>
-      <w:pPr>
-        <w:jc w:val="center"/>
-      </w:pPr>
-      <w:r>
-        <w:rPr>
-          <w:rFonts w:eastAsia="Microsoft YaHei" w:ascii="Microsoft YaHei" w:hAnsi="Microsoft YaHei"/>
-          <w:i/>
-          <w:color w:val="6B7280"/>
-          <w:sz w:val="18"/>
-        </w:rPr>
-        <w:t>会员中心-批量送券原型</w:t>
+      <w:r>
+        <w:rPr>
+          <w:rFonts w:eastAsia="Microsoft YaHei" w:ascii="Microsoft YaHei" w:hAnsi="Microsoft YaHei"/>
+          <w:color w:val="DC2626"/>
+        </w:rPr>
+        <w:t>[缺失图片] 会员中心-批量送券原型</w:t>
       </w:r>
     </w:p>
     <w:p>
@@ -26975,7 +26220,7 @@
         </w:rPr>
         <w:t>：</w:t>
       </w:r>
-      <w:hyperlink r:id="rId38">
+      <w:hyperlink r:id="rId36">
         <w:r>
           <w:rPr>
             <w:rStyle w:val="Hyperlink"/>
@@ -27001,59 +26246,12 @@
       </w:r>
     </w:p>
     <w:p>
-      <w:pPr>
-        <w:jc w:val="center"/>
-      </w:pPr>
-      <w:r>
-        <w:rPr>
-          <w:rFonts w:eastAsia="Microsoft YaHei" w:ascii="Microsoft YaHei" w:hAnsi="Microsoft YaHei"/>
-        </w:rPr>
-        <w:drawing>
-          <wp:inline xmlns:a="http://schemas.openxmlformats.org/drawingml/2006/main" xmlns:pic="http://schemas.openxmlformats.org/drawingml/2006/picture">
-            <wp:extent cx="5303520" cy="3729038"/>
-            <wp:docPr id="24" name="Picture 24"/>
-            <wp:cNvGraphicFramePr>
-              <a:graphicFrameLocks noChangeAspect="1"/>
-            </wp:cNvGraphicFramePr>
-            <a:graphic>
-              <a:graphicData uri="http://schemas.openxmlformats.org/drawingml/2006/picture">
-                <pic:pic>
-                  <pic:nvPicPr>
-                    <pic:cNvPr id="0" name="image.png"/>
-                    <pic:cNvPicPr/>
-                  </pic:nvPicPr>
-                  <pic:blipFill>
-                    <a:blip r:embed="rId39"/>
-                    <a:stretch>
-                      <a:fillRect/>
-                    </a:stretch>
-                  </pic:blipFill>
-                  <pic:spPr>
-                    <a:xfrm>
-                      <a:off x="0" y="0"/>
-                      <a:ext cx="5303520" cy="3729038"/>
-                    </a:xfrm>
-                    <a:prstGeom prst="rect"/>
-                  </pic:spPr>
-                </pic:pic>
-              </a:graphicData>
-            </a:graphic>
-          </wp:inline>
-        </w:drawing>
-      </w:r>
-    </w:p>
-    <w:p>
-      <w:pPr>
-        <w:jc w:val="center"/>
-      </w:pPr>
-      <w:r>
-        <w:rPr>
-          <w:rFonts w:eastAsia="Microsoft YaHei" w:ascii="Microsoft YaHei" w:hAnsi="Microsoft YaHei"/>
-          <w:i/>
-          <w:color w:val="6B7280"/>
-          <w:sz w:val="18"/>
-        </w:rPr>
-        <w:t>关联直播原型</w:t>
+      <w:r>
+        <w:rPr>
+          <w:rFonts w:eastAsia="Microsoft YaHei" w:ascii="Microsoft YaHei" w:hAnsi="Microsoft YaHei"/>
+          <w:color w:val="DC2626"/>
+        </w:rPr>
+        <w:t>[缺失图片] 关联直播原型</w:t>
       </w:r>
     </w:p>
     <w:p>
@@ -27114,7 +26312,7 @@
         </w:rPr>
         <w:t>：</w:t>
       </w:r>
-      <w:hyperlink r:id="rId40">
+      <w:hyperlink r:id="rId37">
         <w:r>
           <w:rPr>
             <w:rStyle w:val="Hyperlink"/>
@@ -27140,59 +26338,12 @@
       </w:r>
     </w:p>
     <w:p>
-      <w:pPr>
-        <w:jc w:val="center"/>
-      </w:pPr>
-      <w:r>
-        <w:rPr>
-          <w:rFonts w:eastAsia="Microsoft YaHei" w:ascii="Microsoft YaHei" w:hAnsi="Microsoft YaHei"/>
-        </w:rPr>
-        <w:drawing>
-          <wp:inline xmlns:a="http://schemas.openxmlformats.org/drawingml/2006/main" xmlns:pic="http://schemas.openxmlformats.org/drawingml/2006/picture">
-            <wp:extent cx="5303520" cy="3729038"/>
-            <wp:docPr id="25" name="Picture 25"/>
-            <wp:cNvGraphicFramePr>
-              <a:graphicFrameLocks noChangeAspect="1"/>
-            </wp:cNvGraphicFramePr>
-            <a:graphic>
-              <a:graphicData uri="http://schemas.openxmlformats.org/drawingml/2006/picture">
-                <pic:pic>
-                  <pic:nvPicPr>
-                    <pic:cNvPr id="0" name="image.png"/>
-                    <pic:cNvPicPr/>
-                  </pic:nvPicPr>
-                  <pic:blipFill>
-                    <a:blip r:embed="rId41"/>
-                    <a:stretch>
-                      <a:fillRect/>
-                    </a:stretch>
-                  </pic:blipFill>
-                  <pic:spPr>
-                    <a:xfrm>
-                      <a:off x="0" y="0"/>
-                      <a:ext cx="5303520" cy="3729038"/>
-                    </a:xfrm>
-                    <a:prstGeom prst="rect"/>
-                  </pic:spPr>
-                </pic:pic>
-              </a:graphicData>
-            </a:graphic>
-          </wp:inline>
-        </w:drawing>
-      </w:r>
-    </w:p>
-    <w:p>
-      <w:pPr>
-        <w:jc w:val="center"/>
-      </w:pPr>
-      <w:r>
-        <w:rPr>
-          <w:rFonts w:eastAsia="Microsoft YaHei" w:ascii="Microsoft YaHei" w:hAnsi="Microsoft YaHei"/>
-          <w:i/>
-          <w:color w:val="6B7280"/>
-          <w:sz w:val="18"/>
-        </w:rPr>
-        <w:t>订单关联优惠券原型</w:t>
+      <w:r>
+        <w:rPr>
+          <w:rFonts w:eastAsia="Microsoft YaHei" w:ascii="Microsoft YaHei" w:hAnsi="Microsoft YaHei"/>
+          <w:color w:val="DC2626"/>
+        </w:rPr>
+        <w:t>[缺失图片] 订单关联优惠券原型</w:t>
       </w:r>
     </w:p>
     <w:p>
@@ -27203,7 +26354,7 @@
         <w:rPr>
           <w:rFonts w:eastAsia="Microsoft YaHei" w:ascii="Microsoft YaHei" w:hAnsi="Microsoft YaHei"/>
         </w:rPr>
-        <w:t>10.7 优惠券关联业绩报表</w:t>
+        <w:t>10.5 会员直接发券</w:t>
       </w:r>
     </w:p>
     <w:p>
@@ -27219,21 +26370,7 @@
           <w:rFonts w:eastAsia="Microsoft YaHei" w:ascii="Microsoft YaHei" w:hAnsi="Microsoft YaHei"/>
           <w:b w:val="0"/>
         </w:rPr>
-        <w:t>：业绩报表需体现优惠券对订单业绩的贡献。订单完成「下单 + 付款」后，业绩报表按订单维度生成/更新业绩记录，并将该订单使用的优惠券抵扣金额计入报表对应订单的业绩金额中（即「优惠金额」增加对应订单金额）。含优惠券的订单发生退款时，业绩报表</w:t>
-      </w:r>
-      <w:r>
-        <w:rPr>
-          <w:rFonts w:eastAsia="Microsoft YaHei" w:ascii="Microsoft YaHei" w:hAnsi="Microsoft YaHei"/>
-          <w:b/>
-        </w:rPr>
-        <w:t>不回滚、不扣减</w:t>
-      </w:r>
-      <w:r>
-        <w:rPr>
-          <w:rFonts w:eastAsia="Microsoft YaHei" w:ascii="Microsoft YaHei" w:hAnsi="Microsoft YaHei"/>
-          <w:b w:val="0"/>
-        </w:rPr>
-        <w:t>原业绩记录。</w:t>
+        <w:t>：平台端后台为运营提供「针对单个会员直接发券」的能力。运营在用户详情页或会员列表中，选择目标用户和券模板，一键发放。适用于客服补偿、运营手动触达等单点场景。</w:t>
       </w:r>
     </w:p>
     <w:p>
@@ -27242,658 +26379,106 @@
           <w:rFonts w:eastAsia="Microsoft YaHei" w:ascii="Microsoft YaHei" w:hAnsi="Microsoft YaHei"/>
           <w:b/>
         </w:rPr>
-        <w:t>归属位置</w:t>
+        <w:t>与优惠券体系的关系</w:t>
+      </w:r>
+      <w:r>
+        <w:rPr>
+          <w:rFonts w:eastAsia="Microsoft YaHei" w:ascii="Microsoft YaHei" w:hAnsi="Microsoft YaHei"/>
+          <w:b w:val="0"/>
+        </w:rPr>
+        <w:t>：直接发券是批量送券的「单条」版本，同样调用券模板发券接口写入用户券账户；单条发放不做标签筛选，直接指定用户 ID。</w:t>
       </w:r>
     </w:p>
-    <w:tbl>
-      <w:tblPr>
-        <w:tblStyle w:val="TableGrid"/>
-        <w:tblW w:type="auto" w:w="0"/>
-        <w:tblLook w:firstColumn="1" w:firstRow="1" w:lastColumn="0" w:lastRow="0" w:noHBand="0" w:noVBand="1" w:val="04A0"/>
-        <w:jc w:val="center"/>
-        <w:tblBorders>
-          <w:top w:val="single" w:sz="4" w:space="0" w:color="999999"/>
-          <w:left w:val="single" w:sz="4" w:space="0" w:color="999999"/>
-          <w:bottom w:val="single" w:sz="4" w:space="0" w:color="999999"/>
-          <w:right w:val="single" w:sz="4" w:space="0" w:color="999999"/>
-          <w:insideH w:val="single" w:sz="4" w:space="0" w:color="999999"/>
-          <w:insideV w:val="single" w:sz="4" w:space="0" w:color="999999"/>
-        </w:tblBorders>
-      </w:tblPr>
-      <w:tblGrid>
-        <w:gridCol w:w="4320"/>
-        <w:gridCol w:w="4320"/>
-      </w:tblGrid>
-      <w:tr>
-        <w:tc>
-          <w:tcPr>
-            <w:tcW w:type="dxa" w:w="4320"/>
-          </w:tcPr>
-          <w:p>
-            <w:r>
-              <w:rPr>
-                <w:b/>
-              </w:rPr>
-            </w:r>
-            <w:r>
-              <w:rPr>
-                <w:rFonts w:eastAsia="Microsoft YaHei" w:ascii="Microsoft YaHei" w:hAnsi="Microsoft YaHei"/>
-                <w:b/>
-              </w:rPr>
-              <w:t>项</w:t>
-            </w:r>
-          </w:p>
-        </w:tc>
-        <w:tc>
-          <w:tcPr>
-            <w:tcW w:type="dxa" w:w="4320"/>
-          </w:tcPr>
-          <w:p>
-            <w:r>
-              <w:rPr>
-                <w:b/>
-              </w:rPr>
-            </w:r>
-            <w:r>
-              <w:rPr>
-                <w:rFonts w:eastAsia="Microsoft YaHei" w:ascii="Microsoft YaHei" w:hAnsi="Microsoft YaHei"/>
-                <w:b/>
-              </w:rPr>
-              <w:t>说明</w:t>
-            </w:r>
-          </w:p>
-        </w:tc>
-      </w:tr>
-      <w:tr>
-        <w:tc>
-          <w:tcPr>
-            <w:tcW w:type="dxa" w:w="4320"/>
-          </w:tcPr>
-          <w:p>
-            <w:r/>
-            <w:r>
-              <w:rPr>
-                <w:rFonts w:eastAsia="Microsoft YaHei" w:ascii="Microsoft YaHei" w:hAnsi="Microsoft YaHei"/>
-                <w:b w:val="0"/>
-              </w:rPr>
-              <w:t>端口</w:t>
-            </w:r>
-          </w:p>
-        </w:tc>
-        <w:tc>
-          <w:tcPr>
-            <w:tcW w:type="dxa" w:w="4320"/>
-          </w:tcPr>
-          <w:p>
-            <w:r/>
-            <w:r>
-              <w:rPr>
-                <w:rFonts w:eastAsia="Microsoft YaHei" w:ascii="Microsoft YaHei" w:hAnsi="Microsoft YaHei"/>
-                <w:b w:val="0"/>
-              </w:rPr>
-              <w:t>平台端后台</w:t>
-            </w:r>
-          </w:p>
-        </w:tc>
-      </w:tr>
-      <w:tr>
-        <w:tc>
-          <w:tcPr>
-            <w:tcW w:type="dxa" w:w="4320"/>
-          </w:tcPr>
-          <w:p>
-            <w:r/>
-            <w:r>
-              <w:rPr>
-                <w:rFonts w:eastAsia="Microsoft YaHei" w:ascii="Microsoft YaHei" w:hAnsi="Microsoft YaHei"/>
-                <w:b w:val="0"/>
-              </w:rPr>
-              <w:t>页面路径</w:t>
-            </w:r>
-          </w:p>
-        </w:tc>
-        <w:tc>
-          <w:tcPr>
-            <w:tcW w:type="dxa" w:w="4320"/>
-          </w:tcPr>
-          <w:p>
-            <w:r/>
-            <w:r>
-              <w:rPr>
-                <w:rFonts w:eastAsia="Microsoft YaHei" w:ascii="Microsoft YaHei" w:hAnsi="Microsoft YaHei"/>
-                <w:b w:val="0"/>
-              </w:rPr>
-              <w:t>⚠️ 待确认 @干系人（业绩报表在平台端后台的归属菜单，如「数据 / 业绩报表」或「财务 / 业绩报表」）</w:t>
-            </w:r>
-          </w:p>
-        </w:tc>
-      </w:tr>
-      <w:tr>
-        <w:tc>
-          <w:tcPr>
-            <w:tcW w:type="dxa" w:w="4320"/>
-          </w:tcPr>
-          <w:p>
-            <w:r/>
-            <w:r>
-              <w:rPr>
-                <w:rFonts w:eastAsia="Microsoft YaHei" w:ascii="Microsoft YaHei" w:hAnsi="Microsoft YaHei"/>
-                <w:b w:val="0"/>
-              </w:rPr>
-              <w:t>页面性质</w:t>
-            </w:r>
-          </w:p>
-        </w:tc>
-        <w:tc>
-          <w:tcPr>
-            <w:tcW w:type="dxa" w:w="4320"/>
-          </w:tcPr>
-          <w:p>
-            <w:r/>
-            <w:r>
-              <w:rPr>
-                <w:rFonts w:eastAsia="Microsoft YaHei" w:ascii="Microsoft YaHei" w:hAnsi="Microsoft YaHei"/>
-                <w:b/>
-              </w:rPr>
-              <w:t>既有页面增量</w:t>
-            </w:r>
-            <w:r>
-              <w:rPr>
-                <w:rFonts w:eastAsia="Microsoft YaHei" w:ascii="Microsoft YaHei" w:hAnsi="Microsoft YaHei"/>
-                <w:b w:val="0"/>
-              </w:rPr>
-              <w:t>，本期在业绩报表中新增「优惠金额」口径说明，不出原型</w:t>
-            </w:r>
-          </w:p>
-        </w:tc>
-      </w:tr>
-      <w:tr>
-        <w:tc>
-          <w:tcPr>
-            <w:tcW w:type="dxa" w:w="4320"/>
-          </w:tcPr>
-          <w:p>
-            <w:r/>
-            <w:r>
-              <w:rPr>
-                <w:rFonts w:eastAsia="Microsoft YaHei" w:ascii="Microsoft YaHei" w:hAnsi="Microsoft YaHei"/>
-                <w:b w:val="0"/>
-              </w:rPr>
-              <w:t>改动范围</w:t>
-            </w:r>
-          </w:p>
-        </w:tc>
-        <w:tc>
-          <w:tcPr>
-            <w:tcW w:type="dxa" w:w="4320"/>
-          </w:tcPr>
-          <w:p>
-            <w:r/>
-            <w:r>
-              <w:rPr>
-                <w:rFonts w:eastAsia="Microsoft YaHei" w:ascii="Microsoft YaHei" w:hAnsi="Microsoft YaHei"/>
-                <w:b w:val="0"/>
-              </w:rPr>
-              <w:t>业绩报表订单业绩口径纳入优惠券抵扣金额；明确退款不回冲业绩</w:t>
-            </w:r>
-          </w:p>
-        </w:tc>
-      </w:tr>
-    </w:tbl>
     <w:p>
       <w:r>
         <w:rPr>
           <w:rFonts w:eastAsia="Microsoft YaHei" w:ascii="Microsoft YaHei" w:hAnsi="Microsoft YaHei"/>
           <w:b/>
         </w:rPr>
-        <w:t>需求点 1：订单付款完成，优惠金额计入业绩报表</w:t>
-      </w:r>
+        <w:t>原型短链</w:t>
+      </w:r>
+      <w:r>
+        <w:rPr>
+          <w:rFonts w:eastAsia="Microsoft YaHei" w:ascii="Microsoft YaHei" w:hAnsi="Microsoft YaHei"/>
+          <w:b w:val="0"/>
+        </w:rPr>
+        <w:t>：</w:t>
+      </w:r>
+      <w:hyperlink r:id="rId38">
+        <w:r>
+          <w:rPr>
+            <w:rStyle w:val="Hyperlink"/>
+          </w:rPr>
+          <w:t>https://ddyuan-spec.github.io/taixiaohu/coupon-direct-send.html</w:t>
+        </w:r>
+      </w:hyperlink>
     </w:p>
-    <w:tbl>
-      <w:tblPr>
-        <w:tblStyle w:val="TableGrid"/>
-        <w:tblW w:type="auto" w:w="0"/>
-        <w:tblLook w:firstColumn="1" w:firstRow="1" w:lastColumn="0" w:lastRow="0" w:noHBand="0" w:noVBand="1" w:val="04A0"/>
-        <w:jc w:val="center"/>
-        <w:tblBorders>
-          <w:top w:val="single" w:sz="4" w:space="0" w:color="999999"/>
-          <w:left w:val="single" w:sz="4" w:space="0" w:color="999999"/>
-          <w:bottom w:val="single" w:sz="4" w:space="0" w:color="999999"/>
-          <w:right w:val="single" w:sz="4" w:space="0" w:color="999999"/>
-          <w:insideH w:val="single" w:sz="4" w:space="0" w:color="999999"/>
-          <w:insideV w:val="single" w:sz="4" w:space="0" w:color="999999"/>
-        </w:tblBorders>
-      </w:tblPr>
-      <w:tblGrid>
-        <w:gridCol w:w="4320"/>
-        <w:gridCol w:w="4320"/>
-      </w:tblGrid>
-      <w:tr>
-        <w:tc>
-          <w:tcPr>
-            <w:tcW w:type="dxa" w:w="4320"/>
-          </w:tcPr>
-          <w:p>
-            <w:r>
-              <w:rPr>
-                <w:b/>
-              </w:rPr>
-            </w:r>
-            <w:r>
-              <w:rPr>
-                <w:rFonts w:eastAsia="Microsoft YaHei" w:ascii="Microsoft YaHei" w:hAnsi="Microsoft YaHei"/>
-                <w:b/>
-              </w:rPr>
-              <w:t>项</w:t>
-            </w:r>
-          </w:p>
-        </w:tc>
-        <w:tc>
-          <w:tcPr>
-            <w:tcW w:type="dxa" w:w="4320"/>
-          </w:tcPr>
-          <w:p>
-            <w:r>
-              <w:rPr>
-                <w:b/>
-              </w:rPr>
-            </w:r>
-            <w:r>
-              <w:rPr>
-                <w:rFonts w:eastAsia="Microsoft YaHei" w:ascii="Microsoft YaHei" w:hAnsi="Microsoft YaHei"/>
-                <w:b/>
-              </w:rPr>
-              <w:t>需求说明</w:t>
-            </w:r>
-          </w:p>
-        </w:tc>
-      </w:tr>
-      <w:tr>
-        <w:tc>
-          <w:tcPr>
-            <w:tcW w:type="dxa" w:w="4320"/>
-          </w:tcPr>
-          <w:p>
-            <w:r/>
-            <w:r>
-              <w:rPr>
-                <w:rFonts w:eastAsia="Microsoft YaHei" w:ascii="Microsoft YaHei" w:hAnsi="Microsoft YaHei"/>
-                <w:b w:val="0"/>
-              </w:rPr>
-              <w:t>触发时点</w:t>
-            </w:r>
-          </w:p>
-        </w:tc>
-        <w:tc>
-          <w:tcPr>
-            <w:tcW w:type="dxa" w:w="4320"/>
-          </w:tcPr>
-          <w:p>
-            <w:r/>
-            <w:r>
-              <w:rPr>
-                <w:rFonts w:eastAsia="Microsoft YaHei" w:ascii="Microsoft YaHei" w:hAnsi="Microsoft YaHei"/>
-                <w:b w:val="0"/>
-              </w:rPr>
-              <w:t>订单状态变为</w:t>
-            </w:r>
-            <w:r>
-              <w:rPr>
-                <w:rFonts w:eastAsia="Microsoft YaHei" w:ascii="Microsoft YaHei" w:hAnsi="Microsoft YaHei"/>
-                <w:b/>
-              </w:rPr>
-              <w:t>「已支付」（付款完成）</w:t>
-            </w:r>
-            <w:r>
-              <w:rPr>
-                <w:rFonts w:eastAsia="Microsoft YaHei" w:ascii="Microsoft YaHei" w:hAnsi="Microsoft YaHei"/>
-                <w:b w:val="0"/>
-              </w:rPr>
-              <w:t>时，业绩报表新增/更新该订单业绩记录</w:t>
-            </w:r>
-          </w:p>
-        </w:tc>
-      </w:tr>
-      <w:tr>
-        <w:tc>
-          <w:tcPr>
-            <w:tcW w:type="dxa" w:w="4320"/>
-          </w:tcPr>
-          <w:p>
-            <w:r/>
-            <w:r>
-              <w:rPr>
-                <w:rFonts w:eastAsia="Microsoft YaHei" w:ascii="Microsoft YaHei" w:hAnsi="Microsoft YaHei"/>
-                <w:b w:val="0"/>
-              </w:rPr>
-              <w:t>优惠金额取值</w:t>
-            </w:r>
-          </w:p>
-        </w:tc>
-        <w:tc>
-          <w:tcPr>
-            <w:tcW w:type="dxa" w:w="4320"/>
-          </w:tcPr>
-          <w:p>
-            <w:r/>
-            <w:r>
-              <w:rPr>
-                <w:rFonts w:eastAsia="Microsoft YaHei" w:ascii="Microsoft YaHei" w:hAnsi="Microsoft YaHei"/>
-                <w:b w:val="0"/>
-              </w:rPr>
-              <w:t>该订单使用的</w:t>
-            </w:r>
-            <w:r>
-              <w:rPr>
-                <w:rFonts w:eastAsia="Microsoft YaHei" w:ascii="Microsoft YaHei" w:hAnsi="Microsoft YaHei"/>
-                <w:b/>
-              </w:rPr>
-              <w:t>全部优惠券抵扣金额之和</w:t>
-            </w:r>
-            <w:r>
-              <w:rPr>
-                <w:rFonts w:eastAsia="Microsoft YaHei" w:ascii="Microsoft YaHei" w:hAnsi="Microsoft YaHei"/>
-                <w:b w:val="0"/>
-              </w:rPr>
-              <w:t>（多券叠加时求和）</w:t>
-            </w:r>
-          </w:p>
-        </w:tc>
-      </w:tr>
-      <w:tr>
-        <w:tc>
-          <w:tcPr>
-            <w:tcW w:type="dxa" w:w="4320"/>
-          </w:tcPr>
-          <w:p>
-            <w:r/>
-            <w:r>
-              <w:rPr>
-                <w:rFonts w:eastAsia="Microsoft YaHei" w:ascii="Microsoft YaHei" w:hAnsi="Microsoft YaHei"/>
-                <w:b w:val="0"/>
-              </w:rPr>
-              <w:t>业绩金额口径</w:t>
-            </w:r>
-          </w:p>
-        </w:tc>
-        <w:tc>
-          <w:tcPr>
-            <w:tcW w:type="dxa" w:w="4320"/>
-          </w:tcPr>
-          <w:p>
-            <w:r/>
-            <w:r>
-              <w:rPr>
-                <w:rFonts w:eastAsia="Microsoft YaHei" w:ascii="Microsoft YaHei" w:hAnsi="Microsoft YaHei"/>
-                <w:b w:val="0"/>
-              </w:rPr>
-              <w:t xml:space="preserve">业绩报表该订单行的业绩金额 = </w:t>
-            </w:r>
-            <w:r>
-              <w:rPr>
-                <w:rFonts w:eastAsia="Microsoft YaHei" w:ascii="Microsoft YaHei" w:hAnsi="Microsoft YaHei"/>
-                <w:b/>
-              </w:rPr>
-              <w:t>订单实付金额 + 优惠金额</w:t>
-            </w:r>
-            <w:r>
-              <w:rPr>
-                <w:rFonts w:eastAsia="Microsoft YaHei" w:ascii="Microsoft YaHei" w:hAnsi="Microsoft YaHei"/>
-                <w:b w:val="0"/>
-              </w:rPr>
-              <w:t>（即按订单应付总额口径，优惠部分计入业绩）；⚠️ 待确认 @干系人（业绩报表是否统一展示「实付金额 / 优惠金额 / 业绩总额」三列，或仅调整总额口径）</w:t>
-            </w:r>
-          </w:p>
-        </w:tc>
-      </w:tr>
-      <w:tr>
-        <w:tc>
-          <w:tcPr>
-            <w:tcW w:type="dxa" w:w="4320"/>
-          </w:tcPr>
-          <w:p>
-            <w:r/>
-            <w:r>
-              <w:rPr>
-                <w:rFonts w:eastAsia="Microsoft YaHei" w:ascii="Microsoft YaHei" w:hAnsi="Microsoft YaHei"/>
-                <w:b w:val="0"/>
-              </w:rPr>
-              <w:t>数据来源</w:t>
-            </w:r>
-          </w:p>
-        </w:tc>
-        <w:tc>
-          <w:tcPr>
-            <w:tcW w:type="dxa" w:w="4320"/>
-          </w:tcPr>
-          <w:p>
-            <w:r/>
-            <w:r>
-              <w:rPr>
-                <w:rFonts w:eastAsia="Microsoft YaHei" w:ascii="Microsoft YaHei" w:hAnsi="Microsoft YaHei"/>
-                <w:b w:val="0"/>
-              </w:rPr>
-              <w:t>优惠金额取自订单关联优惠券的抵扣记录（关联需求 10.4 订单关联优惠券），非实时重算</w:t>
-            </w:r>
-          </w:p>
-        </w:tc>
-      </w:tr>
-    </w:tbl>
     <w:p>
       <w:r>
         <w:rPr>
           <w:rFonts w:eastAsia="Microsoft YaHei" w:ascii="Microsoft YaHei" w:hAnsi="Microsoft YaHei"/>
           <w:b/>
         </w:rPr>
-        <w:t>需求点 2：含优惠券订单退款不影响业绩报表</w:t>
+        <w:t>原型截图</w:t>
+      </w:r>
+      <w:r>
+        <w:rPr>
+          <w:rFonts w:eastAsia="Microsoft YaHei" w:ascii="Microsoft YaHei" w:hAnsi="Microsoft YaHei"/>
+          <w:b w:val="0"/>
+        </w:rPr>
+        <w:t>：</w:t>
       </w:r>
     </w:p>
-    <w:tbl>
-      <w:tblPr>
-        <w:tblStyle w:val="TableGrid"/>
-        <w:tblW w:type="auto" w:w="0"/>
-        <w:tblLook w:firstColumn="1" w:firstRow="1" w:lastColumn="0" w:lastRow="0" w:noHBand="0" w:noVBand="1" w:val="04A0"/>
-        <w:jc w:val="center"/>
-        <w:tblBorders>
-          <w:top w:val="single" w:sz="4" w:space="0" w:color="999999"/>
-          <w:left w:val="single" w:sz="4" w:space="0" w:color="999999"/>
-          <w:bottom w:val="single" w:sz="4" w:space="0" w:color="999999"/>
-          <w:right w:val="single" w:sz="4" w:space="0" w:color="999999"/>
-          <w:insideH w:val="single" w:sz="4" w:space="0" w:color="999999"/>
-          <w:insideV w:val="single" w:sz="4" w:space="0" w:color="999999"/>
-        </w:tblBorders>
-      </w:tblPr>
-      <w:tblGrid>
-        <w:gridCol w:w="4320"/>
-        <w:gridCol w:w="4320"/>
-      </w:tblGrid>
-      <w:tr>
-        <w:tc>
-          <w:tcPr>
-            <w:tcW w:type="dxa" w:w="4320"/>
-          </w:tcPr>
-          <w:p>
-            <w:r>
-              <w:rPr>
-                <w:b/>
-              </w:rPr>
-            </w:r>
-            <w:r>
-              <w:rPr>
-                <w:rFonts w:eastAsia="Microsoft YaHei" w:ascii="Microsoft YaHei" w:hAnsi="Microsoft YaHei"/>
-                <w:b/>
-              </w:rPr>
-              <w:t>项</w:t>
-            </w:r>
-          </w:p>
-        </w:tc>
-        <w:tc>
-          <w:tcPr>
-            <w:tcW w:type="dxa" w:w="4320"/>
-          </w:tcPr>
-          <w:p>
-            <w:r>
-              <w:rPr>
-                <w:b/>
-              </w:rPr>
-            </w:r>
-            <w:r>
-              <w:rPr>
-                <w:rFonts w:eastAsia="Microsoft YaHei" w:ascii="Microsoft YaHei" w:hAnsi="Microsoft YaHei"/>
-                <w:b/>
-              </w:rPr>
-              <w:t>需求说明</w:t>
-            </w:r>
-          </w:p>
-        </w:tc>
-      </w:tr>
-      <w:tr>
-        <w:tc>
-          <w:tcPr>
-            <w:tcW w:type="dxa" w:w="4320"/>
-          </w:tcPr>
-          <w:p>
-            <w:r/>
-            <w:r>
-              <w:rPr>
-                <w:rFonts w:eastAsia="Microsoft YaHei" w:ascii="Microsoft YaHei" w:hAnsi="Microsoft YaHei"/>
-                <w:b w:val="0"/>
-              </w:rPr>
-              <w:t>退款场景</w:t>
-            </w:r>
-          </w:p>
-        </w:tc>
-        <w:tc>
-          <w:tcPr>
-            <w:tcW w:type="dxa" w:w="4320"/>
-          </w:tcPr>
-          <w:p>
-            <w:r/>
-            <w:r>
-              <w:rPr>
-                <w:rFonts w:eastAsia="Microsoft YaHei" w:ascii="Microsoft YaHei" w:hAnsi="Microsoft YaHei"/>
-                <w:b w:val="0"/>
-              </w:rPr>
-              <w:t>订单全额或部分退款（含优惠券抵扣部分）完成后</w:t>
-            </w:r>
-          </w:p>
-        </w:tc>
-      </w:tr>
-      <w:tr>
-        <w:tc>
-          <w:tcPr>
-            <w:tcW w:type="dxa" w:w="4320"/>
-          </w:tcPr>
-          <w:p>
-            <w:r/>
-            <w:r>
-              <w:rPr>
-                <w:rFonts w:eastAsia="Microsoft YaHei" w:ascii="Microsoft YaHei" w:hAnsi="Microsoft YaHei"/>
-                <w:b w:val="0"/>
-              </w:rPr>
-              <w:t>业绩报表处理</w:t>
-            </w:r>
-          </w:p>
-        </w:tc>
-        <w:tc>
-          <w:tcPr>
-            <w:tcW w:type="dxa" w:w="4320"/>
-          </w:tcPr>
-          <w:p>
-            <w:r/>
-            <w:r>
-              <w:rPr>
-                <w:rFonts w:eastAsia="Microsoft YaHei" w:ascii="Microsoft YaHei" w:hAnsi="Microsoft YaHei"/>
-                <w:b/>
-              </w:rPr>
-              <w:t>不回滚、不扣减</w:t>
-            </w:r>
-            <w:r>
-              <w:rPr>
-                <w:rFonts w:eastAsia="Microsoft YaHei" w:ascii="Microsoft YaHei" w:hAnsi="Microsoft YaHei"/>
-                <w:b w:val="0"/>
-              </w:rPr>
-              <w:t>该订单原业绩记录；优惠金额对应业绩保留，不因退款冲减</w:t>
-            </w:r>
-          </w:p>
-        </w:tc>
-      </w:tr>
-      <w:tr>
-        <w:tc>
-          <w:tcPr>
-            <w:tcW w:type="dxa" w:w="4320"/>
-          </w:tcPr>
-          <w:p>
-            <w:r/>
-            <w:r>
-              <w:rPr>
-                <w:rFonts w:eastAsia="Microsoft YaHei" w:ascii="Microsoft YaHei" w:hAnsi="Microsoft YaHei"/>
-                <w:b w:val="0"/>
-              </w:rPr>
-              <w:t>说明</w:t>
-            </w:r>
-          </w:p>
-        </w:tc>
-        <w:tc>
-          <w:tcPr>
-            <w:tcW w:type="dxa" w:w="4320"/>
-          </w:tcPr>
-          <w:p>
-            <w:r/>
-            <w:r>
-              <w:rPr>
-                <w:rFonts w:eastAsia="Microsoft YaHei" w:ascii="Microsoft YaHei" w:hAnsi="Microsoft YaHei"/>
-                <w:b w:val="0"/>
-              </w:rPr>
-              <w:t>优惠券退款仅影响券账户（按既有退券/返还规则），与业绩报表解耦；业绩报表以「付款完成」为唯一记账时点</w:t>
-            </w:r>
-          </w:p>
-        </w:tc>
-      </w:tr>
-    </w:tbl>
     <w:p>
       <w:r>
         <w:rPr>
           <w:rFonts w:eastAsia="Microsoft YaHei" w:ascii="Microsoft YaHei" w:hAnsi="Microsoft YaHei"/>
-          <w:b/>
-        </w:rPr>
-        <w:t>业务规则</w:t>
+          <w:color w:val="DC2626"/>
+        </w:rPr>
+        <w:t>[缺失图片] 会员直接发券原型</w:t>
       </w:r>
     </w:p>
     <w:p>
       <w:pPr>
-        <w:pStyle w:val="ListBullet"/>
+        <w:pStyle w:val="Heading2"/>
       </w:pPr>
       <w:r>
         <w:rPr>
           <w:rFonts w:eastAsia="Microsoft YaHei" w:ascii="Microsoft YaHei" w:hAnsi="Microsoft YaHei"/>
-          <w:b w:val="0"/>
-        </w:rPr>
-        <w:t>记账时点唯一：仅「订单付款完成」触发业绩报表记账，后续状态变更（发货 / 确认收货 / 退款）不再改动该业绩记录。</w:t>
+        </w:rPr>
+        <w:t>10.6 直播观看记录</w:t>
       </w:r>
     </w:p>
     <w:p>
-      <w:pPr>
-        <w:pStyle w:val="ListBullet"/>
-      </w:pPr>
+      <w:r>
+        <w:rPr>
+          <w:rFonts w:eastAsia="Microsoft YaHei" w:ascii="Microsoft YaHei" w:hAnsi="Microsoft YaHei"/>
+          <w:b/>
+        </w:rPr>
+        <w:t>功能说明</w:t>
+      </w:r>
       <w:r>
         <w:rPr>
           <w:rFonts w:eastAsia="Microsoft YaHei" w:ascii="Microsoft YaHei" w:hAnsi="Microsoft YaHei"/>
           <w:b w:val="0"/>
         </w:rPr>
-        <w:t>优惠金额口径：业绩报表中的优惠金额 = 该订单券抵扣总额，与 10.4 订单关联优惠券的抵扣金额一致。</w:t>
+        <w:t>：平台端后台展示用户在直播间的观看时长记录，支持按直播间、用户、时间段筛选。为「时长发券」提供数据依据——运营可查看哪些用户满足「观看满 X 分钟」条件，校验发券名单的准确性。</w:t>
       </w:r>
     </w:p>
     <w:p>
-      <w:pPr>
-        <w:pStyle w:val="ListBullet"/>
-      </w:pPr>
+      <w:r>
+        <w:rPr>
+          <w:rFonts w:eastAsia="Microsoft YaHei" w:ascii="Microsoft YaHei" w:hAnsi="Microsoft YaHei"/>
+          <w:b/>
+        </w:rPr>
+        <w:t>与优惠券体系的关系</w:t>
+      </w:r>
       <w:r>
         <w:rPr>
           <w:rFonts w:eastAsia="Microsoft YaHei" w:ascii="Microsoft YaHei" w:hAnsi="Microsoft YaHei"/>
           <w:b w:val="0"/>
         </w:rPr>
-        <w:t>退款解耦：退款仅处理券账户与资金流，业绩报表保持「付款即记账、退款不冲减」。</w:t>
+        <w:t>：直播观看记录是「时长发券」的前置数据源，发券规则中的「累计观看时长 ≥ X」条件依赖此记录计算；同时，已发券用户的观看记录可辅助验证发券覆盖范围。</w:t>
       </w:r>
     </w:p>
     <w:p>
@@ -27902,66 +26487,47 @@
           <w:rFonts w:eastAsia="Microsoft YaHei" w:ascii="Microsoft YaHei" w:hAnsi="Microsoft YaHei"/>
           <w:b/>
         </w:rPr>
-        <w:t>验收标准</w:t>
-      </w:r>
+        <w:t>原型短链</w:t>
+      </w:r>
+      <w:r>
+        <w:rPr>
+          <w:rFonts w:eastAsia="Microsoft YaHei" w:ascii="Microsoft YaHei" w:hAnsi="Microsoft YaHei"/>
+          <w:b w:val="0"/>
+        </w:rPr>
+        <w:t>：</w:t>
+      </w:r>
+      <w:hyperlink r:id="rId39">
+        <w:r>
+          <w:rPr>
+            <w:rStyle w:val="Hyperlink"/>
+          </w:rPr>
+          <w:t>https://ddyuan-spec.github.io/taixiaohu/coupon-live-viewlog.html</w:t>
+        </w:r>
+      </w:hyperlink>
     </w:p>
     <w:p>
-      <w:pPr>
-        <w:pStyle w:val="ListBullet"/>
-      </w:pPr>
+      <w:r>
+        <w:rPr>
+          <w:rFonts w:eastAsia="Microsoft YaHei" w:ascii="Microsoft YaHei" w:hAnsi="Microsoft YaHei"/>
+          <w:b/>
+        </w:rPr>
+        <w:t>原型截图</w:t>
+      </w:r>
       <w:r>
         <w:rPr>
           <w:rFonts w:eastAsia="Microsoft YaHei" w:ascii="Microsoft YaHei" w:hAnsi="Microsoft YaHei"/>
           <w:b w:val="0"/>
         </w:rPr>
-        <w:t>AC-10.7-1：订单付款完成后，业绩报表出现该订单记录，且「优惠金额」= 该订单使用的券抵扣总额。</w:t>
+        <w:t>：</w:t>
       </w:r>
     </w:p>
     <w:p>
-      <w:pPr>
-        <w:pStyle w:val="ListBullet"/>
-      </w:pPr>
-      <w:r>
-        <w:rPr>
-          <w:rFonts w:eastAsia="Microsoft YaHei" w:ascii="Microsoft YaHei" w:hAnsi="Microsoft YaHei"/>
-          <w:b w:val="0"/>
-        </w:rPr>
-        <w:t>AC-10.7-2：业绩报表该订单业绩金额 = 订单实付金额 + 优惠金额，口径一致、可对账。</w:t>
-      </w:r>
-    </w:p>
-    <w:p>
-      <w:pPr>
-        <w:pStyle w:val="ListBullet"/>
-      </w:pPr>
-      <w:r>
-        <w:rPr>
-          <w:rFonts w:eastAsia="Microsoft YaHei" w:ascii="Microsoft YaHei" w:hAnsi="Microsoft YaHei"/>
-          <w:b w:val="0"/>
-        </w:rPr>
-        <w:t>AC-10.7-3：含优惠券订单发起退款并完成退款后，业绩报表中原记录不变（优惠金额不扣减、不退减）。</w:t>
-      </w:r>
-    </w:p>
-    <w:p>
-      <w:r>
-        <w:rPr>
-          <w:rFonts w:eastAsia="Microsoft YaHei" w:ascii="Microsoft YaHei" w:hAnsi="Microsoft YaHei"/>
-          <w:b w:val="0"/>
-        </w:rPr>
-        <w:t xml:space="preserve">⚠️ </w:t>
-      </w:r>
-      <w:r>
-        <w:rPr>
-          <w:rFonts w:eastAsia="Microsoft YaHei" w:ascii="Microsoft YaHei" w:hAnsi="Microsoft YaHei"/>
-          <w:b/>
-        </w:rPr>
-        <w:t>本节待确认项</w:t>
-      </w:r>
-      <w:r>
-        <w:rPr>
-          <w:rFonts w:eastAsia="Microsoft YaHei" w:ascii="Microsoft YaHei" w:hAnsi="Microsoft YaHei"/>
-          <w:b w:val="0"/>
-        </w:rPr>
-        <w:t>：① 业绩报表在平台端后台的归属菜单路径（@干系人）；② 业绩报表列展示方式（实付 / 优惠 / 总额三列 vs 仅总额口径调整，@干系人）。</w:t>
+      <w:r>
+        <w:rPr>
+          <w:rFonts w:eastAsia="Microsoft YaHei" w:ascii="Microsoft YaHei" w:hAnsi="Microsoft YaHei"/>
+          <w:color w:val="DC2626"/>
+        </w:rPr>
+        <w:t>[缺失图片] 直播观看记录原型</w:t>
       </w:r>
     </w:p>
     <w:p>

</xml_diff>

<commit_message>
update coupon-prd.docx: sync PRD with coupon 编辑 removed (keep 发券活动 编辑)
</commit_message>
<xml_diff>
--- a/coupon-prd.docx
+++ b/coupon-prd.docx
@@ -2617,7 +2617,7 @@
                 <w:rFonts w:eastAsia="Microsoft YaHei" w:ascii="Microsoft YaHei" w:hAnsi="Microsoft YaHei"/>
                 <w:b w:val="0"/>
               </w:rPr>
-              <w:t>删除」」（替换原「编辑」按钮，已下架行无编辑需求）</w:t>
+              <w:t>删除」」（仅已下架且使用状态≠进行中的券可删除）</w:t>
             </w:r>
           </w:p>
         </w:tc>
@@ -2717,105 +2717,6 @@
                 <w:b w:val="0"/>
               </w:rPr>
               <w:t>—</w:t>
-            </w:r>
-          </w:p>
-        </w:tc>
-      </w:tr>
-      <w:tr>
-        <w:tc>
-          <w:tcPr>
-            <w:tcW w:type="dxa" w:w="1440"/>
-          </w:tcPr>
-          <w:p>
-            <w:r/>
-            <w:r>
-              <w:rPr>
-                <w:rFonts w:eastAsia="Microsoft YaHei" w:ascii="Microsoft YaHei" w:hAnsi="Microsoft YaHei"/>
-                <w:b w:val="0"/>
-              </w:rPr>
-              <w:t>启用</w:t>
-            </w:r>
-          </w:p>
-        </w:tc>
-        <w:tc>
-          <w:tcPr>
-            <w:tcW w:type="dxa" w:w="1440"/>
-          </w:tcPr>
-          <w:p>
-            <w:r/>
-            <w:r>
-              <w:rPr>
-                <w:rFonts w:eastAsia="Microsoft YaHei" w:ascii="Microsoft YaHei" w:hAnsi="Microsoft YaHei"/>
-                <w:b w:val="0"/>
-              </w:rPr>
-              <w:t>编辑</w:t>
-            </w:r>
-          </w:p>
-        </w:tc>
-        <w:tc>
-          <w:tcPr>
-            <w:tcW w:type="dxa" w:w="1440"/>
-          </w:tcPr>
-          <w:p>
-            <w:r/>
-            <w:r>
-              <w:rPr>
-                <w:rFonts w:eastAsia="Microsoft YaHei" w:ascii="Microsoft YaHei" w:hAnsi="Microsoft YaHei"/>
-                <w:b w:val="0"/>
-              </w:rPr>
-              <w:t>平台端</w:t>
-            </w:r>
-          </w:p>
-        </w:tc>
-        <w:tc>
-          <w:tcPr>
-            <w:tcW w:type="dxa" w:w="1440"/>
-          </w:tcPr>
-          <w:p>
-            <w:r/>
-            <w:r>
-              <w:rPr>
-                <w:rFonts w:eastAsia="Microsoft YaHei" w:ascii="Microsoft YaHei" w:hAnsi="Microsoft YaHei"/>
-                <w:b w:val="0"/>
-              </w:rPr>
-              <w:t>仅编辑本端创建的券</w:t>
-            </w:r>
-          </w:p>
-        </w:tc>
-        <w:tc>
-          <w:tcPr>
-            <w:tcW w:type="dxa" w:w="1440"/>
-          </w:tcPr>
-          <w:p>
-            <w:r/>
-            <w:r>
-              <w:rPr>
-                <w:rFonts w:eastAsia="Microsoft YaHei" w:ascii="Microsoft YaHei" w:hAnsi="Microsoft YaHei"/>
-                <w:b w:val="0"/>
-              </w:rPr>
-              <w:t>启用（不变）</w:t>
-            </w:r>
-          </w:p>
-        </w:tc>
-        <w:tc>
-          <w:tcPr>
-            <w:tcW w:type="dxa" w:w="1440"/>
-          </w:tcPr>
-          <w:p>
-            <w:r/>
-            <w:r>
-              <w:rPr>
-                <w:rFonts w:eastAsia="Microsoft YaHei" w:ascii="Microsoft YaHei" w:hAnsi="Microsoft YaHei"/>
-                <w:b w:val="0"/>
-              </w:rPr>
-              <w:t>列表操作列「</w:t>
-            </w:r>
-            <w:r>
-              <w:rPr>
-                <w:rFonts w:eastAsia="Microsoft YaHei" w:ascii="Microsoft YaHei" w:hAnsi="Microsoft YaHei"/>
-                <w:b w:val="0"/>
-              </w:rPr>
-              <w:t>编辑」」</w:t>
             </w:r>
           </w:p>
         </w:tc>
@@ -7940,7 +7841,7 @@
         <w:rPr>
           <w:rFonts w:eastAsia="Microsoft YaHei" w:ascii="Microsoft YaHei" w:hAnsi="Microsoft YaHei"/>
         </w:rPr>
-        <w:t xml:space="preserve">4.1.3 D2 新建/编辑优惠券 </w:t>
+        <w:t xml:space="preserve">4.1.3 D2 新建优惠券 </w:t>
       </w:r>
       <w:r>
         <w:rPr>
@@ -7995,7 +7896,7 @@
           <w:color w:val="6B7280"/>
           <w:sz w:val="18"/>
         </w:rPr>
-        <w:t xml:space="preserve">  D2新建编辑优惠券</w:t>
+        <w:t xml:space="preserve">  D2新建优惠券</w:t>
       </w:r>
     </w:p>
     <w:p>
@@ -9446,7 +9347,7 @@
                 <w:rFonts w:eastAsia="Microsoft YaHei" w:ascii="Microsoft YaHei" w:hAnsi="Microsoft YaHei"/>
                 <w:b/>
               </w:rPr>
-              <w:t>仅新建可录入，编辑态只读/禁用（不支持修改底价，见 §4.1.3.4）</w:t>
+              <w:t>仅新建可录入，不支持后续修改</w:t>
             </w:r>
           </w:p>
         </w:tc>
@@ -9894,7 +9795,7 @@
                 <w:rFonts w:eastAsia="Microsoft YaHei" w:ascii="Microsoft YaHei" w:hAnsi="Microsoft YaHei"/>
                 <w:b w:val="0"/>
               </w:rPr>
-              <w:t>放弃当前编辑，返回 P1 列表</w:t>
+              <w:t>放弃当前填写，返回 P1 列表</w:t>
             </w:r>
           </w:p>
         </w:tc>
@@ -9939,7 +9840,7 @@
                 <w:rFonts w:eastAsia="Microsoft YaHei" w:ascii="Microsoft YaHei" w:hAnsi="Microsoft YaHei"/>
                 <w:b w:val="0"/>
               </w:rPr>
-              <w:t>点击 → 若有已填内容 → 弹确认"确定放弃？编辑内容不会保存" → 确认返回 / 取消留页</w:t>
+              <w:t>点击 → 若有已填内容 → 弹确认"确定放弃？填写内容不会保存" → 确认返回 / 取消留页</w:t>
             </w:r>
           </w:p>
         </w:tc>
@@ -10037,372 +9938,6 @@
                 <w:b w:val="0"/>
               </w:rPr>
               <w:t>③ 失败 → 接口报错文案 Toast 展示</w:t>
-            </w:r>
-          </w:p>
-        </w:tc>
-      </w:tr>
-      <w:tr>
-        <w:tc>
-          <w:tcPr>
-            <w:tcW w:type="dxa" w:w="1728"/>
-          </w:tcPr>
-          <w:p>
-            <w:r/>
-            <w:r>
-              <w:rPr>
-                <w:rFonts w:eastAsia="Microsoft YaHei" w:ascii="Microsoft YaHei" w:hAnsi="Microsoft YaHei"/>
-                <w:b w:val="0"/>
-              </w:rPr>
-              <w:t>提交（编辑）</w:t>
-            </w:r>
-          </w:p>
-        </w:tc>
-        <w:tc>
-          <w:tcPr>
-            <w:tcW w:type="dxa" w:w="1728"/>
-          </w:tcPr>
-          <w:p>
-            <w:r/>
-            <w:r>
-              <w:rPr>
-                <w:rFonts w:eastAsia="Microsoft YaHei" w:ascii="Microsoft YaHei" w:hAnsi="Microsoft YaHei"/>
-                <w:b w:val="0"/>
-              </w:rPr>
-              <w:t>更新已有券模板</w:t>
-            </w:r>
-          </w:p>
-        </w:tc>
-        <w:tc>
-          <w:tcPr>
-            <w:tcW w:type="dxa" w:w="1728"/>
-          </w:tcPr>
-          <w:p>
-            <w:r/>
-            <w:r>
-              <w:rPr>
-                <w:rFonts w:eastAsia="Microsoft YaHei" w:ascii="Microsoft YaHei" w:hAnsi="Microsoft YaHei"/>
-                <w:b w:val="0"/>
-              </w:rPr>
-              <w:t>直播运营</w:t>
-            </w:r>
-          </w:p>
-        </w:tc>
-        <w:tc>
-          <w:tcPr>
-            <w:tcW w:type="dxa" w:w="1728"/>
-          </w:tcPr>
-          <w:p>
-            <w:r/>
-            <w:r>
-              <w:rPr>
-                <w:rFonts w:eastAsia="Microsoft YaHei" w:ascii="Microsoft YaHei" w:hAnsi="Microsoft YaHei"/>
-                <w:b w:val="0"/>
-              </w:rPr>
-              <w:t>上架状态=启用</w:t>
-            </w:r>
-          </w:p>
-        </w:tc>
-        <w:tc>
-          <w:tcPr>
-            <w:tcW w:type="dxa" w:w="1728"/>
-          </w:tcPr>
-          <w:p>
-            <w:r/>
-            <w:r>
-              <w:rPr>
-                <w:rFonts w:eastAsia="Microsoft YaHei" w:ascii="Microsoft YaHei" w:hAnsi="Microsoft YaHei"/>
-                <w:b w:val="0"/>
-              </w:rPr>
-              <w:t>① 同新建校验</w:t>
-            </w:r>
-            <w:r>
-              <w:br/>
-            </w:r>
-            <w:r>
-              <w:rPr>
-                <w:rFonts w:eastAsia="Microsoft YaHei" w:ascii="Microsoft YaHei" w:hAnsi="Microsoft YaHei"/>
-                <w:b w:val="0"/>
-              </w:rPr>
-              <w:t>② 调 PUT /coupon/template/{id} → 成功 Toast"更新成功"</w:t>
-            </w:r>
-            <w:r>
-              <w:br/>
-            </w:r>
-            <w:r>
-              <w:rPr>
-                <w:rFonts w:eastAsia="Microsoft YaHei" w:ascii="Microsoft YaHei" w:hAnsi="Microsoft YaHei"/>
-                <w:b w:val="0"/>
-              </w:rPr>
-              <w:t>③ ⚠️ 进行中状态的券不允许编辑（按钮禁用或隐藏）</w:t>
-            </w:r>
-          </w:p>
-        </w:tc>
-      </w:tr>
-    </w:tbl>
-    <w:p>
-      <w:pPr>
-        <w:pStyle w:val="Heading4"/>
-      </w:pPr>
-      <w:r>
-        <w:rPr>
-          <w:rFonts w:eastAsia="Microsoft YaHei" w:ascii="Microsoft YaHei" w:hAnsi="Microsoft YaHei"/>
-        </w:rPr>
-        <w:t>4.1.3.0 编辑态字段可用性（新增/编辑校验对照）</w:t>
-      </w:r>
-    </w:p>
-    <w:p>
-      <w:r>
-        <w:rPr>
-          <w:rFonts w:eastAsia="Microsoft YaHei" w:ascii="Microsoft YaHei" w:hAnsi="Microsoft YaHei"/>
-          <w:b w:val="0"/>
-        </w:rPr>
-        <w:t>编辑态整体沿用新建校验（提交（编辑）按钮「同新建校验」），并补充以下字段级可用性差异，避免「编辑=新建」隐含不清：</w:t>
-      </w:r>
-    </w:p>
-    <w:tbl>
-      <w:tblPr>
-        <w:tblStyle w:val="TableGrid"/>
-        <w:tblW w:type="auto" w:w="0"/>
-        <w:tblLook w:firstColumn="1" w:firstRow="1" w:lastColumn="0" w:lastRow="0" w:noHBand="0" w:noVBand="1" w:val="04A0"/>
-        <w:jc w:val="center"/>
-        <w:tblBorders>
-          <w:top w:val="single" w:sz="4" w:space="0" w:color="999999"/>
-          <w:left w:val="single" w:sz="4" w:space="0" w:color="999999"/>
-          <w:bottom w:val="single" w:sz="4" w:space="0" w:color="999999"/>
-          <w:right w:val="single" w:sz="4" w:space="0" w:color="999999"/>
-          <w:insideH w:val="single" w:sz="4" w:space="0" w:color="999999"/>
-          <w:insideV w:val="single" w:sz="4" w:space="0" w:color="999999"/>
-        </w:tblBorders>
-      </w:tblPr>
-      <w:tblGrid>
-        <w:gridCol w:w="2880"/>
-        <w:gridCol w:w="2880"/>
-        <w:gridCol w:w="2880"/>
-      </w:tblGrid>
-      <w:tr>
-        <w:tc>
-          <w:tcPr>
-            <w:tcW w:type="dxa" w:w="2880"/>
-          </w:tcPr>
-          <w:p>
-            <w:r>
-              <w:rPr>
-                <w:b/>
-              </w:rPr>
-            </w:r>
-            <w:r>
-              <w:rPr>
-                <w:rFonts w:eastAsia="Microsoft YaHei" w:ascii="Microsoft YaHei" w:hAnsi="Microsoft YaHei"/>
-                <w:b/>
-              </w:rPr>
-              <w:t>字段</w:t>
-            </w:r>
-          </w:p>
-        </w:tc>
-        <w:tc>
-          <w:tcPr>
-            <w:tcW w:type="dxa" w:w="2880"/>
-          </w:tcPr>
-          <w:p>
-            <w:r>
-              <w:rPr>
-                <w:b/>
-              </w:rPr>
-            </w:r>
-            <w:r>
-              <w:rPr>
-                <w:rFonts w:eastAsia="Microsoft YaHei" w:ascii="Microsoft YaHei" w:hAnsi="Microsoft YaHei"/>
-                <w:b/>
-              </w:rPr>
-              <w:t>编辑态可用性</w:t>
-            </w:r>
-          </w:p>
-        </w:tc>
-        <w:tc>
-          <w:tcPr>
-            <w:tcW w:type="dxa" w:w="2880"/>
-          </w:tcPr>
-          <w:p>
-            <w:r>
-              <w:rPr>
-                <w:b/>
-              </w:rPr>
-            </w:r>
-            <w:r>
-              <w:rPr>
-                <w:rFonts w:eastAsia="Microsoft YaHei" w:ascii="Microsoft YaHei" w:hAnsi="Microsoft YaHei"/>
-                <w:b/>
-              </w:rPr>
-              <w:t>校验</w:t>
-            </w:r>
-          </w:p>
-        </w:tc>
-      </w:tr>
-      <w:tr>
-        <w:tc>
-          <w:tcPr>
-            <w:tcW w:type="dxa" w:w="2880"/>
-          </w:tcPr>
-          <w:p>
-            <w:r/>
-            <w:r>
-              <w:rPr>
-                <w:rFonts w:eastAsia="Microsoft YaHei" w:ascii="Microsoft YaHei" w:hAnsi="Microsoft YaHei"/>
-                <w:b w:val="0"/>
-              </w:rPr>
-              <w:t>优惠券类型</w:t>
-            </w:r>
-          </w:p>
-        </w:tc>
-        <w:tc>
-          <w:tcPr>
-            <w:tcW w:type="dxa" w:w="2880"/>
-          </w:tcPr>
-          <w:p>
-            <w:r/>
-            <w:r>
-              <w:rPr>
-                <w:rFonts w:eastAsia="Microsoft YaHei" w:ascii="Microsoft YaHei" w:hAnsi="Microsoft YaHei"/>
-                <w:b w:val="0"/>
-              </w:rPr>
-              <w:t>只读（固定「满减券」，新建即锁定，不可改）</w:t>
-            </w:r>
-          </w:p>
-        </w:tc>
-        <w:tc>
-          <w:tcPr>
-            <w:tcW w:type="dxa" w:w="2880"/>
-          </w:tcPr>
-          <w:p>
-            <w:r/>
-            <w:r>
-              <w:rPr>
-                <w:rFonts w:eastAsia="Microsoft YaHei" w:ascii="Microsoft YaHei" w:hAnsi="Microsoft YaHei"/>
-                <w:b w:val="0"/>
-              </w:rPr>
-              <w:t>无</w:t>
-            </w:r>
-          </w:p>
-        </w:tc>
-      </w:tr>
-      <w:tr>
-        <w:tc>
-          <w:tcPr>
-            <w:tcW w:type="dxa" w:w="2880"/>
-          </w:tcPr>
-          <w:p>
-            <w:r/>
-            <w:r>
-              <w:rPr>
-                <w:rFonts w:eastAsia="Microsoft YaHei" w:ascii="Microsoft YaHei" w:hAnsi="Microsoft YaHei"/>
-                <w:b w:val="0"/>
-              </w:rPr>
-              <w:t>券配置名称 / 有效时间类型 / 固定时间段 / 店铺 / 优惠券规则(X,Y) / 发行量 / 每人领取 / 可共用优惠 / 阶梯优惠券 / 商品选择 / 券可使用端口 / 券规则说明</w:t>
-            </w:r>
-          </w:p>
-        </w:tc>
-        <w:tc>
-          <w:tcPr>
-            <w:tcW w:type="dxa" w:w="2880"/>
-          </w:tcPr>
-          <w:p>
-            <w:r/>
-            <w:r>
-              <w:rPr>
-                <w:rFonts w:eastAsia="Microsoft YaHei" w:ascii="Microsoft YaHei" w:hAnsi="Microsoft YaHei"/>
-                <w:b w:val="0"/>
-              </w:rPr>
-              <w:t>可编辑</w:t>
-            </w:r>
-          </w:p>
-        </w:tc>
-        <w:tc>
-          <w:tcPr>
-            <w:tcW w:type="dxa" w:w="2880"/>
-          </w:tcPr>
-          <w:p>
-            <w:r/>
-            <w:r>
-              <w:rPr>
-                <w:rFonts w:eastAsia="Microsoft YaHei" w:ascii="Microsoft YaHei" w:hAnsi="Microsoft YaHei"/>
-                <w:b w:val="0"/>
-              </w:rPr>
-              <w:t>同新建校验规则（见本页 D2 表单字段表「校验规则」列）；</w:t>
-            </w:r>
-            <w:r>
-              <w:rPr>
-                <w:rFonts w:eastAsia="Microsoft YaHei" w:ascii="Microsoft YaHei" w:hAnsi="Microsoft YaHei"/>
-                <w:b/>
-              </w:rPr>
-              <w:t>商品底价除外</w:t>
-            </w:r>
-            <w:r>
-              <w:rPr>
-                <w:rFonts w:eastAsia="Microsoft YaHei" w:ascii="Microsoft YaHei" w:hAnsi="Microsoft YaHei"/>
-                <w:b w:val="0"/>
-              </w:rPr>
-              <w:t>——编辑态只读/禁用，不支持修改（见 §4.1.3.4）</w:t>
-            </w:r>
-          </w:p>
-        </w:tc>
-      </w:tr>
-      <w:tr>
-        <w:tc>
-          <w:tcPr>
-            <w:tcW w:type="dxa" w:w="2880"/>
-          </w:tcPr>
-          <w:p>
-            <w:r/>
-            <w:r>
-              <w:rPr>
-                <w:rFonts w:eastAsia="Microsoft YaHei" w:ascii="Microsoft YaHei" w:hAnsi="Microsoft YaHei"/>
-                <w:b w:val="0"/>
-              </w:rPr>
-              <w:t>整券前置</w:t>
-            </w:r>
-          </w:p>
-        </w:tc>
-        <w:tc>
-          <w:tcPr>
-            <w:tcW w:type="dxa" w:w="2880"/>
-          </w:tcPr>
-          <w:p>
-            <w:r/>
-            <w:r>
-              <w:rPr>
-                <w:rFonts w:eastAsia="Microsoft YaHei" w:ascii="Microsoft YaHei" w:hAnsi="Microsoft YaHei"/>
-                <w:b w:val="0"/>
-              </w:rPr>
-              <w:t>上架状态=启用 可编辑；</w:t>
-            </w:r>
-            <w:r>
-              <w:rPr>
-                <w:rFonts w:eastAsia="Microsoft YaHei" w:ascii="Microsoft YaHei" w:hAnsi="Microsoft YaHei"/>
-                <w:b/>
-              </w:rPr>
-              <w:t>进行中状态整体禁止编辑</w:t>
-            </w:r>
-            <w:r>
-              <w:rPr>
-                <w:rFonts w:eastAsia="Microsoft YaHei" w:ascii="Microsoft YaHei" w:hAnsi="Microsoft YaHei"/>
-                <w:b w:val="0"/>
-              </w:rPr>
-              <w:t>（编辑入口禁用/隐藏，见提交（编辑）按钮约束）</w:t>
-            </w:r>
-          </w:p>
-        </w:tc>
-        <w:tc>
-          <w:tcPr>
-            <w:tcW w:type="dxa" w:w="2880"/>
-          </w:tcPr>
-          <w:p>
-            <w:r/>
-            <w:r>
-              <w:rPr>
-                <w:rFonts w:eastAsia="Microsoft YaHei" w:ascii="Microsoft YaHei" w:hAnsi="Microsoft YaHei"/>
-                <w:b w:val="0"/>
-              </w:rPr>
-              <w:t>—</w:t>
             </w:r>
           </w:p>
         </w:tc>
@@ -10596,26 +10131,7 @@
           <w:rFonts w:eastAsia="Microsoft YaHei" w:ascii="Microsoft YaHei" w:hAnsi="Microsoft YaHei"/>
           <w:b w:val="0"/>
         </w:rPr>
-        <w:t>：提交成功 → Toast「创建成功」并跳转 P1 列表（新建）/「更新成功」并停留（编辑）；接口报错 → Toast 展示后端错误文案；取消且有已填内容 → 二次确认「确定放弃？编辑内容不会保存」。</w:t>
-      </w:r>
-    </w:p>
-    <w:p>
-      <w:pPr>
-        <w:pStyle w:val="ListBullet"/>
-      </w:pPr>
-      <w:r>
-        <w:rPr>
-          <w:rFonts w:eastAsia="Microsoft YaHei" w:ascii="Microsoft YaHei" w:hAnsi="Microsoft YaHei"/>
-          <w:b/>
-        </w:rPr>
-        <w:t>按钮状态切换逻辑</w:t>
-      </w:r>
-      <w:r>
-        <w:rPr>
-          <w:rFonts w:eastAsia="Microsoft YaHei" w:ascii="Microsoft YaHei" w:hAnsi="Microsoft YaHei"/>
-          <w:b w:val="0"/>
-        </w:rPr>
-        <w:t>：提交（编辑）按钮仅在上架状态=启用 可点；状态=进行中 → 按钮禁用（进行中券不允许编辑，避免影响已发放用户）。</w:t>
+        <w:t>：提交成功 → Toast「创建成功」并跳转 P1 列表；接口报错 → Toast 展示后端错误文案；取消且有已填内容 → 二次确认「确定放弃？填写内容不会保存」。</w:t>
       </w:r>
     </w:p>
     <w:p>
@@ -12265,39 +11781,6 @@
           <w:b w:val="0"/>
         </w:rPr>
         <w:t>，总减免仍受订单可用商品金额封顶约束。</w:t>
-      </w:r>
-    </w:p>
-    <w:p>
-      <w:pPr>
-        <w:pStyle w:val="ListBullet"/>
-      </w:pPr>
-      <w:r>
-        <w:rPr>
-          <w:rFonts w:eastAsia="Microsoft YaHei" w:ascii="Microsoft YaHei" w:hAnsi="Microsoft YaHei"/>
-          <w:b/>
-        </w:rPr>
-        <w:t>编辑限制</w:t>
-      </w:r>
-      <w:r>
-        <w:rPr>
-          <w:rFonts w:eastAsia="Microsoft YaHei" w:ascii="Microsoft YaHei" w:hAnsi="Microsoft YaHei"/>
-          <w:b w:val="0"/>
-        </w:rPr>
-        <w:t>：券模板已有发放记录（已领取 &gt; 0）时，</w:t>
-      </w:r>
-      <w:r>
-        <w:rPr>
-          <w:rFonts w:eastAsia="Microsoft YaHei" w:ascii="Microsoft YaHei" w:hAnsi="Microsoft YaHei"/>
-          <w:b/>
-        </w:rPr>
-        <w:t>不允许</w:t>
-      </w:r>
-      <w:r>
-        <w:rPr>
-          <w:rFonts w:eastAsia="Microsoft YaHei" w:ascii="Microsoft YaHei" w:hAnsi="Microsoft YaHei"/>
-          <w:b w:val="0"/>
-        </w:rPr>
-        <w:t>修改「阶梯优惠券」开关与 X/Y 数值（避免同一券模板下已发放券的优惠力度不一致）；按钮禁用并提示「该券已有发放记录，规则不可修改」。</w:t>
       </w:r>
     </w:p>
     <w:p>

</xml_diff>

<commit_message>
update coupon-prd.docx: sync PRD (D1 下架 button removed)
</commit_message>
<xml_diff>
--- a/coupon-prd.docx
+++ b/coupon-prd.docx
@@ -2470,7 +2470,7 @@
                 <w:rFonts w:eastAsia="Microsoft YaHei" w:ascii="Microsoft YaHei" w:hAnsi="Microsoft YaHei"/>
                 <w:b w:val="0"/>
               </w:rPr>
-              <w:t>」→ 弹窗（标题"下架优惠券"，文本框 placeholder="请输入下架原因（必填，≤200字）"，取消/确定按钮）；D1 券详情页「下架」按钮同逻辑</w:t>
+              <w:t>」→ 弹窗（标题"下架优惠券"，文本框 placeholder="请输入下架原因（必填，≤200字）"，取消/确定按钮）</w:t>
             </w:r>
           </w:p>
         </w:tc>
@@ -6507,7 +6507,7 @@
           <w:rFonts w:eastAsia="Microsoft YaHei" w:ascii="Microsoft YaHei" w:hAnsi="Microsoft YaHei"/>
           <w:b w:val="0"/>
         </w:rPr>
-        <w:t>⚠️ 沿用既有设计：启用态券只能「下架」不能直接删除；下架后变为「删除」入口。与 D1 券详情页「下架」按钮逻辑一致。「增加发行量」入口置于本列表操作列（不在 D1 券详情页），便于运营在列表中快速追加单个券的发行量。</w:t>
+        <w:t>⚠️ 沿用既有设计：启用态券只能「下架」不能直接删除；下架后变为「删除」入口。下架入口仅置于 P1 列表操作列（不在 D1 券详情页），便于运营在列表中统一管理券生命周期。</w:t>
       </w:r>
       <w:r>
         <w:rPr>

</xml_diff>

<commit_message>
update coupon-prd.docx: sync PRD (券模板 编辑 removed, keep 发券活动 编辑)
</commit_message>
<xml_diff>
--- a/coupon-prd.docx
+++ b/coupon-prd.docx
@@ -4858,7 +4858,7 @@
                 <w:rFonts w:eastAsia="Microsoft YaHei" w:ascii="Microsoft YaHei" w:hAnsi="Microsoft YaHei"/>
                 <w:b w:val="0"/>
               </w:rPr>
-              <w:t>券模板配置（新建/编辑/下架/删除）</w:t>
+              <w:t>券模板配置（新建/下架/删除）</w:t>
             </w:r>
           </w:p>
         </w:tc>
@@ -12122,53 +12122,6 @@
           <w:b w:val="0"/>
         </w:rPr>
         <w:t>。</w:t>
-      </w:r>
-    </w:p>
-    <w:p>
-      <w:pPr>
-        <w:pStyle w:val="ListBullet"/>
-      </w:pPr>
-      <w:r>
-        <w:rPr>
-          <w:rFonts w:eastAsia="Microsoft YaHei" w:ascii="Microsoft YaHei" w:hAnsi="Microsoft YaHei"/>
-          <w:b/>
-        </w:rPr>
-        <w:t>编辑态</w:t>
-      </w:r>
-      <w:r>
-        <w:rPr>
-          <w:rFonts w:eastAsia="Microsoft YaHei" w:ascii="Microsoft YaHei" w:hAnsi="Microsoft YaHei"/>
-          <w:b w:val="0"/>
-        </w:rPr>
-        <w:t>：</w:t>
-      </w:r>
-      <w:r>
-        <w:rPr>
-          <w:rFonts w:eastAsia="Microsoft YaHei" w:ascii="Microsoft YaHei" w:hAnsi="Microsoft YaHei"/>
-          <w:b/>
-        </w:rPr>
-        <w:t>底价不支持修改</w:t>
-      </w:r>
-      <w:r>
-        <w:rPr>
-          <w:rFonts w:eastAsia="Microsoft YaHei" w:ascii="Microsoft YaHei" w:hAnsi="Microsoft YaHei"/>
-          <w:b w:val="0"/>
-        </w:rPr>
-        <w:t>（用户裁定）。编辑券模板时底价字段</w:t>
-      </w:r>
-      <w:r>
-        <w:rPr>
-          <w:rFonts w:eastAsia="Microsoft YaHei" w:ascii="Microsoft YaHei" w:hAnsi="Microsoft YaHei"/>
-          <w:b/>
-        </w:rPr>
-        <w:t>只读/禁用</w:t>
-      </w:r>
-      <w:r>
-        <w:rPr>
-          <w:rFonts w:eastAsia="Microsoft YaHei" w:ascii="Microsoft YaHei" w:hAnsi="Microsoft YaHei"/>
-          <w:b w:val="0"/>
-        </w:rPr>
-        <w:t>（灰显），仅可在新建时录入一次；已发放与未发放的券模板均不可改底价。故不存在「已发放券改底价影响 C 端结算」问题。</w:t>
       </w:r>
     </w:p>
     <w:p>

</xml_diff>

<commit_message>
update coupon-prd.docx: sync PRD (阶梯券/底价 编辑限制 removed, 不允许编辑券)
</commit_message>
<xml_diff>
--- a/coupon-prd.docx
+++ b/coupon-prd.docx
@@ -4210,7 +4210,7 @@
           <w:rFonts w:eastAsia="Microsoft YaHei" w:ascii="Microsoft YaHei" w:hAnsi="Microsoft YaHei"/>
           <w:b w:val="0"/>
         </w:rPr>
-        <w:t>，后台不提供券类型下拉选择，新建券页面该字段固定展示为「满减券」（只读 Tag，不可改）。满折券 / 无门槛折扣券 / 无门槛抵现券等其他券形式</w:t>
+        <w:t>，后台不提供券类型下拉选择，新建券页面该字段固定展示为「满减券」（只读 Tag）。满折券 / 无门槛折扣券 / 无门槛抵现券等其他券形式</w:t>
       </w:r>
       <w:r>
         <w:rPr>
@@ -8397,7 +8397,7 @@
                 <w:rFonts w:eastAsia="Microsoft YaHei" w:ascii="Microsoft YaHei" w:hAnsi="Microsoft YaHei"/>
                 <w:b w:val="0"/>
               </w:rPr>
-              <w:t>固定展示「满减券」，不可选择、不可修改</w:t>
+              <w:t>固定展示「满减券」，不可选择</w:t>
             </w:r>
           </w:p>
         </w:tc>
@@ -9274,14 +9274,7 @@
                 <w:rFonts w:eastAsia="Microsoft YaHei" w:ascii="Microsoft YaHei" w:hAnsi="Microsoft YaHei"/>
                 <w:b w:val="0"/>
               </w:rPr>
-              <w:t>（以原型为准，非商品域只读）；存《券模板表》适用商品的 floor_price 字段；C 端用券结算时按本值做「不击穿底价」保护（详见 §4.1.3.4 / §4.3.6）；</w:t>
-            </w:r>
-            <w:r>
-              <w:rPr>
-                <w:rFonts w:eastAsia="Microsoft YaHei" w:ascii="Microsoft YaHei" w:hAnsi="Microsoft YaHei"/>
-                <w:b/>
-              </w:rPr>
-              <w:t>仅新建可录入，不支持后续修改</w:t>
+              <w:t>（以原型为准，非商品域只读）；存《券模板表》适用商品的 floor_price 字段；C 端用券结算时按本值做「不击穿底价」保护（详见 §4.1.3.4 / §4.3.6）</w:t>
             </w:r>
           </w:p>
         </w:tc>

</xml_diff>

<commit_message>
update coupon-prd.docx: sync PRD (4.3.6.7 multi-coupon stacking rule added)
</commit_message>
<xml_diff>
--- a/coupon-prd.docx
+++ b/coupon-prd.docx
@@ -22224,7 +22224,7 @@
                 <w:rFonts w:eastAsia="Microsoft YaHei" w:ascii="Microsoft YaHei" w:hAnsi="Microsoft YaHei"/>
                 <w:b w:val="0"/>
               </w:rPr>
-              <w:t>不满足门槛/适用范围/</w:t>
+              <w:t>适用范围/</w:t>
             </w:r>
             <w:r>
               <w:rPr>
@@ -22238,7 +22238,21 @@
                 <w:rFonts w:eastAsia="Microsoft YaHei" w:ascii="Microsoft YaHei" w:hAnsi="Microsoft YaHei"/>
                 <w:b w:val="0"/>
               </w:rPr>
-              <w:t>时整条置灰 + 红字原因</w:t>
+              <w:t>时整条置灰 + 红字原因；</w:t>
+            </w:r>
+            <w:r>
+              <w:rPr>
+                <w:rFonts w:eastAsia="Microsoft YaHei" w:ascii="Microsoft YaHei" w:hAnsi="Microsoft YaHei"/>
+                <w:b/>
+              </w:rPr>
+              <w:t>多张叠加场景中「剩余实付 &lt; 门槛 X」不置灰、仍可选用</w:t>
+            </w:r>
+            <w:r>
+              <w:rPr>
+                <w:rFonts w:eastAsia="Microsoft YaHei" w:ascii="Microsoft YaHei" w:hAnsi="Microsoft YaHei"/>
+                <w:b w:val="0"/>
+              </w:rPr>
+              <w:t>（见 §4.3.6.7），仅标注「未满 ¥X·本次不抵扣」</w:t>
             </w:r>
           </w:p>
         </w:tc>
@@ -22253,7 +22267,7 @@
                 <w:rFonts w:eastAsia="Microsoft YaHei" w:ascii="Microsoft YaHei" w:hAnsi="Microsoft YaHei"/>
                 <w:b w:val="0"/>
               </w:rPr>
-              <w:t>如「未满100元可用」；端口不匹配时点击提示「此券仅支持在 {usable_ports 端口名称} 使用」（见 §4.3.5）</w:t>
+              <w:t>端口不匹配点击提示「此券仅支持在 {usable_ports 端口名称} 使用」（见 §4.3.5）；门槛失格（剩余&lt;X）仅轻提示不拦截</w:t>
             </w:r>
           </w:p>
         </w:tc>
@@ -22859,7 +22873,7 @@
                 <w:rFonts w:eastAsia="Microsoft YaHei" w:ascii="Microsoft YaHei" w:hAnsi="Microsoft YaHei"/>
                 <w:b w:val="0"/>
               </w:rPr>
-              <w:t>调接口查《用户券表》（status=未使用 + end_time&gt;now + 门槛≤订单金额）</w:t>
+              <w:t>调接口查《用户券表》（status=未使用 + end_time&gt;now + 门槛≤当前剩余实付；多张叠加逐张重判，见 §4.3.6.7）</w:t>
             </w:r>
           </w:p>
         </w:tc>
@@ -22897,6 +22911,819 @@
         </w:tc>
       </w:tr>
     </w:tbl>
+    <w:p>
+      <w:r>
+        <w:rPr>
+          <w:rFonts w:eastAsia="Microsoft YaHei" w:ascii="Microsoft YaHei" w:hAnsi="Microsoft YaHei"/>
+          <w:b w:val="0"/>
+        </w:rPr>
+        <w:t>4.3.6.7 多张券叠加的满减门槛与实付下限（本期新增边界规则）</w:t>
+      </w:r>
+    </w:p>
+    <w:p>
+      <w:r>
+        <w:rPr>
+          <w:rFonts w:eastAsia="Microsoft YaHei" w:ascii="Microsoft YaHei" w:hAnsi="Microsoft YaHei"/>
+          <w:b/>
+        </w:rPr>
+        <w:t>业务背景</w:t>
+      </w:r>
+      <w:r>
+        <w:rPr>
+          <w:rFonts w:eastAsia="Microsoft YaHei" w:ascii="Microsoft YaHei" w:hAnsi="Microsoft YaHei"/>
+          <w:b w:val="0"/>
+        </w:rPr>
+        <w:t>：当一张订单同时使用多张满减券（「可多张使用」开启，见 §4.1.3.2），会出现「前面的券把订单减到门槛以下后，后面的券还能不能用、怎么算」的边界问题。本规则明确裁决口径。</w:t>
+      </w:r>
+    </w:p>
+    <w:p>
+      <w:r>
+        <w:rPr>
+          <w:rFonts w:eastAsia="Microsoft YaHei" w:ascii="Microsoft YaHei" w:hAnsi="Microsoft YaHei"/>
+          <w:b/>
+        </w:rPr>
+        <w:t>核心裁决（用户裁定）</w:t>
+      </w:r>
+      <w:r>
+        <w:rPr>
+          <w:rFonts w:eastAsia="Microsoft YaHei" w:ascii="Microsoft YaHei" w:hAnsi="Microsoft YaHei"/>
+          <w:b w:val="0"/>
+        </w:rPr>
+        <w:t>：多张满减券</w:t>
+      </w:r>
+      <w:r>
+        <w:rPr>
+          <w:rFonts w:eastAsia="Microsoft YaHei" w:ascii="Microsoft YaHei" w:hAnsi="Microsoft YaHei"/>
+          <w:b/>
+        </w:rPr>
+        <w:t>可继续叠加选用</w:t>
+      </w:r>
+      <w:r>
+        <w:rPr>
+          <w:rFonts w:eastAsia="Microsoft YaHei" w:ascii="Microsoft YaHei" w:hAnsi="Microsoft YaHei"/>
+          <w:b w:val="0"/>
+        </w:rPr>
+        <w:t>，但每张券的「满 X」门槛</w:t>
+      </w:r>
+      <w:r>
+        <w:rPr>
+          <w:rFonts w:eastAsia="Microsoft YaHei" w:ascii="Microsoft YaHei" w:hAnsi="Microsoft YaHei"/>
+          <w:b/>
+        </w:rPr>
+        <w:t>以当前剩余实付逐张重判</w:t>
+      </w:r>
+      <w:r>
+        <w:rPr>
+          <w:rFonts w:eastAsia="Microsoft YaHei" w:ascii="Microsoft YaHei" w:hAnsi="Microsoft YaHei"/>
+          <w:b w:val="0"/>
+        </w:rPr>
+        <w:t>；当剩余实付已低于某券门槛 X 时，该券</w:t>
+      </w:r>
+      <w:r>
+        <w:rPr>
+          <w:rFonts w:eastAsia="Microsoft YaHei" w:ascii="Microsoft YaHei" w:hAnsi="Microsoft YaHei"/>
+          <w:b/>
+        </w:rPr>
+        <w:t>仍可选</w:t>
+      </w:r>
+      <w:r>
+        <w:rPr>
+          <w:rFonts w:eastAsia="Microsoft YaHei" w:ascii="Microsoft YaHei" w:hAnsi="Microsoft YaHei"/>
+          <w:b w:val="0"/>
+        </w:rPr>
+        <w:t>（不禁止），但其减免额</w:t>
+      </w:r>
+      <w:r>
+        <w:rPr>
+          <w:rFonts w:eastAsia="Microsoft YaHei" w:ascii="Microsoft YaHei" w:hAnsi="Microsoft YaHei"/>
+          <w:b/>
+        </w:rPr>
+        <w:t>封顶为 0</w:t>
+      </w:r>
+      <w:r>
+        <w:rPr>
+          <w:rFonts w:eastAsia="Microsoft YaHei" w:ascii="Microsoft YaHei" w:hAnsi="Microsoft YaHei"/>
+          <w:b w:val="0"/>
+        </w:rPr>
+        <w:t>，</w:t>
+      </w:r>
+      <w:r>
+        <w:rPr>
+          <w:rFonts w:eastAsia="Microsoft YaHei" w:ascii="Microsoft YaHei" w:hAnsi="Microsoft YaHei"/>
+          <w:b/>
+        </w:rPr>
+        <w:t>订单实付金额保持不变、不再下降</w:t>
+      </w:r>
+      <w:r>
+        <w:rPr>
+          <w:rFonts w:eastAsia="Microsoft YaHei" w:ascii="Microsoft YaHei" w:hAnsi="Microsoft YaHei"/>
+          <w:b w:val="0"/>
+        </w:rPr>
+        <w:t>（不找零、不结转）。</w:t>
+      </w:r>
+    </w:p>
+    <w:p>
+      <w:r>
+        <w:rPr>
+          <w:rFonts w:eastAsia="Microsoft YaHei" w:ascii="Microsoft YaHei" w:hAnsi="Microsoft YaHei"/>
+          <w:b/>
+        </w:rPr>
+        <w:t>判定与计算规则（逐张、串行）</w:t>
+      </w:r>
+      <w:r>
+        <w:rPr>
+          <w:rFonts w:eastAsia="Microsoft YaHei" w:ascii="Microsoft YaHei" w:hAnsi="Microsoft YaHei"/>
+          <w:b w:val="0"/>
+        </w:rPr>
+        <w:t>：</w:t>
+      </w:r>
+    </w:p>
+    <w:p>
+      <w:pPr>
+        <w:pStyle w:val="ListBullet"/>
+      </w:pPr>
+      <w:r>
+        <w:rPr>
+          <w:rFonts w:eastAsia="Microsoft YaHei" w:ascii="Microsoft YaHei" w:hAnsi="Microsoft YaHei"/>
+          <w:b/>
+        </w:rPr>
+        <w:t>① 门槛基准 = 当前剩余实付</w:t>
+      </w:r>
+      <w:r>
+        <w:rPr>
+          <w:rFonts w:eastAsia="Microsoft YaHei" w:ascii="Microsoft YaHei" w:hAnsi="Microsoft YaHei"/>
+          <w:b w:val="0"/>
+        </w:rPr>
+        <w:t>：第 N 张券的「满 X」门槛，以</w:t>
+      </w:r>
+      <w:r>
+        <w:rPr>
+          <w:rFonts w:eastAsia="Microsoft YaHei" w:ascii="Microsoft YaHei" w:hAnsi="Microsoft YaHei"/>
+          <w:b/>
+        </w:rPr>
+        <w:t>前 N−1 张券扣减后的剩余实付</w:t>
+      </w:r>
+      <w:r>
+        <w:rPr>
+          <w:rFonts w:eastAsia="Microsoft YaHei" w:ascii="Microsoft YaHei" w:hAnsi="Microsoft YaHei"/>
+          <w:b w:val="0"/>
+        </w:rPr>
+        <w:t>为判定基准，</w:t>
+      </w:r>
+      <w:r>
+        <w:rPr>
+          <w:rFonts w:eastAsia="Microsoft YaHei" w:ascii="Microsoft YaHei" w:hAnsi="Microsoft YaHei"/>
+          <w:b/>
+        </w:rPr>
+        <w:t>不是订单原始金额</w:t>
+      </w:r>
+      <w:r>
+        <w:rPr>
+          <w:rFonts w:eastAsia="Microsoft YaHei" w:ascii="Microsoft YaHei" w:hAnsi="Microsoft YaHei"/>
+          <w:b w:val="0"/>
+        </w:rPr>
+        <w:t>。因此前面券把订单减到 X 以下后，后续同名券的门槛按剩余实付判定会「失格」。</w:t>
+      </w:r>
+    </w:p>
+    <w:p>
+      <w:pPr>
+        <w:pStyle w:val="ListBullet"/>
+      </w:pPr>
+      <w:r>
+        <w:rPr>
+          <w:rFonts w:eastAsia="Microsoft YaHei" w:ascii="Microsoft YaHei" w:hAnsi="Microsoft YaHei"/>
+          <w:b/>
+        </w:rPr>
+        <w:t>② 剩余 ≥ X：正常抵扣</w:t>
+      </w:r>
+      <w:r>
+        <w:rPr>
+          <w:rFonts w:eastAsia="Microsoft YaHei" w:ascii="Microsoft YaHei" w:hAnsi="Microsoft YaHei"/>
+          <w:b w:val="0"/>
+        </w:rPr>
+        <w:t xml:space="preserve">：剩余实付 ≥ X 时，本券正常减免 Y（单档）或 </w:t>
+      </w:r>
+      <w:r>
+        <w:rPr>
+          <w:rFonts w:ascii="Microsoft YaHei" w:hAnsi="Microsoft YaHei" w:eastAsia="Microsoft YaHei"/>
+          <w:color w:val="BE123C"/>
+        </w:rPr>
+        <w:t>floor(剩余÷X)×Y</w:t>
+      </w:r>
+      <w:r>
+        <w:rPr>
+          <w:rFonts w:eastAsia="Microsoft YaHei" w:ascii="Microsoft YaHei" w:hAnsi="Microsoft YaHei"/>
+          <w:b w:val="0"/>
+        </w:rPr>
+        <w:t>（阶梯），实付减少。</w:t>
+      </w:r>
+    </w:p>
+    <w:p>
+      <w:pPr>
+        <w:pStyle w:val="ListBullet"/>
+      </w:pPr>
+      <w:r>
+        <w:rPr>
+          <w:rFonts w:eastAsia="Microsoft YaHei" w:ascii="Microsoft YaHei" w:hAnsi="Microsoft YaHei"/>
+          <w:b/>
+        </w:rPr>
+        <w:t>③ 剩余 &lt; X：仍可选但抵扣封顶 0</w:t>
+      </w:r>
+      <w:r>
+        <w:rPr>
+          <w:rFonts w:eastAsia="Microsoft YaHei" w:ascii="Microsoft YaHei" w:hAnsi="Microsoft YaHei"/>
+          <w:b w:val="0"/>
+        </w:rPr>
+        <w:t>：剩余实付 &lt; X 时，本券</w:t>
+      </w:r>
+      <w:r>
+        <w:rPr>
+          <w:rFonts w:eastAsia="Microsoft YaHei" w:ascii="Microsoft YaHei" w:hAnsi="Microsoft YaHei"/>
+          <w:b/>
+        </w:rPr>
+        <w:t>仍允许用户选用</w:t>
+      </w:r>
+      <w:r>
+        <w:rPr>
+          <w:rFonts w:eastAsia="Microsoft YaHei" w:ascii="Microsoft YaHei" w:hAnsi="Microsoft YaHei"/>
+          <w:b w:val="0"/>
+        </w:rPr>
+        <w:t>（用户裁定「可以」继续用更多张），但本券本次</w:t>
+      </w:r>
+      <w:r>
+        <w:rPr>
+          <w:rFonts w:eastAsia="Microsoft YaHei" w:ascii="Microsoft YaHei" w:hAnsi="Microsoft YaHei"/>
+          <w:b/>
+        </w:rPr>
+        <w:t>抵扣额 = 0</w:t>
+      </w:r>
+      <w:r>
+        <w:rPr>
+          <w:rFonts w:eastAsia="Microsoft YaHei" w:ascii="Microsoft YaHei" w:hAnsi="Microsoft YaHei"/>
+          <w:b w:val="0"/>
+        </w:rPr>
+        <w:t>（门槛未达、不产生减免），</w:t>
+      </w:r>
+      <w:r>
+        <w:rPr>
+          <w:rFonts w:eastAsia="Microsoft YaHei" w:ascii="Microsoft YaHei" w:hAnsi="Microsoft YaHei"/>
+          <w:b/>
+        </w:rPr>
+        <w:t>订单实付保持不变、不再下降</w:t>
+      </w:r>
+      <w:r>
+        <w:rPr>
+          <w:rFonts w:eastAsia="Microsoft YaHei" w:ascii="Microsoft YaHei" w:hAnsi="Microsoft YaHei"/>
+          <w:b w:val="0"/>
+        </w:rPr>
+        <w:t>；不找零、不结转至其他订单。</w:t>
+      </w:r>
+    </w:p>
+    <w:p>
+      <w:pPr>
+        <w:pStyle w:val="ListBullet"/>
+      </w:pPr>
+      <w:r>
+        <w:rPr>
+          <w:rFonts w:eastAsia="Microsoft YaHei" w:ascii="Microsoft YaHei" w:hAnsi="Microsoft YaHei"/>
+          <w:b/>
+        </w:rPr>
+        <w:t>④ 实付下限</w:t>
+      </w:r>
+      <w:r>
+        <w:rPr>
+          <w:rFonts w:eastAsia="Microsoft YaHei" w:ascii="Microsoft YaHei" w:hAnsi="Microsoft YaHei"/>
+          <w:b w:val="0"/>
+        </w:rPr>
+        <w:t xml:space="preserve">：订单最终实付 = </w:t>
+      </w:r>
+      <w:r>
+        <w:rPr>
+          <w:rFonts w:ascii="Microsoft YaHei" w:hAnsi="Microsoft YaHei" w:eastAsia="Microsoft YaHei"/>
+          <w:color w:val="BE123C"/>
+        </w:rPr>
+        <w:t>max(0, 原始金额 − Σ有效减免)</w:t>
+      </w:r>
+      <w:r>
+        <w:rPr>
+          <w:rFonts w:eastAsia="Microsoft YaHei" w:ascii="Microsoft YaHei" w:hAnsi="Microsoft YaHei"/>
+          <w:b w:val="0"/>
+        </w:rPr>
+        <w:t>，</w:t>
+      </w:r>
+      <w:r>
+        <w:rPr>
+          <w:rFonts w:eastAsia="Microsoft YaHei" w:ascii="Microsoft YaHei" w:hAnsi="Microsoft YaHei"/>
+          <w:b/>
+        </w:rPr>
+        <w:t>不低于 0</w:t>
+      </w:r>
+      <w:r>
+        <w:rPr>
+          <w:rFonts w:eastAsia="Microsoft YaHei" w:ascii="Microsoft YaHei" w:hAnsi="Microsoft YaHei"/>
+          <w:b w:val="0"/>
+        </w:rPr>
+        <w:t xml:space="preserve">。阶梯券同样适用本规则（剩余 &lt; X 时 </w:t>
+      </w:r>
+      <w:r>
+        <w:rPr>
+          <w:rFonts w:ascii="Microsoft YaHei" w:hAnsi="Microsoft YaHei" w:eastAsia="Microsoft YaHei"/>
+          <w:color w:val="BE123C"/>
+        </w:rPr>
+        <w:t>floor(剩余÷X)=0</w:t>
+      </w:r>
+      <w:r>
+        <w:rPr>
+          <w:rFonts w:eastAsia="Microsoft YaHei" w:ascii="Microsoft YaHei" w:hAnsi="Microsoft YaHei"/>
+          <w:b w:val="0"/>
+        </w:rPr>
+        <w:t>，即抵扣 0）。</w:t>
+      </w:r>
+    </w:p>
+    <w:p>
+      <w:pPr>
+        <w:pStyle w:val="ListBullet"/>
+      </w:pPr>
+      <w:r>
+        <w:rPr>
+          <w:rFonts w:eastAsia="Microsoft YaHei" w:ascii="Microsoft YaHei" w:hAnsi="Microsoft YaHei"/>
+          <w:b/>
+        </w:rPr>
+        <w:t>⑤ 单 SKU 券</w:t>
+      </w:r>
+      <w:r>
+        <w:rPr>
+          <w:rFonts w:eastAsia="Microsoft YaHei" w:ascii="Microsoft YaHei" w:hAnsi="Microsoft YaHei"/>
+          <w:b w:val="0"/>
+        </w:rPr>
+        <w:t>：按 §4.3.6 单 SKU 规则，门槛基准 = 该 SKU 行</w:t>
+      </w:r>
+      <w:r>
+        <w:rPr>
+          <w:rFonts w:eastAsia="Microsoft YaHei" w:ascii="Microsoft YaHei" w:hAnsi="Microsoft YaHei"/>
+          <w:b/>
+        </w:rPr>
+        <w:t>剩余实付</w:t>
+      </w:r>
+      <w:r>
+        <w:rPr>
+          <w:rFonts w:eastAsia="Microsoft YaHei" w:ascii="Microsoft YaHei" w:hAnsi="Microsoft YaHei"/>
+          <w:b w:val="0"/>
+        </w:rPr>
+        <w:t>，抵扣作用于 SKU 行；该 SKU 行剩余 &lt; X 时同理「仍可选但抵扣 0」，不影响其他 SKU 行与订单总额下限。</w:t>
+      </w:r>
+    </w:p>
+    <w:p>
+      <w:r>
+        <w:rPr>
+          <w:rFonts w:eastAsia="Microsoft YaHei" w:ascii="Microsoft YaHei" w:hAnsi="Microsoft YaHei"/>
+          <w:b/>
+        </w:rPr>
+        <w:t>示例（单档满300-100，可多张使用）</w:t>
+      </w:r>
+      <w:r>
+        <w:rPr>
+          <w:rFonts w:eastAsia="Microsoft YaHei" w:ascii="Microsoft YaHei" w:hAnsi="Microsoft YaHei"/>
+          <w:b w:val="0"/>
+        </w:rPr>
+        <w:t>：订单原始金额 350，用户持有 3 张「满300-100」。</w:t>
+      </w:r>
+    </w:p>
+    <w:tbl>
+      <w:tblPr>
+        <w:tblStyle w:val="TableGrid"/>
+        <w:tblW w:type="auto" w:w="0"/>
+        <w:tblLook w:firstColumn="1" w:firstRow="1" w:lastColumn="0" w:lastRow="0" w:noHBand="0" w:noVBand="1" w:val="04A0"/>
+        <w:jc w:val="center"/>
+        <w:tblBorders>
+          <w:top w:val="single" w:sz="4" w:space="0" w:color="999999"/>
+          <w:left w:val="single" w:sz="4" w:space="0" w:color="999999"/>
+          <w:bottom w:val="single" w:sz="4" w:space="0" w:color="999999"/>
+          <w:right w:val="single" w:sz="4" w:space="0" w:color="999999"/>
+          <w:insideH w:val="single" w:sz="4" w:space="0" w:color="999999"/>
+          <w:insideV w:val="single" w:sz="4" w:space="0" w:color="999999"/>
+        </w:tblBorders>
+      </w:tblPr>
+      <w:tblGrid>
+        <w:gridCol w:w="1728"/>
+        <w:gridCol w:w="1728"/>
+        <w:gridCol w:w="1728"/>
+        <w:gridCol w:w="1728"/>
+        <w:gridCol w:w="1728"/>
+      </w:tblGrid>
+      <w:tr>
+        <w:tc>
+          <w:tcPr>
+            <w:tcW w:type="dxa" w:w="1728"/>
+          </w:tcPr>
+          <w:p>
+            <w:r>
+              <w:rPr>
+                <w:b/>
+              </w:rPr>
+            </w:r>
+            <w:r>
+              <w:rPr>
+                <w:rFonts w:eastAsia="Microsoft YaHei" w:ascii="Microsoft YaHei" w:hAnsi="Microsoft YaHei"/>
+                <w:b/>
+              </w:rPr>
+              <w:t>叠加顺序</w:t>
+            </w:r>
+          </w:p>
+        </w:tc>
+        <w:tc>
+          <w:tcPr>
+            <w:tcW w:type="dxa" w:w="1728"/>
+          </w:tcPr>
+          <w:p>
+            <w:r>
+              <w:rPr>
+                <w:b/>
+              </w:rPr>
+            </w:r>
+            <w:r>
+              <w:rPr>
+                <w:rFonts w:eastAsia="Microsoft YaHei" w:ascii="Microsoft YaHei" w:hAnsi="Microsoft YaHei"/>
+                <w:b/>
+              </w:rPr>
+              <w:t>当前剩余实付</w:t>
+            </w:r>
+          </w:p>
+        </w:tc>
+        <w:tc>
+          <w:tcPr>
+            <w:tcW w:type="dxa" w:w="1728"/>
+          </w:tcPr>
+          <w:p>
+            <w:r>
+              <w:rPr>
+                <w:b/>
+              </w:rPr>
+            </w:r>
+            <w:r>
+              <w:rPr>
+                <w:rFonts w:eastAsia="Microsoft YaHei" w:ascii="Microsoft YaHei" w:hAnsi="Microsoft YaHei"/>
+                <w:b/>
+              </w:rPr>
+              <w:t>门槛判定</w:t>
+            </w:r>
+          </w:p>
+        </w:tc>
+        <w:tc>
+          <w:tcPr>
+            <w:tcW w:type="dxa" w:w="1728"/>
+          </w:tcPr>
+          <w:p>
+            <w:r>
+              <w:rPr>
+                <w:b/>
+              </w:rPr>
+            </w:r>
+            <w:r>
+              <w:rPr>
+                <w:rFonts w:eastAsia="Microsoft YaHei" w:ascii="Microsoft YaHei" w:hAnsi="Microsoft YaHei"/>
+                <w:b/>
+              </w:rPr>
+              <w:t>本券抵扣</w:t>
+            </w:r>
+          </w:p>
+        </w:tc>
+        <w:tc>
+          <w:tcPr>
+            <w:tcW w:type="dxa" w:w="1728"/>
+          </w:tcPr>
+          <w:p>
+            <w:r>
+              <w:rPr>
+                <w:b/>
+              </w:rPr>
+            </w:r>
+            <w:r>
+              <w:rPr>
+                <w:rFonts w:eastAsia="Microsoft YaHei" w:ascii="Microsoft YaHei" w:hAnsi="Microsoft YaHei"/>
+                <w:b/>
+              </w:rPr>
+              <w:t>叠加后实付</w:t>
+            </w:r>
+          </w:p>
+        </w:tc>
+      </w:tr>
+      <w:tr>
+        <w:tc>
+          <w:tcPr>
+            <w:tcW w:type="dxa" w:w="1728"/>
+          </w:tcPr>
+          <w:p>
+            <w:r/>
+            <w:r>
+              <w:rPr>
+                <w:rFonts w:eastAsia="Microsoft YaHei" w:ascii="Microsoft YaHei" w:hAnsi="Microsoft YaHei"/>
+                <w:b w:val="0"/>
+              </w:rPr>
+              <w:t>第 1 张</w:t>
+            </w:r>
+          </w:p>
+        </w:tc>
+        <w:tc>
+          <w:tcPr>
+            <w:tcW w:type="dxa" w:w="1728"/>
+          </w:tcPr>
+          <w:p>
+            <w:r/>
+            <w:r>
+              <w:rPr>
+                <w:rFonts w:eastAsia="Microsoft YaHei" w:ascii="Microsoft YaHei" w:hAnsi="Microsoft YaHei"/>
+                <w:b w:val="0"/>
+              </w:rPr>
+              <w:t>350</w:t>
+            </w:r>
+          </w:p>
+        </w:tc>
+        <w:tc>
+          <w:tcPr>
+            <w:tcW w:type="dxa" w:w="1728"/>
+          </w:tcPr>
+          <w:p>
+            <w:r/>
+            <w:r>
+              <w:rPr>
+                <w:rFonts w:eastAsia="Microsoft YaHei" w:ascii="Microsoft YaHei" w:hAnsi="Microsoft YaHei"/>
+                <w:b w:val="0"/>
+              </w:rPr>
+              <w:t>350 ≥ 300 ✅</w:t>
+            </w:r>
+          </w:p>
+        </w:tc>
+        <w:tc>
+          <w:tcPr>
+            <w:tcW w:type="dxa" w:w="1728"/>
+          </w:tcPr>
+          <w:p>
+            <w:r/>
+            <w:r>
+              <w:rPr>
+                <w:rFonts w:eastAsia="Microsoft YaHei" w:ascii="Microsoft YaHei" w:hAnsi="Microsoft YaHei"/>
+                <w:b w:val="0"/>
+              </w:rPr>
+              <w:t>−100</w:t>
+            </w:r>
+          </w:p>
+        </w:tc>
+        <w:tc>
+          <w:tcPr>
+            <w:tcW w:type="dxa" w:w="1728"/>
+          </w:tcPr>
+          <w:p>
+            <w:r/>
+            <w:r>
+              <w:rPr>
+                <w:rFonts w:eastAsia="Microsoft YaHei" w:ascii="Microsoft YaHei" w:hAnsi="Microsoft YaHei"/>
+                <w:b w:val="0"/>
+              </w:rPr>
+              <w:t>250</w:t>
+            </w:r>
+          </w:p>
+        </w:tc>
+      </w:tr>
+      <w:tr>
+        <w:tc>
+          <w:tcPr>
+            <w:tcW w:type="dxa" w:w="1728"/>
+          </w:tcPr>
+          <w:p>
+            <w:r/>
+            <w:r>
+              <w:rPr>
+                <w:rFonts w:eastAsia="Microsoft YaHei" w:ascii="Microsoft YaHei" w:hAnsi="Microsoft YaHei"/>
+                <w:b w:val="0"/>
+              </w:rPr>
+              <w:t>第 2 张</w:t>
+            </w:r>
+          </w:p>
+        </w:tc>
+        <w:tc>
+          <w:tcPr>
+            <w:tcW w:type="dxa" w:w="1728"/>
+          </w:tcPr>
+          <w:p>
+            <w:r/>
+            <w:r>
+              <w:rPr>
+                <w:rFonts w:eastAsia="Microsoft YaHei" w:ascii="Microsoft YaHei" w:hAnsi="Microsoft YaHei"/>
+                <w:b w:val="0"/>
+              </w:rPr>
+              <w:t>250</w:t>
+            </w:r>
+          </w:p>
+        </w:tc>
+        <w:tc>
+          <w:tcPr>
+            <w:tcW w:type="dxa" w:w="1728"/>
+          </w:tcPr>
+          <w:p>
+            <w:r/>
+            <w:r>
+              <w:rPr>
+                <w:rFonts w:eastAsia="Microsoft YaHei" w:ascii="Microsoft YaHei" w:hAnsi="Microsoft YaHei"/>
+                <w:b w:val="0"/>
+              </w:rPr>
+              <w:t>250 &lt; 300（门槛失格）</w:t>
+            </w:r>
+          </w:p>
+        </w:tc>
+        <w:tc>
+          <w:tcPr>
+            <w:tcW w:type="dxa" w:w="1728"/>
+          </w:tcPr>
+          <w:p>
+            <w:r/>
+            <w:r>
+              <w:rPr>
+                <w:rFonts w:eastAsia="Microsoft YaHei" w:ascii="Microsoft YaHei" w:hAnsi="Microsoft YaHei"/>
+                <w:b w:val="0"/>
+              </w:rPr>
+              <w:t>仍可选，抵扣封顶 0</w:t>
+            </w:r>
+          </w:p>
+        </w:tc>
+        <w:tc>
+          <w:tcPr>
+            <w:tcW w:type="dxa" w:w="1728"/>
+          </w:tcPr>
+          <w:p>
+            <w:r/>
+            <w:r>
+              <w:rPr>
+                <w:rFonts w:eastAsia="Microsoft YaHei" w:ascii="Microsoft YaHei" w:hAnsi="Microsoft YaHei"/>
+                <w:b w:val="0"/>
+              </w:rPr>
+              <w:t>250（不变）</w:t>
+            </w:r>
+          </w:p>
+        </w:tc>
+      </w:tr>
+      <w:tr>
+        <w:tc>
+          <w:tcPr>
+            <w:tcW w:type="dxa" w:w="1728"/>
+          </w:tcPr>
+          <w:p>
+            <w:r/>
+            <w:r>
+              <w:rPr>
+                <w:rFonts w:eastAsia="Microsoft YaHei" w:ascii="Microsoft YaHei" w:hAnsi="Microsoft YaHei"/>
+                <w:b w:val="0"/>
+              </w:rPr>
+              <w:t>第 3 张</w:t>
+            </w:r>
+          </w:p>
+        </w:tc>
+        <w:tc>
+          <w:tcPr>
+            <w:tcW w:type="dxa" w:w="1728"/>
+          </w:tcPr>
+          <w:p>
+            <w:r/>
+            <w:r>
+              <w:rPr>
+                <w:rFonts w:eastAsia="Microsoft YaHei" w:ascii="Microsoft YaHei" w:hAnsi="Microsoft YaHei"/>
+                <w:b w:val="0"/>
+              </w:rPr>
+              <w:t>250</w:t>
+            </w:r>
+          </w:p>
+        </w:tc>
+        <w:tc>
+          <w:tcPr>
+            <w:tcW w:type="dxa" w:w="1728"/>
+          </w:tcPr>
+          <w:p>
+            <w:r/>
+            <w:r>
+              <w:rPr>
+                <w:rFonts w:eastAsia="Microsoft YaHei" w:ascii="Microsoft YaHei" w:hAnsi="Microsoft YaHei"/>
+                <w:b w:val="0"/>
+              </w:rPr>
+              <w:t>250 &lt; 300（门槛失格）</w:t>
+            </w:r>
+          </w:p>
+        </w:tc>
+        <w:tc>
+          <w:tcPr>
+            <w:tcW w:type="dxa" w:w="1728"/>
+          </w:tcPr>
+          <w:p>
+            <w:r/>
+            <w:r>
+              <w:rPr>
+                <w:rFonts w:eastAsia="Microsoft YaHei" w:ascii="Microsoft YaHei" w:hAnsi="Microsoft YaHei"/>
+                <w:b w:val="0"/>
+              </w:rPr>
+              <w:t>仍可选，抵扣封顶 0</w:t>
+            </w:r>
+          </w:p>
+        </w:tc>
+        <w:tc>
+          <w:tcPr>
+            <w:tcW w:type="dxa" w:w="1728"/>
+          </w:tcPr>
+          <w:p>
+            <w:r/>
+            <w:r>
+              <w:rPr>
+                <w:rFonts w:eastAsia="Microsoft YaHei" w:ascii="Microsoft YaHei" w:hAnsi="Microsoft YaHei"/>
+                <w:b w:val="0"/>
+              </w:rPr>
+              <w:t>250（不变）</w:t>
+            </w:r>
+          </w:p>
+        </w:tc>
+      </w:tr>
+    </w:tbl>
+    <w:p>
+      <w:r>
+        <w:rPr>
+          <w:rFonts w:eastAsia="Microsoft YaHei" w:ascii="Microsoft YaHei" w:hAnsi="Microsoft YaHei"/>
+          <w:b w:val="0"/>
+        </w:rPr>
+        <w:t>即：第 1 张正常减到 250；第 2、3 张「还能用」（占用券、走正常核销流程标记已使用），但实付不再减少，保持 250。</w:t>
+      </w:r>
+    </w:p>
+    <w:p>
+      <w:r>
+        <w:rPr>
+          <w:rFonts w:eastAsia="Microsoft YaHei" w:ascii="Microsoft YaHei" w:hAnsi="Microsoft YaHei"/>
+          <w:b/>
+        </w:rPr>
+        <w:t>展示规则</w:t>
+      </w:r>
+      <w:r>
+        <w:rPr>
+          <w:rFonts w:eastAsia="Microsoft YaHei" w:ascii="Microsoft YaHei" w:hAnsi="Microsoft YaHei"/>
+          <w:b w:val="0"/>
+        </w:rPr>
+        <w:t>：</w:t>
+      </w:r>
+    </w:p>
+    <w:p>
+      <w:pPr>
+        <w:pStyle w:val="ListBullet"/>
+      </w:pPr>
+      <w:r>
+        <w:rPr>
+          <w:rFonts w:eastAsia="Microsoft YaHei" w:ascii="Microsoft YaHei" w:hAnsi="Microsoft YaHei"/>
+          <w:b w:val="0"/>
+        </w:rPr>
+        <w:t>确认订单页选券列表 / 优惠明细：对「剩余 &lt; X 仍可选」的券，正常展示可选态；可附轻提示「未满 ¥X，本券本次不抵扣」（不强制弹窗）。</w:t>
+      </w:r>
+    </w:p>
+    <w:p>
+      <w:pPr>
+        <w:pStyle w:val="ListBullet"/>
+      </w:pPr>
+      <w:r>
+        <w:rPr>
+          <w:rFonts w:eastAsia="Microsoft YaHei" w:ascii="Microsoft YaHei" w:hAnsi="Microsoft YaHei"/>
+          <w:b w:val="0"/>
+        </w:rPr>
+        <w:t>优惠明细区仅展示最终实付（不展示负数 / 找零）；多张叠加时逐张列出抵扣明细，其中抵扣 0 的券标注「未达门槛·不抵扣」。</w:t>
+      </w:r>
+    </w:p>
+    <w:p>
+      <w:pPr>
+        <w:pStyle w:val="ListBullet"/>
+      </w:pPr>
+      <w:r>
+        <w:rPr>
+          <w:rFonts w:eastAsia="Microsoft YaHei" w:ascii="Microsoft YaHei" w:hAnsi="Microsoft YaHei"/>
+          <w:b w:val="0"/>
+        </w:rPr>
+        <w:t>后端在下单 / 选券接口按「剩余实付逐张重判 + 封顶 0 + 下限 0」二次校验，前后端规则一致，防止绕过。</w:t>
+      </w:r>
+    </w:p>
+    <w:p>
+      <w:r>
+        <w:rPr>
+          <w:rFonts w:eastAsia="Microsoft YaHei" w:ascii="Microsoft YaHei" w:hAnsi="Microsoft YaHei"/>
+          <w:b w:val="0"/>
+        </w:rPr>
+        <w:t xml:space="preserve">⚠️ </w:t>
+      </w:r>
+      <w:r>
+        <w:rPr>
+          <w:rFonts w:eastAsia="Microsoft YaHei" w:ascii="Microsoft YaHei" w:hAnsi="Microsoft YaHei"/>
+          <w:b/>
+        </w:rPr>
+        <w:t>待确认 @产品/技术</w:t>
+      </w:r>
+      <w:r>
+        <w:rPr>
+          <w:rFonts w:eastAsia="Microsoft YaHei" w:ascii="Microsoft YaHei" w:hAnsi="Microsoft YaHei"/>
+          <w:b w:val="0"/>
+        </w:rPr>
+        <w:t>：剩余 &lt; X 时「仍可选」的券，核销后是否计入用户券「已使用」（占用一张）？当前按「正常占用并标记已使用」描述；若业务希望「不消耗券、仅作展示」需另行裁定。</w:t>
+      </w:r>
+    </w:p>
     <w:p>
       <w:pPr>
         <w:pStyle w:val="Heading4"/>
@@ -22905,7 +23732,7 @@
         <w:rPr>
           <w:rFonts w:eastAsia="Microsoft YaHei" w:ascii="Microsoft YaHei" w:hAnsi="Microsoft YaHei"/>
         </w:rPr>
-        <w:t>4.3.6.7 状态流转</w:t>
+        <w:t>4.3.6.8 状态流转</w:t>
       </w:r>
     </w:p>
     <w:p>

</xml_diff>

<commit_message>
update coupon-prd.docx: sync PRD (底价 moved to D2 + P2 full template added, 64 tables)
</commit_message>
<xml_diff>
--- a/coupon-prd.docx
+++ b/coupon-prd.docx
@@ -7392,6 +7392,411 @@
       </w:tr>
     </w:tbl>
     <w:p>
+      <w:pPr>
+        <w:pStyle w:val="Heading4"/>
+      </w:pPr>
+      <w:r>
+        <w:rPr>
+          <w:rFonts w:eastAsia="Microsoft YaHei" w:ascii="Microsoft YaHei" w:hAnsi="Microsoft YaHei"/>
+        </w:rPr>
+        <w:t xml:space="preserve">4.1.3.4 「底价（商品级）」字段规则 </w:t>
+      </w:r>
+      <w:r>
+        <w:rPr>
+          <w:rFonts w:eastAsia="Microsoft YaHei" w:ascii="Microsoft YaHei" w:hAnsi="Microsoft YaHei"/>
+          <w:b w:val="0"/>
+        </w:rPr>
+        <w:t>本期新增</w:t>
+      </w:r>
+    </w:p>
+    <w:p>
+      <w:r>
+        <w:rPr>
+          <w:rFonts w:eastAsia="Microsoft YaHei" w:ascii="Microsoft YaHei" w:hAnsi="Microsoft YaHei"/>
+          <w:b/>
+        </w:rPr>
+        <w:t>字段定义</w:t>
+      </w:r>
+      <w:r>
+        <w:rPr>
+          <w:rFonts w:eastAsia="Microsoft YaHei" w:ascii="Microsoft YaHei" w:hAnsi="Microsoft YaHei"/>
+          <w:b w:val="0"/>
+        </w:rPr>
+        <w:t>：底价是</w:t>
+      </w:r>
+      <w:r>
+        <w:rPr>
+          <w:rFonts w:eastAsia="Microsoft YaHei" w:ascii="Microsoft YaHei" w:hAnsi="Microsoft YaHei"/>
+          <w:b/>
+        </w:rPr>
+        <w:t>商品级</w:t>
+      </w:r>
+      <w:r>
+        <w:rPr>
+          <w:rFonts w:eastAsia="Microsoft YaHei" w:ascii="Microsoft YaHei" w:hAnsi="Microsoft YaHei"/>
+          <w:b w:val="0"/>
+        </w:rPr>
+        <w:t>属性，由运营在券配置的「商品选择区」环节，对</w:t>
+      </w:r>
+      <w:r>
+        <w:rPr>
+          <w:rFonts w:eastAsia="Microsoft YaHei" w:ascii="Microsoft YaHei" w:hAnsi="Microsoft YaHei"/>
+          <w:b/>
+        </w:rPr>
+        <w:t>每个适用商品</w:t>
+      </w:r>
+      <w:r>
+        <w:rPr>
+          <w:rFonts w:eastAsia="Microsoft YaHei" w:ascii="Microsoft YaHei" w:hAnsi="Microsoft YaHei"/>
+          <w:b w:val="0"/>
+        </w:rPr>
+        <w:t>逐行录入该商品允许成交的最低实付单价。它约束的是 C 端结算时「叠加/用券后该商品实付不得低于底价」，与券面额、门槛、可共用优惠、阶梯计算相互独立。</w:t>
+      </w:r>
+    </w:p>
+    <w:p>
+      <w:r>
+        <w:rPr>
+          <w:rFonts w:eastAsia="Microsoft YaHei" w:ascii="Microsoft YaHei" w:hAnsi="Microsoft YaHei"/>
+          <w:b/>
+        </w:rPr>
+        <w:t>录入与存储</w:t>
+      </w:r>
+      <w:r>
+        <w:rPr>
+          <w:rFonts w:eastAsia="Microsoft YaHei" w:ascii="Microsoft YaHei" w:hAnsi="Microsoft YaHei"/>
+          <w:b w:val="0"/>
+        </w:rPr>
+        <w:t>：</w:t>
+      </w:r>
+    </w:p>
+    <w:p>
+      <w:pPr>
+        <w:pStyle w:val="ListBullet"/>
+      </w:pPr>
+      <w:r>
+        <w:rPr>
+          <w:rFonts w:eastAsia="Microsoft YaHei" w:ascii="Microsoft YaHei" w:hAnsi="Microsoft YaHei"/>
+          <w:b/>
+        </w:rPr>
+        <w:t>来源</w:t>
+      </w:r>
+      <w:r>
+        <w:rPr>
+          <w:rFonts w:eastAsia="Microsoft YaHei" w:ascii="Microsoft YaHei" w:hAnsi="Microsoft YaHei"/>
+          <w:b w:val="0"/>
+        </w:rPr>
+        <w:t>：</w:t>
+      </w:r>
+      <w:r>
+        <w:rPr>
+          <w:rFonts w:eastAsia="Microsoft YaHei" w:ascii="Microsoft YaHei" w:hAnsi="Microsoft YaHei"/>
+          <w:b/>
+        </w:rPr>
+        <w:t>运营在券配置中手动录入</w:t>
+      </w:r>
+      <w:r>
+        <w:rPr>
+          <w:rFonts w:eastAsia="Microsoft YaHei" w:ascii="Microsoft YaHei" w:hAnsi="Microsoft YaHei"/>
+          <w:b w:val="0"/>
+        </w:rPr>
+        <w:t>（以后台原型为准，</w:t>
+      </w:r>
+      <w:r>
+        <w:rPr>
+          <w:rFonts w:eastAsia="Microsoft YaHei" w:ascii="Microsoft YaHei" w:hAnsi="Microsoft YaHei"/>
+          <w:b/>
+        </w:rPr>
+        <w:t>非</w:t>
+      </w:r>
+      <w:r>
+        <w:rPr>
+          <w:rFonts w:eastAsia="Microsoft YaHei" w:ascii="Microsoft YaHei" w:hAnsi="Microsoft YaHei"/>
+          <w:b w:val="0"/>
+        </w:rPr>
+        <w:t>商品域接口只读）。原型中每个已选商品行带「底价 ¥」数字输入框（min=0，step=0.01，默认留空）。</w:t>
+      </w:r>
+    </w:p>
+    <w:p>
+      <w:pPr>
+        <w:pStyle w:val="ListBullet"/>
+      </w:pPr>
+      <w:r>
+        <w:rPr>
+          <w:rFonts w:eastAsia="Microsoft YaHei" w:ascii="Microsoft YaHei" w:hAnsi="Microsoft YaHei"/>
+          <w:b/>
+        </w:rPr>
+        <w:t>字段</w:t>
+      </w:r>
+      <w:r>
+        <w:rPr>
+          <w:rFonts w:eastAsia="Microsoft YaHei" w:ascii="Microsoft YaHei" w:hAnsi="Microsoft YaHei"/>
+          <w:b w:val="0"/>
+        </w:rPr>
+        <w:t xml:space="preserve">：存《券模板表》适用商品集合的 </w:t>
+      </w:r>
+      <w:r>
+        <w:rPr>
+          <w:rFonts w:ascii="Microsoft YaHei" w:hAnsi="Microsoft YaHei" w:eastAsia="Microsoft YaHei"/>
+          <w:color w:val="BE123C"/>
+        </w:rPr>
+        <w:t>floor_price</w:t>
+      </w:r>
+      <w:r>
+        <w:rPr>
+          <w:rFonts w:eastAsia="Microsoft YaHei" w:ascii="Microsoft YaHei" w:hAnsi="Microsoft YaHei"/>
+          <w:b w:val="0"/>
+        </w:rPr>
+        <w:t>；</w:t>
+      </w:r>
+      <w:r>
+        <w:rPr>
+          <w:rFonts w:eastAsia="Microsoft YaHei" w:ascii="Microsoft YaHei" w:hAnsi="Microsoft YaHei"/>
+          <w:b/>
+        </w:rPr>
+        <w:t>空值 / 0.00 = 无底价（即不限制）</w:t>
+      </w:r>
+      <w:r>
+        <w:rPr>
+          <w:rFonts w:eastAsia="Microsoft YaHei" w:ascii="Microsoft YaHei" w:hAnsi="Microsoft YaHei"/>
+          <w:b w:val="0"/>
+        </w:rPr>
+        <w:t>，C 端该商品不做底价不击穿校验。</w:t>
+      </w:r>
+    </w:p>
+    <w:p>
+      <w:pPr>
+        <w:pStyle w:val="ListBullet"/>
+      </w:pPr>
+      <w:r>
+        <w:rPr>
+          <w:rFonts w:eastAsia="Microsoft YaHei" w:ascii="Microsoft YaHei" w:hAnsi="Microsoft YaHei"/>
+          <w:b/>
+        </w:rPr>
+        <w:t>校验</w:t>
+      </w:r>
+      <w:r>
+        <w:rPr>
+          <w:rFonts w:eastAsia="Microsoft YaHei" w:ascii="Microsoft YaHei" w:hAnsi="Microsoft YaHei"/>
+          <w:b w:val="0"/>
+        </w:rPr>
+        <w:t>：≥0 数值；可留空；</w:t>
+      </w:r>
+      <w:r>
+        <w:rPr>
+          <w:rFonts w:eastAsia="Microsoft YaHei" w:ascii="Microsoft YaHei" w:hAnsi="Microsoft YaHei"/>
+          <w:b/>
+        </w:rPr>
+        <w:t>不强制必填</w:t>
+      </w:r>
+      <w:r>
+        <w:rPr>
+          <w:rFonts w:eastAsia="Microsoft YaHei" w:ascii="Microsoft YaHei" w:hAnsi="Microsoft YaHei"/>
+          <w:b w:val="0"/>
+        </w:rPr>
+        <w:t>。</w:t>
+      </w:r>
+    </w:p>
+    <w:p>
+      <w:r>
+        <w:rPr>
+          <w:rFonts w:eastAsia="Microsoft YaHei" w:ascii="Microsoft YaHei" w:hAnsi="Microsoft YaHei"/>
+          <w:b/>
+        </w:rPr>
+        <w:t>C 端「严格不击穿底价」保护规则（本期实现）</w:t>
+      </w:r>
+      <w:r>
+        <w:rPr>
+          <w:rFonts w:eastAsia="Microsoft YaHei" w:ascii="Microsoft YaHei" w:hAnsi="Microsoft YaHei"/>
+          <w:b w:val="0"/>
+        </w:rPr>
+        <w:t>：</w:t>
+      </w:r>
+    </w:p>
+    <w:p>
+      <w:pPr>
+        <w:pStyle w:val="ListBullet"/>
+      </w:pPr>
+      <w:r>
+        <w:rPr>
+          <w:rFonts w:eastAsia="Microsoft YaHei" w:ascii="Microsoft YaHei" w:hAnsi="Microsoft YaHei"/>
+          <w:b/>
+        </w:rPr>
+        <w:t>生效位置</w:t>
+      </w:r>
+      <w:r>
+        <w:rPr>
+          <w:rFonts w:eastAsia="Microsoft YaHei" w:ascii="Microsoft YaHei" w:hAnsi="Microsoft YaHei"/>
+          <w:b w:val="0"/>
+        </w:rPr>
+        <w:t>：在确认订单页结算计算时生效（与 §4.3.6 选券联动），后端在下单/核销接口二次校验，前后端规则一致。</w:t>
+      </w:r>
+    </w:p>
+    <w:p>
+      <w:pPr>
+        <w:pStyle w:val="ListBullet"/>
+      </w:pPr>
+      <w:r>
+        <w:rPr>
+          <w:rFonts w:eastAsia="Microsoft YaHei" w:ascii="Microsoft YaHei" w:hAnsi="Microsoft YaHei"/>
+          <w:b/>
+        </w:rPr>
+        <w:t>计算顺序</w:t>
+      </w:r>
+      <w:r>
+        <w:rPr>
+          <w:rFonts w:eastAsia="Microsoft YaHei" w:ascii="Microsoft YaHei" w:hAnsi="Microsoft YaHei"/>
+          <w:b w:val="0"/>
+        </w:rPr>
+        <w:t>：多盒多折（商品级）→ 优惠券满减（订单级）→ 臻享积分抵现（支付级）。底价不击穿在「优惠券满减」步骤后、逐商品核算实付时触发。</w:t>
+      </w:r>
+    </w:p>
+    <w:p>
+      <w:pPr>
+        <w:pStyle w:val="ListBullet"/>
+      </w:pPr>
+      <w:r>
+        <w:rPr>
+          <w:rFonts w:eastAsia="Microsoft YaHei" w:ascii="Microsoft YaHei" w:hAnsi="Microsoft YaHei"/>
+          <w:b/>
+        </w:rPr>
+        <w:t>保护逻辑</w:t>
+      </w:r>
+      <w:r>
+        <w:rPr>
+          <w:rFonts w:eastAsia="Microsoft YaHei" w:ascii="Microsoft YaHei" w:hAnsi="Microsoft YaHei"/>
+          <w:b w:val="0"/>
+        </w:rPr>
+        <w:t>：逐商品校验「该商品结算实付单价 ≥ 其 floor_price」；若减免后实付 &lt; 底价，则</w:t>
+      </w:r>
+      <w:r>
+        <w:rPr>
+          <w:rFonts w:eastAsia="Microsoft YaHei" w:ascii="Microsoft YaHei" w:hAnsi="Microsoft YaHei"/>
+          <w:b/>
+        </w:rPr>
+        <w:t>回退该商品对应的优惠减免至刚好触底</w:t>
+      </w:r>
+      <w:r>
+        <w:rPr>
+          <w:rFonts w:eastAsia="Microsoft YaHei" w:ascii="Microsoft YaHei" w:hAnsi="Microsoft YaHei"/>
+          <w:b w:val="0"/>
+        </w:rPr>
+        <w:t>（该商品实付 = 底价），</w:t>
+      </w:r>
+      <w:r>
+        <w:rPr>
+          <w:rFonts w:eastAsia="Microsoft YaHei" w:ascii="Microsoft YaHei" w:hAnsi="Microsoft YaHei"/>
+          <w:b/>
+        </w:rPr>
+        <w:t>其余商品不受影响</w:t>
+      </w:r>
+      <w:r>
+        <w:rPr>
+          <w:rFonts w:eastAsia="Microsoft YaHei" w:ascii="Microsoft YaHei" w:hAnsi="Microsoft YaHei"/>
+          <w:b w:val="0"/>
+        </w:rPr>
+        <w:t>，不整体取消券。</w:t>
+      </w:r>
+    </w:p>
+    <w:p>
+      <w:pPr>
+        <w:pStyle w:val="ListBullet"/>
+      </w:pPr>
+      <w:r>
+        <w:rPr>
+          <w:rFonts w:eastAsia="Microsoft YaHei" w:ascii="Microsoft YaHei" w:hAnsi="Microsoft YaHei"/>
+          <w:b/>
+        </w:rPr>
+        <w:t>极端兜底</w:t>
+      </w:r>
+      <w:r>
+        <w:rPr>
+          <w:rFonts w:eastAsia="Microsoft YaHei" w:ascii="Microsoft YaHei" w:hAnsi="Microsoft YaHei"/>
+          <w:b w:val="0"/>
+        </w:rPr>
+        <w:t>：若回退后仍无法满足（如单商品订单券面额超过「原价 − 底价」），则该券对当前订单</w:t>
+      </w:r>
+      <w:r>
+        <w:rPr>
+          <w:rFonts w:eastAsia="Microsoft YaHei" w:ascii="Microsoft YaHei" w:hAnsi="Microsoft YaHei"/>
+          <w:b/>
+        </w:rPr>
+        <w:t>不可用</w:t>
+      </w:r>
+      <w:r>
+        <w:rPr>
+          <w:rFonts w:eastAsia="Microsoft YaHei" w:ascii="Microsoft YaHei" w:hAnsi="Microsoft YaHei"/>
+          <w:b w:val="0"/>
+        </w:rPr>
+        <w:t>，确认订单页置灰并提示「该商品触发底价不击穿，本券不可用」。</w:t>
+      </w:r>
+    </w:p>
+    <w:p>
+      <w:pPr>
+        <w:pStyle w:val="ListBullet"/>
+      </w:pPr>
+      <w:r>
+        <w:rPr>
+          <w:rFonts w:eastAsia="Microsoft YaHei" w:ascii="Microsoft YaHei" w:hAnsi="Microsoft YaHei"/>
+          <w:b/>
+        </w:rPr>
+        <w:t>前端展示</w:t>
+      </w:r>
+      <w:r>
+        <w:rPr>
+          <w:rFonts w:eastAsia="Microsoft YaHei" w:ascii="Microsoft YaHei" w:hAnsi="Microsoft YaHei"/>
+          <w:b w:val="0"/>
+        </w:rPr>
+        <w:t>：确认订单页实时计算并显示本单实际减免金额；触底回退时展示触底提示，减免金额随之更新。</w:t>
+      </w:r>
+    </w:p>
+    <w:p>
+      <w:pPr>
+        <w:pStyle w:val="ListBullet"/>
+      </w:pPr>
+      <w:r>
+        <w:rPr>
+          <w:rFonts w:eastAsia="Microsoft YaHei" w:ascii="Microsoft YaHei" w:hAnsi="Microsoft YaHei"/>
+          <w:b/>
+        </w:rPr>
+        <w:t>计算基数</w:t>
+      </w:r>
+      <w:r>
+        <w:rPr>
+          <w:rFonts w:eastAsia="Microsoft YaHei" w:ascii="Microsoft YaHei" w:hAnsi="Microsoft YaHei"/>
+          <w:b w:val="0"/>
+        </w:rPr>
+        <w:t>：底价不击穿仅作用于</w:t>
+      </w:r>
+      <w:r>
+        <w:rPr>
+          <w:rFonts w:eastAsia="Microsoft YaHei" w:ascii="Microsoft YaHei" w:hAnsi="Microsoft YaHei"/>
+          <w:b/>
+        </w:rPr>
+        <w:t>该券适用商品范围内</w:t>
+      </w:r>
+      <w:r>
+        <w:rPr>
+          <w:rFonts w:eastAsia="Microsoft YaHei" w:ascii="Microsoft YaHei" w:hAnsi="Microsoft YaHei"/>
+          <w:b w:val="0"/>
+        </w:rPr>
+        <w:t>的商品实付单价；</w:t>
+      </w:r>
+      <w:r>
+        <w:rPr>
+          <w:rFonts w:eastAsia="Microsoft YaHei" w:ascii="Microsoft YaHei" w:hAnsi="Microsoft YaHei"/>
+          <w:b/>
+        </w:rPr>
+        <w:t>不含赠品 / 换购商品金额</w:t>
+      </w:r>
+      <w:r>
+        <w:rPr>
+          <w:rFonts w:eastAsia="Microsoft YaHei" w:ascii="Microsoft YaHei" w:hAnsi="Microsoft YaHei"/>
+          <w:b w:val="0"/>
+        </w:rPr>
+        <w:t>（用户裁定：当前赠品不影响指定券的 SKU，与 §4.1.3.3 阶梯计算基数口径一致）。</w:t>
+      </w:r>
+    </w:p>
+    <w:p>
       <w:r>
         <w:rPr>
           <w:rFonts w:eastAsia="Microsoft YaHei" w:ascii="Microsoft YaHei" w:hAnsi="Microsoft YaHei"/>
@@ -11861,6 +12266,1447 @@
           <w:rFonts w:eastAsia="Microsoft YaHei" w:ascii="Microsoft YaHei" w:hAnsi="Microsoft YaHei"/>
           <w:b/>
         </w:rPr>
+        <w:t>P2 列表字段表</w:t>
+      </w:r>
+    </w:p>
+    <w:tbl>
+      <w:tblPr>
+        <w:tblStyle w:val="TableGrid"/>
+        <w:tblW w:type="auto" w:w="0"/>
+        <w:tblLook w:firstColumn="1" w:firstRow="1" w:lastColumn="0" w:lastRow="0" w:noHBand="0" w:noVBand="1" w:val="04A0"/>
+        <w:jc w:val="center"/>
+        <w:tblBorders>
+          <w:top w:val="single" w:sz="4" w:space="0" w:color="999999"/>
+          <w:left w:val="single" w:sz="4" w:space="0" w:color="999999"/>
+          <w:bottom w:val="single" w:sz="4" w:space="0" w:color="999999"/>
+          <w:right w:val="single" w:sz="4" w:space="0" w:color="999999"/>
+          <w:insideH w:val="single" w:sz="4" w:space="0" w:color="999999"/>
+          <w:insideV w:val="single" w:sz="4" w:space="0" w:color="999999"/>
+        </w:tblBorders>
+      </w:tblPr>
+      <w:tblGrid>
+        <w:gridCol w:w="2880"/>
+        <w:gridCol w:w="2880"/>
+        <w:gridCol w:w="2880"/>
+      </w:tblGrid>
+      <w:tr>
+        <w:tc>
+          <w:tcPr>
+            <w:tcW w:type="dxa" w:w="2880"/>
+          </w:tcPr>
+          <w:p>
+            <w:r>
+              <w:rPr>
+                <w:b/>
+              </w:rPr>
+            </w:r>
+            <w:r>
+              <w:rPr>
+                <w:rFonts w:eastAsia="Microsoft YaHei" w:ascii="Microsoft YaHei" w:hAnsi="Microsoft YaHei"/>
+                <w:b/>
+              </w:rPr>
+              <w:t>字段</w:t>
+            </w:r>
+          </w:p>
+        </w:tc>
+        <w:tc>
+          <w:tcPr>
+            <w:tcW w:type="dxa" w:w="2880"/>
+          </w:tcPr>
+          <w:p>
+            <w:r>
+              <w:rPr>
+                <w:b/>
+              </w:rPr>
+            </w:r>
+            <w:r>
+              <w:rPr>
+                <w:rFonts w:eastAsia="Microsoft YaHei" w:ascii="Microsoft YaHei" w:hAnsi="Microsoft YaHei"/>
+                <w:b/>
+              </w:rPr>
+              <w:t>需求说明</w:t>
+            </w:r>
+          </w:p>
+        </w:tc>
+        <w:tc>
+          <w:tcPr>
+            <w:tcW w:type="dxa" w:w="2880"/>
+          </w:tcPr>
+          <w:p>
+            <w:r>
+              <w:rPr>
+                <w:b/>
+              </w:rPr>
+            </w:r>
+            <w:r>
+              <w:rPr>
+                <w:rFonts w:eastAsia="Microsoft YaHei" w:ascii="Microsoft YaHei" w:hAnsi="Microsoft YaHei"/>
+                <w:b/>
+              </w:rPr>
+              <w:t>备注</w:t>
+            </w:r>
+          </w:p>
+        </w:tc>
+      </w:tr>
+      <w:tr>
+        <w:tc>
+          <w:tcPr>
+            <w:tcW w:type="dxa" w:w="2880"/>
+          </w:tcPr>
+          <w:p>
+            <w:r/>
+            <w:r>
+              <w:rPr>
+                <w:rFonts w:eastAsia="Microsoft YaHei" w:ascii="Microsoft YaHei" w:hAnsi="Microsoft YaHei"/>
+                <w:b w:val="0"/>
+              </w:rPr>
+              <w:t>勾选框</w:t>
+            </w:r>
+          </w:p>
+        </w:tc>
+        <w:tc>
+          <w:tcPr>
+            <w:tcW w:type="dxa" w:w="2880"/>
+          </w:tcPr>
+          <w:p>
+            <w:r/>
+            <w:r>
+              <w:rPr>
+                <w:rFonts w:eastAsia="Microsoft YaHei" w:ascii="Microsoft YaHei" w:hAnsi="Microsoft YaHei"/>
+                <w:b w:val="0"/>
+              </w:rPr>
+              <w:t>多选，用于批量操作</w:t>
+            </w:r>
+          </w:p>
+        </w:tc>
+        <w:tc>
+          <w:tcPr>
+            <w:tcW w:type="dxa" w:w="2880"/>
+          </w:tcPr>
+          <w:p>
+            <w:r/>
+            <w:r>
+              <w:rPr>
+                <w:rFonts w:eastAsia="Microsoft YaHei" w:ascii="Microsoft YaHei" w:hAnsi="Microsoft YaHei"/>
+                <w:b w:val="0"/>
+              </w:rPr>
+              <w:t>—</w:t>
+            </w:r>
+          </w:p>
+        </w:tc>
+      </w:tr>
+      <w:tr>
+        <w:tc>
+          <w:tcPr>
+            <w:tcW w:type="dxa" w:w="2880"/>
+          </w:tcPr>
+          <w:p>
+            <w:r/>
+            <w:r>
+              <w:rPr>
+                <w:rFonts w:eastAsia="Microsoft YaHei" w:ascii="Microsoft YaHei" w:hAnsi="Microsoft YaHei"/>
+                <w:b w:val="0"/>
+              </w:rPr>
+              <w:t>活动名称</w:t>
+            </w:r>
+          </w:p>
+        </w:tc>
+        <w:tc>
+          <w:tcPr>
+            <w:tcW w:type="dxa" w:w="2880"/>
+          </w:tcPr>
+          <w:p>
+            <w:r/>
+            <w:r>
+              <w:rPr>
+                <w:rFonts w:eastAsia="Microsoft YaHei" w:ascii="Microsoft YaHei" w:hAnsi="Microsoft YaHei"/>
+                <w:b w:val="0"/>
+              </w:rPr>
+              <w:t>发券活动名称（文本）</w:t>
+            </w:r>
+          </w:p>
+        </w:tc>
+        <w:tc>
+          <w:tcPr>
+            <w:tcW w:type="dxa" w:w="2880"/>
+          </w:tcPr>
+          <w:p>
+            <w:r/>
+            <w:r>
+              <w:rPr>
+                <w:rFonts w:eastAsia="Microsoft YaHei" w:ascii="Microsoft YaHei" w:hAnsi="Microsoft YaHei"/>
+                <w:b w:val="0"/>
+              </w:rPr>
+              <w:t>取《发券活动表》name</w:t>
+            </w:r>
+          </w:p>
+        </w:tc>
+      </w:tr>
+      <w:tr>
+        <w:tc>
+          <w:tcPr>
+            <w:tcW w:type="dxa" w:w="2880"/>
+          </w:tcPr>
+          <w:p>
+            <w:r/>
+            <w:r>
+              <w:rPr>
+                <w:rFonts w:eastAsia="Microsoft YaHei" w:ascii="Microsoft YaHei" w:hAnsi="Microsoft YaHei"/>
+                <w:b w:val="0"/>
+              </w:rPr>
+              <w:t>触发源</w:t>
+            </w:r>
+          </w:p>
+        </w:tc>
+        <w:tc>
+          <w:tcPr>
+            <w:tcW w:type="dxa" w:w="2880"/>
+          </w:tcPr>
+          <w:p>
+            <w:r/>
+            <w:r>
+              <w:rPr>
+                <w:rFonts w:eastAsia="Microsoft YaHei" w:ascii="Microsoft YaHei" w:hAnsi="Microsoft YaHei"/>
+                <w:b w:val="0"/>
+              </w:rPr>
+              <w:t>触发来源类型展示（如「直播时长」）</w:t>
+            </w:r>
+          </w:p>
+        </w:tc>
+        <w:tc>
+          <w:tcPr>
+            <w:tcW w:type="dxa" w:w="2880"/>
+          </w:tcPr>
+          <w:p>
+            <w:r/>
+            <w:r>
+              <w:rPr>
+                <w:rFonts w:eastAsia="Microsoft YaHei" w:ascii="Microsoft YaHei" w:hAnsi="Microsoft YaHei"/>
+                <w:b w:val="0"/>
+              </w:rPr>
+              <w:t>取 trigger 字段；本期固定为「直播时长」</w:t>
+            </w:r>
+          </w:p>
+        </w:tc>
+      </w:tr>
+      <w:tr>
+        <w:tc>
+          <w:tcPr>
+            <w:tcW w:type="dxa" w:w="2880"/>
+          </w:tcPr>
+          <w:p>
+            <w:r/>
+            <w:r>
+              <w:rPr>
+                <w:rFonts w:eastAsia="Microsoft YaHei" w:ascii="Microsoft YaHei" w:hAnsi="Microsoft YaHei"/>
+                <w:b w:val="0"/>
+              </w:rPr>
+              <w:t>关联直播标签</w:t>
+            </w:r>
+          </w:p>
+        </w:tc>
+        <w:tc>
+          <w:tcPr>
+            <w:tcW w:type="dxa" w:w="2880"/>
+          </w:tcPr>
+          <w:p>
+            <w:r/>
+            <w:r>
+              <w:rPr>
+                <w:rFonts w:eastAsia="Microsoft YaHei" w:ascii="Microsoft YaHei" w:hAnsi="Microsoft YaHei"/>
+                <w:b w:val="0"/>
+              </w:rPr>
+              <w:t>所关联的直播标签名称；非直播时长活动显示「—」</w:t>
+            </w:r>
+          </w:p>
+        </w:tc>
+        <w:tc>
+          <w:tcPr>
+            <w:tcW w:type="dxa" w:w="2880"/>
+          </w:tcPr>
+          <w:p>
+            <w:r/>
+            <w:r>
+              <w:rPr>
+                <w:rFonts w:eastAsia="Microsoft YaHei" w:ascii="Microsoft YaHei" w:hAnsi="Microsoft YaHei"/>
+                <w:b w:val="0"/>
+              </w:rPr>
+              <w:t>本期新增</w:t>
+            </w:r>
+            <w:r>
+              <w:rPr>
+                <w:rFonts w:eastAsia="Microsoft YaHei" w:ascii="Microsoft YaHei" w:hAnsi="Microsoft YaHei"/>
+                <w:b w:val="0"/>
+              </w:rPr>
+              <w:t xml:space="preserve"> 仅当触发源=直播时长时展示（Tag 样式）；取关联标签表的 tag_name</w:t>
+            </w:r>
+          </w:p>
+        </w:tc>
+      </w:tr>
+      <w:tr>
+        <w:tc>
+          <w:tcPr>
+            <w:tcW w:type="dxa" w:w="2880"/>
+          </w:tcPr>
+          <w:p>
+            <w:r/>
+            <w:r>
+              <w:rPr>
+                <w:rFonts w:eastAsia="Microsoft YaHei" w:ascii="Microsoft YaHei" w:hAnsi="Microsoft YaHei"/>
+                <w:b w:val="0"/>
+              </w:rPr>
+              <w:t>观看阈值/条件</w:t>
+            </w:r>
+          </w:p>
+        </w:tc>
+        <w:tc>
+          <w:tcPr>
+            <w:tcW w:type="dxa" w:w="2880"/>
+          </w:tcPr>
+          <w:p>
+            <w:r/>
+            <w:r>
+              <w:rPr>
+                <w:rFonts w:eastAsia="Microsoft YaHei" w:ascii="Microsoft YaHei" w:hAnsi="Microsoft YaHei"/>
+                <w:b w:val="0"/>
+              </w:rPr>
+              <w:t>触发条件的文本描述（如「观看满30分钟」）</w:t>
+            </w:r>
+          </w:p>
+        </w:tc>
+        <w:tc>
+          <w:tcPr>
+            <w:tcW w:type="dxa" w:w="2880"/>
+          </w:tcPr>
+          <w:p>
+            <w:r/>
+            <w:r>
+              <w:rPr>
+                <w:rFonts w:eastAsia="Microsoft YaHei" w:ascii="Microsoft YaHei" w:hAnsi="Microsoft YaHei"/>
+                <w:b w:val="0"/>
+              </w:rPr>
+              <w:t>取 threshold_text（由触发源+阈值数值组合生成，见 D3 表单）</w:t>
+            </w:r>
+          </w:p>
+        </w:tc>
+      </w:tr>
+      <w:tr>
+        <w:tc>
+          <w:tcPr>
+            <w:tcW w:type="dxa" w:w="2880"/>
+          </w:tcPr>
+          <w:p>
+            <w:r/>
+            <w:r>
+              <w:rPr>
+                <w:rFonts w:eastAsia="Microsoft YaHei" w:ascii="Microsoft YaHei" w:hAnsi="Microsoft YaHei"/>
+                <w:b w:val="0"/>
+              </w:rPr>
+              <w:t>关联券模板</w:t>
+            </w:r>
+          </w:p>
+        </w:tc>
+        <w:tc>
+          <w:tcPr>
+            <w:tcW w:type="dxa" w:w="2880"/>
+          </w:tcPr>
+          <w:p>
+            <w:r/>
+            <w:r>
+              <w:rPr>
+                <w:rFonts w:eastAsia="Microsoft YaHei" w:ascii="Microsoft YaHei" w:hAnsi="Microsoft YaHei"/>
+                <w:b w:val="0"/>
+              </w:rPr>
+              <w:t>本活动关联的券模板名称列表（多行展示）</w:t>
+            </w:r>
+          </w:p>
+        </w:tc>
+        <w:tc>
+          <w:tcPr>
+            <w:tcW w:type="dxa" w:w="2880"/>
+          </w:tcPr>
+          <w:p>
+            <w:r/>
+            <w:r>
+              <w:rPr>
+                <w:rFonts w:eastAsia="Microsoft YaHei" w:ascii="Microsoft YaHei" w:hAnsi="Microsoft YaHei"/>
+                <w:b w:val="0"/>
+              </w:rPr>
+              <w:t>取关联关系表，多券时换行显示</w:t>
+            </w:r>
+          </w:p>
+        </w:tc>
+      </w:tr>
+      <w:tr>
+        <w:tc>
+          <w:tcPr>
+            <w:tcW w:type="dxa" w:w="2880"/>
+          </w:tcPr>
+          <w:p>
+            <w:r/>
+            <w:r>
+              <w:rPr>
+                <w:rFonts w:eastAsia="Microsoft YaHei" w:ascii="Microsoft YaHei" w:hAnsi="Microsoft YaHei"/>
+                <w:b w:val="0"/>
+              </w:rPr>
+              <w:t>已发放</w:t>
+            </w:r>
+          </w:p>
+        </w:tc>
+        <w:tc>
+          <w:tcPr>
+            <w:tcW w:type="dxa" w:w="2880"/>
+          </w:tcPr>
+          <w:p>
+            <w:r/>
+            <w:r>
+              <w:rPr>
+                <w:rFonts w:eastAsia="Microsoft YaHei" w:ascii="Microsoft YaHei" w:hAnsi="Microsoft YaHei"/>
+                <w:b w:val="0"/>
+              </w:rPr>
+              <w:t>已发放的券实例总数</w:t>
+            </w:r>
+          </w:p>
+        </w:tc>
+        <w:tc>
+          <w:tcPr>
+            <w:tcW w:type="dxa" w:w="2880"/>
+          </w:tcPr>
+          <w:p>
+            <w:r/>
+            <w:r>
+              <w:rPr>
+                <w:rFonts w:eastAsia="Microsoft YaHei" w:ascii="Microsoft YaHei" w:hAnsi="Microsoft YaHei"/>
+                <w:b w:val="0"/>
+              </w:rPr>
+              <w:t>聚合《用户券表》count(where activity_id)</w:t>
+            </w:r>
+          </w:p>
+        </w:tc>
+      </w:tr>
+      <w:tr>
+        <w:tc>
+          <w:tcPr>
+            <w:tcW w:type="dxa" w:w="2880"/>
+          </w:tcPr>
+          <w:p>
+            <w:r/>
+            <w:r>
+              <w:rPr>
+                <w:rFonts w:eastAsia="Microsoft YaHei" w:ascii="Microsoft YaHei" w:hAnsi="Microsoft YaHei"/>
+                <w:b w:val="0"/>
+              </w:rPr>
+              <w:t>状态</w:t>
+            </w:r>
+          </w:p>
+        </w:tc>
+        <w:tc>
+          <w:tcPr>
+            <w:tcW w:type="dxa" w:w="2880"/>
+          </w:tcPr>
+          <w:p>
+            <w:r/>
+            <w:r>
+              <w:rPr>
+                <w:rFonts w:eastAsia="Microsoft YaHei" w:ascii="Microsoft YaHei" w:hAnsi="Microsoft YaHei"/>
+                <w:b w:val="0"/>
+              </w:rPr>
+              <w:t xml:space="preserve">活动状态 Tag（未开始 / </w:t>
+            </w:r>
+            <w:r>
+              <w:rPr>
+                <w:rFonts w:eastAsia="Microsoft YaHei" w:ascii="Microsoft YaHei" w:hAnsi="Microsoft YaHei"/>
+                <w:b w:val="0"/>
+              </w:rPr>
+              <w:t>进行中</w:t>
+            </w:r>
+            <w:r>
+              <w:rPr>
+                <w:rFonts w:eastAsia="Microsoft YaHei" w:ascii="Microsoft YaHei" w:hAnsi="Microsoft YaHei"/>
+                <w:b w:val="0"/>
+              </w:rPr>
+              <w:t xml:space="preserve"> / 已结束）</w:t>
+            </w:r>
+          </w:p>
+        </w:tc>
+        <w:tc>
+          <w:tcPr>
+            <w:tcW w:type="dxa" w:w="2880"/>
+          </w:tcPr>
+          <w:p>
+            <w:r/>
+            <w:r>
+              <w:rPr>
+                <w:rFonts w:eastAsia="Microsoft YaHei" w:ascii="Microsoft YaHei" w:hAnsi="Microsoft YaHei"/>
+                <w:b w:val="0"/>
+              </w:rPr>
+              <w:t>取 status 枚举；进行中=绿色Tag、未开始=蓝色Tag、其余灰色</w:t>
+            </w:r>
+          </w:p>
+        </w:tc>
+      </w:tr>
+      <w:tr>
+        <w:tc>
+          <w:tcPr>
+            <w:tcW w:type="dxa" w:w="2880"/>
+          </w:tcPr>
+          <w:p>
+            <w:r/>
+            <w:r>
+              <w:rPr>
+                <w:rFonts w:eastAsia="Microsoft YaHei" w:ascii="Microsoft YaHei" w:hAnsi="Microsoft YaHei"/>
+                <w:b w:val="0"/>
+              </w:rPr>
+              <w:t>开始发券时间</w:t>
+            </w:r>
+          </w:p>
+        </w:tc>
+        <w:tc>
+          <w:tcPr>
+            <w:tcW w:type="dxa" w:w="2880"/>
+          </w:tcPr>
+          <w:p>
+            <w:r/>
+            <w:r>
+              <w:rPr>
+                <w:rFonts w:eastAsia="Microsoft YaHei" w:ascii="Microsoft YaHei" w:hAnsi="Microsoft YaHei"/>
+                <w:b w:val="0"/>
+              </w:rPr>
+              <w:t>计划开始执行发券的时间</w:t>
+            </w:r>
+          </w:p>
+        </w:tc>
+        <w:tc>
+          <w:tcPr>
+            <w:tcW w:type="dxa" w:w="2880"/>
+          </w:tcPr>
+          <w:p>
+            <w:r/>
+            <w:r>
+              <w:rPr>
+                <w:rFonts w:eastAsia="Microsoft YaHei" w:ascii="Microsoft YaHei" w:hAnsi="Microsoft YaHei"/>
+                <w:b w:val="0"/>
+              </w:rPr>
+              <w:t>取 start_time（精确到秒）</w:t>
+            </w:r>
+          </w:p>
+        </w:tc>
+      </w:tr>
+      <w:tr>
+        <w:tc>
+          <w:tcPr>
+            <w:tcW w:type="dxa" w:w="2880"/>
+          </w:tcPr>
+          <w:p>
+            <w:r/>
+            <w:r>
+              <w:rPr>
+                <w:rFonts w:eastAsia="Microsoft YaHei" w:ascii="Microsoft YaHei" w:hAnsi="Microsoft YaHei"/>
+                <w:b w:val="0"/>
+              </w:rPr>
+              <w:t>操作</w:t>
+            </w:r>
+          </w:p>
+        </w:tc>
+        <w:tc>
+          <w:tcPr>
+            <w:tcW w:type="dxa" w:w="2880"/>
+          </w:tcPr>
+          <w:p>
+            <w:r/>
+            <w:r>
+              <w:rPr>
+                <w:rFonts w:eastAsia="Microsoft YaHei" w:ascii="Microsoft YaHei" w:hAnsi="Microsoft YaHei"/>
+                <w:b w:val="0"/>
+              </w:rPr>
+              <w:t>操作列按钮（见下方功能按钮表）</w:t>
+            </w:r>
+          </w:p>
+        </w:tc>
+        <w:tc>
+          <w:tcPr>
+            <w:tcW w:type="dxa" w:w="2880"/>
+          </w:tcPr>
+          <w:p>
+            <w:r/>
+            <w:r>
+              <w:rPr>
+                <w:rFonts w:eastAsia="Microsoft YaHei" w:ascii="Microsoft YaHei" w:hAnsi="Microsoft YaHei"/>
+                <w:b w:val="0"/>
+              </w:rPr>
+              <w:t>—</w:t>
+            </w:r>
+          </w:p>
+        </w:tc>
+      </w:tr>
+    </w:tbl>
+    <w:p>
+      <w:r>
+        <w:rPr>
+          <w:rFonts w:eastAsia="Microsoft YaHei" w:ascii="Microsoft YaHei" w:hAnsi="Microsoft YaHei"/>
+          <w:b/>
+        </w:rPr>
+        <w:t>P2 筛选条件表</w:t>
+      </w:r>
+    </w:p>
+    <w:tbl>
+      <w:tblPr>
+        <w:tblStyle w:val="TableGrid"/>
+        <w:tblW w:type="auto" w:w="0"/>
+        <w:tblLook w:firstColumn="1" w:firstRow="1" w:lastColumn="0" w:lastRow="0" w:noHBand="0" w:noVBand="1" w:val="04A0"/>
+        <w:jc w:val="center"/>
+        <w:tblBorders>
+          <w:top w:val="single" w:sz="4" w:space="0" w:color="999999"/>
+          <w:left w:val="single" w:sz="4" w:space="0" w:color="999999"/>
+          <w:bottom w:val="single" w:sz="4" w:space="0" w:color="999999"/>
+          <w:right w:val="single" w:sz="4" w:space="0" w:color="999999"/>
+          <w:insideH w:val="single" w:sz="4" w:space="0" w:color="999999"/>
+          <w:insideV w:val="single" w:sz="4" w:space="0" w:color="999999"/>
+        </w:tblBorders>
+      </w:tblPr>
+      <w:tblGrid>
+        <w:gridCol w:w="2880"/>
+        <w:gridCol w:w="2880"/>
+        <w:gridCol w:w="2880"/>
+      </w:tblGrid>
+      <w:tr>
+        <w:tc>
+          <w:tcPr>
+            <w:tcW w:type="dxa" w:w="2880"/>
+          </w:tcPr>
+          <w:p>
+            <w:r>
+              <w:rPr>
+                <w:b/>
+              </w:rPr>
+            </w:r>
+            <w:r>
+              <w:rPr>
+                <w:rFonts w:eastAsia="Microsoft YaHei" w:ascii="Microsoft YaHei" w:hAnsi="Microsoft YaHei"/>
+                <w:b/>
+              </w:rPr>
+              <w:t>筛选条件</w:t>
+            </w:r>
+          </w:p>
+        </w:tc>
+        <w:tc>
+          <w:tcPr>
+            <w:tcW w:type="dxa" w:w="2880"/>
+          </w:tcPr>
+          <w:p>
+            <w:r>
+              <w:rPr>
+                <w:b/>
+              </w:rPr>
+            </w:r>
+            <w:r>
+              <w:rPr>
+                <w:rFonts w:eastAsia="Microsoft YaHei" w:ascii="Microsoft YaHei" w:hAnsi="Microsoft YaHei"/>
+                <w:b/>
+              </w:rPr>
+              <w:t>控件类型</w:t>
+            </w:r>
+          </w:p>
+        </w:tc>
+        <w:tc>
+          <w:tcPr>
+            <w:tcW w:type="dxa" w:w="2880"/>
+          </w:tcPr>
+          <w:p>
+            <w:r>
+              <w:rPr>
+                <w:b/>
+              </w:rPr>
+            </w:r>
+            <w:r>
+              <w:rPr>
+                <w:rFonts w:eastAsia="Microsoft YaHei" w:ascii="Microsoft YaHei" w:hAnsi="Microsoft YaHei"/>
+                <w:b/>
+              </w:rPr>
+              <w:t>查询说明</w:t>
+            </w:r>
+          </w:p>
+        </w:tc>
+      </w:tr>
+      <w:tr>
+        <w:tc>
+          <w:tcPr>
+            <w:tcW w:type="dxa" w:w="2880"/>
+          </w:tcPr>
+          <w:p>
+            <w:r/>
+            <w:r>
+              <w:rPr>
+                <w:rFonts w:eastAsia="Microsoft YaHei" w:ascii="Microsoft YaHei" w:hAnsi="Microsoft YaHei"/>
+                <w:b w:val="0"/>
+              </w:rPr>
+              <w:t>关键词</w:t>
+            </w:r>
+          </w:p>
+        </w:tc>
+        <w:tc>
+          <w:tcPr>
+            <w:tcW w:type="dxa" w:w="2880"/>
+          </w:tcPr>
+          <w:p>
+            <w:r/>
+            <w:r>
+              <w:rPr>
+                <w:rFonts w:eastAsia="Microsoft YaHei" w:ascii="Microsoft YaHei" w:hAnsi="Microsoft YaHei"/>
+                <w:b w:val="0"/>
+              </w:rPr>
+              <w:t>文本输入</w:t>
+            </w:r>
+          </w:p>
+        </w:tc>
+        <w:tc>
+          <w:tcPr>
+            <w:tcW w:type="dxa" w:w="2880"/>
+          </w:tcPr>
+          <w:p>
+            <w:r/>
+            <w:r>
+              <w:rPr>
+                <w:rFonts w:eastAsia="Microsoft YaHei" w:ascii="Microsoft YaHei" w:hAnsi="Microsoft YaHei"/>
+                <w:b w:val="0"/>
+              </w:rPr>
+              <w:t>支持按「活动名称」模糊搜索；空=不筛选</w:t>
+            </w:r>
+          </w:p>
+        </w:tc>
+      </w:tr>
+      <w:tr>
+        <w:tc>
+          <w:tcPr>
+            <w:tcW w:type="dxa" w:w="2880"/>
+          </w:tcPr>
+          <w:p>
+            <w:r/>
+            <w:r>
+              <w:rPr>
+                <w:rFonts w:eastAsia="Microsoft YaHei" w:ascii="Microsoft YaHei" w:hAnsi="Microsoft YaHei"/>
+                <w:b w:val="0"/>
+              </w:rPr>
+              <w:t>触发源</w:t>
+            </w:r>
+          </w:p>
+        </w:tc>
+        <w:tc>
+          <w:tcPr>
+            <w:tcW w:type="dxa" w:w="2880"/>
+          </w:tcPr>
+          <w:p>
+            <w:r/>
+            <w:r>
+              <w:rPr>
+                <w:rFonts w:eastAsia="Microsoft YaHei" w:ascii="Microsoft YaHei" w:hAnsi="Microsoft YaHei"/>
+                <w:b w:val="0"/>
+              </w:rPr>
+              <w:t>下拉单选</w:t>
+            </w:r>
+          </w:p>
+        </w:tc>
+        <w:tc>
+          <w:tcPr>
+            <w:tcW w:type="dxa" w:w="2880"/>
+          </w:tcPr>
+          <w:p>
+            <w:r/>
+            <w:r>
+              <w:rPr>
+                <w:rFonts w:eastAsia="Microsoft YaHei" w:ascii="Microsoft YaHei" w:hAnsi="Microsoft YaHei"/>
+                <w:b w:val="0"/>
+              </w:rPr>
+              <w:t>全部 / 直播时长；默认「全部」</w:t>
+            </w:r>
+          </w:p>
+        </w:tc>
+      </w:tr>
+      <w:tr>
+        <w:tc>
+          <w:tcPr>
+            <w:tcW w:type="dxa" w:w="2880"/>
+          </w:tcPr>
+          <w:p>
+            <w:r/>
+            <w:r>
+              <w:rPr>
+                <w:rFonts w:eastAsia="Microsoft YaHei" w:ascii="Microsoft YaHei" w:hAnsi="Microsoft YaHei"/>
+                <w:b w:val="0"/>
+              </w:rPr>
+              <w:t>状态</w:t>
+            </w:r>
+          </w:p>
+        </w:tc>
+        <w:tc>
+          <w:tcPr>
+            <w:tcW w:type="dxa" w:w="2880"/>
+          </w:tcPr>
+          <w:p>
+            <w:r/>
+            <w:r>
+              <w:rPr>
+                <w:rFonts w:eastAsia="Microsoft YaHei" w:ascii="Microsoft YaHei" w:hAnsi="Microsoft YaHei"/>
+                <w:b w:val="0"/>
+              </w:rPr>
+              <w:t>下拉单选</w:t>
+            </w:r>
+          </w:p>
+        </w:tc>
+        <w:tc>
+          <w:tcPr>
+            <w:tcW w:type="dxa" w:w="2880"/>
+          </w:tcPr>
+          <w:p>
+            <w:r/>
+            <w:r>
+              <w:rPr>
+                <w:rFonts w:eastAsia="Microsoft YaHei" w:ascii="Microsoft YaHei" w:hAnsi="Microsoft YaHei"/>
+                <w:b w:val="0"/>
+              </w:rPr>
+              <w:t>全部 / 未开始 / 进行中 / 已结束；默认「全部」</w:t>
+            </w:r>
+          </w:p>
+        </w:tc>
+      </w:tr>
+      <w:tr>
+        <w:tc>
+          <w:tcPr>
+            <w:tcW w:type="dxa" w:w="2880"/>
+          </w:tcPr>
+          <w:p>
+            <w:r/>
+            <w:r>
+              <w:rPr>
+                <w:rFonts w:eastAsia="Microsoft YaHei" w:ascii="Microsoft YaHei" w:hAnsi="Microsoft YaHei"/>
+                <w:b w:val="0"/>
+              </w:rPr>
+              <w:t>关联直播标签</w:t>
+            </w:r>
+          </w:p>
+        </w:tc>
+        <w:tc>
+          <w:tcPr>
+            <w:tcW w:type="dxa" w:w="2880"/>
+          </w:tcPr>
+          <w:p>
+            <w:r/>
+            <w:r>
+              <w:rPr>
+                <w:rFonts w:eastAsia="Microsoft YaHei" w:ascii="Microsoft YaHei" w:hAnsi="Microsoft YaHei"/>
+                <w:b w:val="0"/>
+              </w:rPr>
+              <w:t>下拉单选</w:t>
+            </w:r>
+          </w:p>
+        </w:tc>
+        <w:tc>
+          <w:tcPr>
+            <w:tcW w:type="dxa" w:w="2880"/>
+          </w:tcPr>
+          <w:p>
+            <w:r/>
+            <w:r>
+              <w:rPr>
+                <w:rFonts w:eastAsia="Microsoft YaHei" w:ascii="Microsoft YaHei" w:hAnsi="Microsoft YaHei"/>
+                <w:b w:val="0"/>
+              </w:rPr>
+              <w:t>本期新增</w:t>
+            </w:r>
+            <w:r>
+              <w:rPr>
+                <w:rFonts w:eastAsia="Microsoft YaHei" w:ascii="Microsoft YaHei" w:hAnsi="Microsoft YaHei"/>
+                <w:b w:val="0"/>
+              </w:rPr>
+              <w:t xml:space="preserve"> 取标签管理·直播标签类型启用项；与「触发源=直播时长」组合可快速定位直播发券活动；非直播时该筛选置灰或隐藏</w:t>
+            </w:r>
+          </w:p>
+        </w:tc>
+      </w:tr>
+    </w:tbl>
+    <w:p>
+      <w:r>
+        <w:rPr>
+          <w:rFonts w:eastAsia="Microsoft YaHei" w:ascii="Microsoft YaHei" w:hAnsi="Microsoft YaHei"/>
+          <w:b/>
+        </w:rPr>
+        <w:t>P2 功能按钮（操作列 + 全局按钮）</w:t>
+      </w:r>
+    </w:p>
+    <w:tbl>
+      <w:tblPr>
+        <w:tblStyle w:val="TableGrid"/>
+        <w:tblW w:type="auto" w:w="0"/>
+        <w:tblLook w:firstColumn="1" w:firstRow="1" w:lastColumn="0" w:lastRow="0" w:noHBand="0" w:noVBand="1" w:val="04A0"/>
+        <w:jc w:val="center"/>
+        <w:tblBorders>
+          <w:top w:val="single" w:sz="4" w:space="0" w:color="999999"/>
+          <w:left w:val="single" w:sz="4" w:space="0" w:color="999999"/>
+          <w:bottom w:val="single" w:sz="4" w:space="0" w:color="999999"/>
+          <w:right w:val="single" w:sz="4" w:space="0" w:color="999999"/>
+          <w:insideH w:val="single" w:sz="4" w:space="0" w:color="999999"/>
+          <w:insideV w:val="single" w:sz="4" w:space="0" w:color="999999"/>
+        </w:tblBorders>
+      </w:tblPr>
+      <w:tblGrid>
+        <w:gridCol w:w="1728"/>
+        <w:gridCol w:w="1728"/>
+        <w:gridCol w:w="1728"/>
+        <w:gridCol w:w="1728"/>
+        <w:gridCol w:w="1728"/>
+      </w:tblGrid>
+      <w:tr>
+        <w:tc>
+          <w:tcPr>
+            <w:tcW w:type="dxa" w:w="1728"/>
+          </w:tcPr>
+          <w:p>
+            <w:r>
+              <w:rPr>
+                <w:b/>
+              </w:rPr>
+            </w:r>
+            <w:r>
+              <w:rPr>
+                <w:rFonts w:eastAsia="Microsoft YaHei" w:ascii="Microsoft YaHei" w:hAnsi="Microsoft YaHei"/>
+                <w:b/>
+              </w:rPr>
+              <w:t>按钮</w:t>
+            </w:r>
+          </w:p>
+        </w:tc>
+        <w:tc>
+          <w:tcPr>
+            <w:tcW w:type="dxa" w:w="1728"/>
+          </w:tcPr>
+          <w:p>
+            <w:r>
+              <w:rPr>
+                <w:b/>
+              </w:rPr>
+            </w:r>
+            <w:r>
+              <w:rPr>
+                <w:rFonts w:eastAsia="Microsoft YaHei" w:ascii="Microsoft YaHei" w:hAnsi="Microsoft YaHei"/>
+                <w:b/>
+              </w:rPr>
+              <w:t>位置</w:t>
+            </w:r>
+          </w:p>
+        </w:tc>
+        <w:tc>
+          <w:tcPr>
+            <w:tcW w:type="dxa" w:w="1728"/>
+          </w:tcPr>
+          <w:p>
+            <w:r>
+              <w:rPr>
+                <w:b/>
+              </w:rPr>
+            </w:r>
+            <w:r>
+              <w:rPr>
+                <w:rFonts w:eastAsia="Microsoft YaHei" w:ascii="Microsoft YaHei" w:hAnsi="Microsoft YaHei"/>
+                <w:b/>
+              </w:rPr>
+              <w:t>显示条件</w:t>
+            </w:r>
+          </w:p>
+        </w:tc>
+        <w:tc>
+          <w:tcPr>
+            <w:tcW w:type="dxa" w:w="1728"/>
+          </w:tcPr>
+          <w:p>
+            <w:r>
+              <w:rPr>
+                <w:b/>
+              </w:rPr>
+            </w:r>
+            <w:r>
+              <w:rPr>
+                <w:rFonts w:eastAsia="Microsoft YaHei" w:ascii="Microsoft YaHei" w:hAnsi="Microsoft YaHei"/>
+                <w:b/>
+              </w:rPr>
+              <w:t>功能说明</w:t>
+            </w:r>
+          </w:p>
+        </w:tc>
+        <w:tc>
+          <w:tcPr>
+            <w:tcW w:type="dxa" w:w="1728"/>
+          </w:tcPr>
+          <w:p>
+            <w:r>
+              <w:rPr>
+                <w:b/>
+              </w:rPr>
+            </w:r>
+            <w:r>
+              <w:rPr>
+                <w:rFonts w:eastAsia="Microsoft YaHei" w:ascii="Microsoft YaHei" w:hAnsi="Microsoft YaHei"/>
+                <w:b/>
+              </w:rPr>
+              <w:t>权限</w:t>
+            </w:r>
+          </w:p>
+        </w:tc>
+      </w:tr>
+      <w:tr>
+        <w:tc>
+          <w:tcPr>
+            <w:tcW w:type="dxa" w:w="1728"/>
+          </w:tcPr>
+          <w:p>
+            <w:r/>
+            <w:r>
+              <w:rPr>
+                <w:rFonts w:eastAsia="Microsoft YaHei" w:ascii="Microsoft YaHei" w:hAnsi="Microsoft YaHei"/>
+                <w:b w:val="0"/>
+              </w:rPr>
+              <w:t>＋ 新建发券活动</w:t>
+            </w:r>
+          </w:p>
+        </w:tc>
+        <w:tc>
+          <w:tcPr>
+            <w:tcW w:type="dxa" w:w="1728"/>
+          </w:tcPr>
+          <w:p>
+            <w:r/>
+            <w:r>
+              <w:rPr>
+                <w:rFonts w:eastAsia="Microsoft YaHei" w:ascii="Microsoft YaHei" w:hAnsi="Microsoft YaHei"/>
+                <w:b w:val="0"/>
+              </w:rPr>
+              <w:t>列表顶部工具栏右侧</w:t>
+            </w:r>
+          </w:p>
+        </w:tc>
+        <w:tc>
+          <w:tcPr>
+            <w:tcW w:type="dxa" w:w="1728"/>
+          </w:tcPr>
+          <w:p>
+            <w:r/>
+            <w:r>
+              <w:rPr>
+                <w:rFonts w:eastAsia="Microsoft YaHei" w:ascii="Microsoft YaHei" w:hAnsi="Microsoft YaHei"/>
+                <w:b w:val="0"/>
+              </w:rPr>
+              <w:t>始终可见</w:t>
+            </w:r>
+          </w:p>
+        </w:tc>
+        <w:tc>
+          <w:tcPr>
+            <w:tcW w:type="dxa" w:w="1728"/>
+          </w:tcPr>
+          <w:p>
+            <w:r/>
+            <w:r>
+              <w:rPr>
+                <w:rFonts w:eastAsia="Microsoft YaHei" w:ascii="Microsoft YaHei" w:hAnsi="Microsoft YaHei"/>
+                <w:b w:val="0"/>
+              </w:rPr>
+              <w:t>跳转 D3 新建页（标题「新建发券活动」，表单空白）</w:t>
+            </w:r>
+          </w:p>
+        </w:tc>
+        <w:tc>
+          <w:tcPr>
+            <w:tcW w:type="dxa" w:w="1728"/>
+          </w:tcPr>
+          <w:p>
+            <w:r/>
+            <w:r>
+              <w:rPr>
+                <w:rFonts w:eastAsia="Microsoft YaHei" w:ascii="Microsoft YaHei" w:hAnsi="Microsoft YaHei"/>
+                <w:b w:val="0"/>
+              </w:rPr>
+              <w:t>直播运营</w:t>
+            </w:r>
+          </w:p>
+        </w:tc>
+      </w:tr>
+      <w:tr>
+        <w:tc>
+          <w:tcPr>
+            <w:tcW w:type="dxa" w:w="1728"/>
+          </w:tcPr>
+          <w:p>
+            <w:r/>
+            <w:r>
+              <w:rPr>
+                <w:rFonts w:eastAsia="Microsoft YaHei" w:ascii="Microsoft YaHei" w:hAnsi="Microsoft YaHei"/>
+                <w:b w:val="0"/>
+              </w:rPr>
+              <w:t>搜索</w:t>
+            </w:r>
+          </w:p>
+        </w:tc>
+        <w:tc>
+          <w:tcPr>
+            <w:tcW w:type="dxa" w:w="1728"/>
+          </w:tcPr>
+          <w:p>
+            <w:r/>
+            <w:r>
+              <w:rPr>
+                <w:rFonts w:eastAsia="Microsoft YaHei" w:ascii="Microsoft YaHei" w:hAnsi="Microsoft YaHei"/>
+                <w:b w:val="0"/>
+              </w:rPr>
+              <w:t>筛选区</w:t>
+            </w:r>
+          </w:p>
+        </w:tc>
+        <w:tc>
+          <w:tcPr>
+            <w:tcW w:type="dxa" w:w="1728"/>
+          </w:tcPr>
+          <w:p>
+            <w:r/>
+            <w:r>
+              <w:rPr>
+                <w:rFonts w:eastAsia="Microsoft YaHei" w:ascii="Microsoft YaHei" w:hAnsi="Microsoft YaHei"/>
+                <w:b w:val="0"/>
+              </w:rPr>
+              <w:t>始终可见</w:t>
+            </w:r>
+          </w:p>
+        </w:tc>
+        <w:tc>
+          <w:tcPr>
+            <w:tcW w:type="dxa" w:w="1728"/>
+          </w:tcPr>
+          <w:p>
+            <w:r/>
+            <w:r>
+              <w:rPr>
+                <w:rFonts w:eastAsia="Microsoft YaHei" w:ascii="Microsoft YaHei" w:hAnsi="Microsoft YaHei"/>
+                <w:b w:val="0"/>
+              </w:rPr>
+              <w:t>按当前筛选条件刷新列表</w:t>
+            </w:r>
+          </w:p>
+        </w:tc>
+        <w:tc>
+          <w:tcPr>
+            <w:tcW w:type="dxa" w:w="1728"/>
+          </w:tcPr>
+          <w:p>
+            <w:r/>
+            <w:r>
+              <w:rPr>
+                <w:rFonts w:eastAsia="Microsoft YaHei" w:ascii="Microsoft YaHei" w:hAnsi="Microsoft YaHei"/>
+                <w:b w:val="0"/>
+              </w:rPr>
+              <w:t>所有角色</w:t>
+            </w:r>
+          </w:p>
+        </w:tc>
+      </w:tr>
+      <w:tr>
+        <w:tc>
+          <w:tcPr>
+            <w:tcW w:type="dxa" w:w="1728"/>
+          </w:tcPr>
+          <w:p>
+            <w:r/>
+            <w:r>
+              <w:rPr>
+                <w:rFonts w:eastAsia="Microsoft YaHei" w:ascii="Microsoft YaHei" w:hAnsi="Microsoft YaHei"/>
+                <w:b w:val="0"/>
+              </w:rPr>
+              <w:t>重置</w:t>
+            </w:r>
+          </w:p>
+        </w:tc>
+        <w:tc>
+          <w:tcPr>
+            <w:tcW w:type="dxa" w:w="1728"/>
+          </w:tcPr>
+          <w:p>
+            <w:r/>
+            <w:r>
+              <w:rPr>
+                <w:rFonts w:eastAsia="Microsoft YaHei" w:ascii="Microsoft YaHei" w:hAnsi="Microsoft YaHei"/>
+                <w:b w:val="0"/>
+              </w:rPr>
+              <w:t>筛选区</w:t>
+            </w:r>
+          </w:p>
+        </w:tc>
+        <w:tc>
+          <w:tcPr>
+            <w:tcW w:type="dxa" w:w="1728"/>
+          </w:tcPr>
+          <w:p>
+            <w:r/>
+            <w:r>
+              <w:rPr>
+                <w:rFonts w:eastAsia="Microsoft YaHei" w:ascii="Microsoft YaHei" w:hAnsi="Microsoft YaHei"/>
+                <w:b w:val="0"/>
+              </w:rPr>
+              <w:t>始终可见</w:t>
+            </w:r>
+          </w:p>
+        </w:tc>
+        <w:tc>
+          <w:tcPr>
+            <w:tcW w:type="dxa" w:w="1728"/>
+          </w:tcPr>
+          <w:p>
+            <w:r/>
+            <w:r>
+              <w:rPr>
+                <w:rFonts w:eastAsia="Microsoft YaHei" w:ascii="Microsoft YaHei" w:hAnsi="Microsoft YaHei"/>
+                <w:b w:val="0"/>
+              </w:rPr>
+              <w:t>清空所有筛选条件并刷新列表（恢复默认「全部」状态）</w:t>
+            </w:r>
+          </w:p>
+        </w:tc>
+        <w:tc>
+          <w:tcPr>
+            <w:tcW w:type="dxa" w:w="1728"/>
+          </w:tcPr>
+          <w:p>
+            <w:r/>
+            <w:r>
+              <w:rPr>
+                <w:rFonts w:eastAsia="Microsoft YaHei" w:ascii="Microsoft YaHei" w:hAnsi="Microsoft YaHei"/>
+                <w:b w:val="0"/>
+              </w:rPr>
+              <w:t>所有角色</w:t>
+            </w:r>
+          </w:p>
+        </w:tc>
+      </w:tr>
+      <w:tr>
+        <w:tc>
+          <w:tcPr>
+            <w:tcW w:type="dxa" w:w="1728"/>
+          </w:tcPr>
+          <w:p>
+            <w:r/>
+            <w:r>
+              <w:rPr>
+                <w:rFonts w:eastAsia="Microsoft YaHei" w:ascii="Microsoft YaHei" w:hAnsi="Microsoft YaHei"/>
+                <w:b w:val="0"/>
+              </w:rPr>
+              <w:t>编辑</w:t>
+            </w:r>
+          </w:p>
+        </w:tc>
+        <w:tc>
+          <w:tcPr>
+            <w:tcW w:type="dxa" w:w="1728"/>
+          </w:tcPr>
+          <w:p>
+            <w:r/>
+            <w:r>
+              <w:rPr>
+                <w:rFonts w:eastAsia="Microsoft YaHei" w:ascii="Microsoft YaHei" w:hAnsi="Microsoft YaHei"/>
+                <w:b w:val="0"/>
+              </w:rPr>
+              <w:t>列表操作列</w:t>
+            </w:r>
+          </w:p>
+        </w:tc>
+        <w:tc>
+          <w:tcPr>
+            <w:tcW w:type="dxa" w:w="1728"/>
+          </w:tcPr>
+          <w:p>
+            <w:r/>
+            <w:r>
+              <w:rPr>
+                <w:rFonts w:eastAsia="Microsoft YaHei" w:ascii="Microsoft YaHei" w:hAnsi="Microsoft YaHei"/>
+                <w:b w:val="0"/>
+              </w:rPr>
+              <w:t>所有状态均可见</w:t>
+            </w:r>
+          </w:p>
+        </w:tc>
+        <w:tc>
+          <w:tcPr>
+            <w:tcW w:type="dxa" w:w="1728"/>
+          </w:tcPr>
+          <w:p>
+            <w:r/>
+            <w:r>
+              <w:rPr>
+                <w:rFonts w:eastAsia="Microsoft YaHei" w:ascii="Microsoft YaHei" w:hAnsi="Microsoft YaHei"/>
+                <w:b w:val="0"/>
+              </w:rPr>
+              <w:t>跳转 D3 编辑页（标题切换为「编辑发券活动」，表单回填当前活动数据）；</w:t>
+            </w:r>
+            <w:r>
+              <w:rPr>
+                <w:rFonts w:eastAsia="Microsoft YaHei" w:ascii="Microsoft YaHei" w:hAnsi="Microsoft YaHei"/>
+                <w:b/>
+              </w:rPr>
+              <w:t>仅「未开始」态的活动可保存修改</w:t>
+            </w:r>
+            <w:r>
+              <w:rPr>
+                <w:rFonts w:eastAsia="Microsoft YaHei" w:ascii="Microsoft YaHei" w:hAnsi="Microsoft YaHei"/>
+                <w:b w:val="0"/>
+              </w:rPr>
+              <w:t>，进行中/已结束态进入编辑页后「保存」按钮禁用或隐藏（或前端拦截提示"进行中/已结束的活动不可编辑"）</w:t>
+            </w:r>
+          </w:p>
+        </w:tc>
+        <w:tc>
+          <w:tcPr>
+            <w:tcW w:type="dxa" w:w="1728"/>
+          </w:tcPr>
+          <w:p>
+            <w:r/>
+            <w:r>
+              <w:rPr>
+                <w:rFonts w:eastAsia="Microsoft YaHei" w:ascii="Microsoft YaHei" w:hAnsi="Microsoft YaHei"/>
+                <w:b w:val="0"/>
+              </w:rPr>
+              <w:t>直播运营</w:t>
+            </w:r>
+          </w:p>
+        </w:tc>
+      </w:tr>
+      <w:tr>
+        <w:tc>
+          <w:tcPr>
+            <w:tcW w:type="dxa" w:w="1728"/>
+          </w:tcPr>
+          <w:p>
+            <w:r/>
+            <w:r>
+              <w:rPr>
+                <w:rFonts w:eastAsia="Microsoft YaHei" w:ascii="Microsoft YaHei" w:hAnsi="Microsoft YaHei"/>
+                <w:b w:val="0"/>
+              </w:rPr>
+              <w:t>删除</w:t>
+            </w:r>
+          </w:p>
+        </w:tc>
+        <w:tc>
+          <w:tcPr>
+            <w:tcW w:type="dxa" w:w="1728"/>
+          </w:tcPr>
+          <w:p>
+            <w:r/>
+            <w:r>
+              <w:rPr>
+                <w:rFonts w:eastAsia="Microsoft YaHei" w:ascii="Microsoft YaHei" w:hAnsi="Microsoft YaHei"/>
+                <w:b w:val="0"/>
+              </w:rPr>
+              <w:t>列表操作列</w:t>
+            </w:r>
+          </w:p>
+        </w:tc>
+        <w:tc>
+          <w:tcPr>
+            <w:tcW w:type="dxa" w:w="1728"/>
+          </w:tcPr>
+          <w:p>
+            <w:r/>
+            <w:r>
+              <w:rPr>
+                <w:rFonts w:eastAsia="Microsoft YaHei" w:ascii="Microsoft YaHei" w:hAnsi="Microsoft YaHei"/>
+                <w:b w:val="0"/>
+              </w:rPr>
+              <w:t>所有状态均可见</w:t>
+            </w:r>
+          </w:p>
+        </w:tc>
+        <w:tc>
+          <w:tcPr>
+            <w:tcW w:type="dxa" w:w="1728"/>
+          </w:tcPr>
+          <w:p>
+            <w:r/>
+            <w:r>
+              <w:rPr>
+                <w:rFonts w:eastAsia="Microsoft YaHei" w:ascii="Microsoft YaHei" w:hAnsi="Microsoft YaHei"/>
+                <w:b w:val="0"/>
+              </w:rPr>
+              <w:t>二次确认弹窗「确认删除该发券活动？删除后不可恢复」→ 确认后删除活动记录；</w:t>
+            </w:r>
+            <w:r>
+              <w:rPr>
+                <w:rFonts w:eastAsia="Microsoft YaHei" w:ascii="Microsoft YaHei" w:hAnsi="Microsoft YaHei"/>
+                <w:b/>
+              </w:rPr>
+              <w:t>已发放的券实例不受影响</w:t>
+            </w:r>
+            <w:r>
+              <w:rPr>
+                <w:rFonts w:eastAsia="Microsoft YaHei" w:ascii="Microsoft YaHei" w:hAnsi="Microsoft YaHei"/>
+                <w:b w:val="0"/>
+              </w:rPr>
+              <w:t>（券独立于活动存在）</w:t>
+            </w:r>
+          </w:p>
+        </w:tc>
+        <w:tc>
+          <w:tcPr>
+            <w:tcW w:type="dxa" w:w="1728"/>
+          </w:tcPr>
+          <w:p>
+            <w:r/>
+            <w:r>
+              <w:rPr>
+                <w:rFonts w:eastAsia="Microsoft YaHei" w:ascii="Microsoft YaHei" w:hAnsi="Microsoft YaHei"/>
+                <w:b w:val="0"/>
+              </w:rPr>
+              <w:t>直播运营</w:t>
+            </w:r>
+          </w:p>
+        </w:tc>
+      </w:tr>
+    </w:tbl>
+    <w:p>
+      <w:pPr>
+        <w:shd w:val="clear" w:color="auto" w:fill="F8FAFC"/>
+      </w:pPr>
+      <w:r>
+        <w:rPr>
+          <w:rFonts w:eastAsia="Microsoft YaHei" w:ascii="Microsoft YaHei" w:hAnsi="Microsoft YaHei"/>
+          <w:b w:val="0"/>
+        </w:rPr>
+        <w:t xml:space="preserve">📌 </w:t>
+      </w:r>
+      <w:r>
+        <w:rPr>
+          <w:rFonts w:eastAsia="Microsoft YaHei" w:ascii="Microsoft YaHei" w:hAnsi="Microsoft YaHei"/>
+          <w:b/>
+        </w:rPr>
+        <w:t>P2 列表排序与分页</w:t>
+      </w:r>
+      <w:r>
+        <w:rPr>
+          <w:rFonts w:eastAsia="Microsoft YaHei" w:ascii="Microsoft YaHei" w:hAnsi="Microsoft YaHei"/>
+          <w:b w:val="0"/>
+        </w:rPr>
+        <w:t>：默认按「开始发券时间」倒序（最新创建的在顶部）；分页支持 20 / 50 / 100 条每页，默认 20。列表无数据时显示空态「暂无发券活动」。</w:t>
+      </w:r>
+    </w:p>
+    <w:p>
+      <w:r>
+        <w:rPr>
+          <w:rFonts w:eastAsia="Microsoft YaHei" w:ascii="Microsoft YaHei" w:hAnsi="Microsoft YaHei"/>
+          <w:b/>
+        </w:rPr>
+        <w:t>D3 新建/编辑发券活动（规则引擎）</w:t>
+      </w:r>
+    </w:p>
+    <w:p>
+      <w:r>
+        <w:rPr>
+          <w:rFonts w:eastAsia="Microsoft YaHei" w:ascii="Microsoft YaHei" w:hAnsi="Microsoft YaHei"/>
+          <w:b/>
+        </w:rPr>
         <w:t>D3 新建/编辑发券活动（规则引擎）</w:t>
       </w:r>
     </w:p>
@@ -11910,411 +13756,6 @@
           <w:sz w:val="18"/>
         </w:rPr>
         <w:t xml:space="preserve">  D3新建编辑发券活动</w:t>
-      </w:r>
-    </w:p>
-    <w:p>
-      <w:pPr>
-        <w:pStyle w:val="Heading4"/>
-      </w:pPr>
-      <w:r>
-        <w:rPr>
-          <w:rFonts w:eastAsia="Microsoft YaHei" w:ascii="Microsoft YaHei" w:hAnsi="Microsoft YaHei"/>
-        </w:rPr>
-        <w:t xml:space="preserve">4.1.3.4 「底价（商品级）」字段规则 </w:t>
-      </w:r>
-      <w:r>
-        <w:rPr>
-          <w:rFonts w:eastAsia="Microsoft YaHei" w:ascii="Microsoft YaHei" w:hAnsi="Microsoft YaHei"/>
-          <w:b w:val="0"/>
-        </w:rPr>
-        <w:t>本期新增</w:t>
-      </w:r>
-    </w:p>
-    <w:p>
-      <w:r>
-        <w:rPr>
-          <w:rFonts w:eastAsia="Microsoft YaHei" w:ascii="Microsoft YaHei" w:hAnsi="Microsoft YaHei"/>
-          <w:b/>
-        </w:rPr>
-        <w:t>字段定义</w:t>
-      </w:r>
-      <w:r>
-        <w:rPr>
-          <w:rFonts w:eastAsia="Microsoft YaHei" w:ascii="Microsoft YaHei" w:hAnsi="Microsoft YaHei"/>
-          <w:b w:val="0"/>
-        </w:rPr>
-        <w:t>：底价是</w:t>
-      </w:r>
-      <w:r>
-        <w:rPr>
-          <w:rFonts w:eastAsia="Microsoft YaHei" w:ascii="Microsoft YaHei" w:hAnsi="Microsoft YaHei"/>
-          <w:b/>
-        </w:rPr>
-        <w:t>商品级</w:t>
-      </w:r>
-      <w:r>
-        <w:rPr>
-          <w:rFonts w:eastAsia="Microsoft YaHei" w:ascii="Microsoft YaHei" w:hAnsi="Microsoft YaHei"/>
-          <w:b w:val="0"/>
-        </w:rPr>
-        <w:t>属性，由运营在券配置的「商品选择区」环节，对</w:t>
-      </w:r>
-      <w:r>
-        <w:rPr>
-          <w:rFonts w:eastAsia="Microsoft YaHei" w:ascii="Microsoft YaHei" w:hAnsi="Microsoft YaHei"/>
-          <w:b/>
-        </w:rPr>
-        <w:t>每个适用商品</w:t>
-      </w:r>
-      <w:r>
-        <w:rPr>
-          <w:rFonts w:eastAsia="Microsoft YaHei" w:ascii="Microsoft YaHei" w:hAnsi="Microsoft YaHei"/>
-          <w:b w:val="0"/>
-        </w:rPr>
-        <w:t>逐行录入该商品允许成交的最低实付单价。它约束的是 C 端结算时「叠加/用券后该商品实付不得低于底价」，与券面额、门槛、可共用优惠、阶梯计算相互独立。</w:t>
-      </w:r>
-    </w:p>
-    <w:p>
-      <w:r>
-        <w:rPr>
-          <w:rFonts w:eastAsia="Microsoft YaHei" w:ascii="Microsoft YaHei" w:hAnsi="Microsoft YaHei"/>
-          <w:b/>
-        </w:rPr>
-        <w:t>录入与存储</w:t>
-      </w:r>
-      <w:r>
-        <w:rPr>
-          <w:rFonts w:eastAsia="Microsoft YaHei" w:ascii="Microsoft YaHei" w:hAnsi="Microsoft YaHei"/>
-          <w:b w:val="0"/>
-        </w:rPr>
-        <w:t>：</w:t>
-      </w:r>
-    </w:p>
-    <w:p>
-      <w:pPr>
-        <w:pStyle w:val="ListBullet"/>
-      </w:pPr>
-      <w:r>
-        <w:rPr>
-          <w:rFonts w:eastAsia="Microsoft YaHei" w:ascii="Microsoft YaHei" w:hAnsi="Microsoft YaHei"/>
-          <w:b/>
-        </w:rPr>
-        <w:t>来源</w:t>
-      </w:r>
-      <w:r>
-        <w:rPr>
-          <w:rFonts w:eastAsia="Microsoft YaHei" w:ascii="Microsoft YaHei" w:hAnsi="Microsoft YaHei"/>
-          <w:b w:val="0"/>
-        </w:rPr>
-        <w:t>：</w:t>
-      </w:r>
-      <w:r>
-        <w:rPr>
-          <w:rFonts w:eastAsia="Microsoft YaHei" w:ascii="Microsoft YaHei" w:hAnsi="Microsoft YaHei"/>
-          <w:b/>
-        </w:rPr>
-        <w:t>运营在券配置中手动录入</w:t>
-      </w:r>
-      <w:r>
-        <w:rPr>
-          <w:rFonts w:eastAsia="Microsoft YaHei" w:ascii="Microsoft YaHei" w:hAnsi="Microsoft YaHei"/>
-          <w:b w:val="0"/>
-        </w:rPr>
-        <w:t>（以后台原型为准，</w:t>
-      </w:r>
-      <w:r>
-        <w:rPr>
-          <w:rFonts w:eastAsia="Microsoft YaHei" w:ascii="Microsoft YaHei" w:hAnsi="Microsoft YaHei"/>
-          <w:b/>
-        </w:rPr>
-        <w:t>非</w:t>
-      </w:r>
-      <w:r>
-        <w:rPr>
-          <w:rFonts w:eastAsia="Microsoft YaHei" w:ascii="Microsoft YaHei" w:hAnsi="Microsoft YaHei"/>
-          <w:b w:val="0"/>
-        </w:rPr>
-        <w:t>商品域接口只读）。原型中每个已选商品行带「底价 ¥」数字输入框（min=0，step=0.01，默认留空）。</w:t>
-      </w:r>
-    </w:p>
-    <w:p>
-      <w:pPr>
-        <w:pStyle w:val="ListBullet"/>
-      </w:pPr>
-      <w:r>
-        <w:rPr>
-          <w:rFonts w:eastAsia="Microsoft YaHei" w:ascii="Microsoft YaHei" w:hAnsi="Microsoft YaHei"/>
-          <w:b/>
-        </w:rPr>
-        <w:t>字段</w:t>
-      </w:r>
-      <w:r>
-        <w:rPr>
-          <w:rFonts w:eastAsia="Microsoft YaHei" w:ascii="Microsoft YaHei" w:hAnsi="Microsoft YaHei"/>
-          <w:b w:val="0"/>
-        </w:rPr>
-        <w:t xml:space="preserve">：存《券模板表》适用商品集合的 </w:t>
-      </w:r>
-      <w:r>
-        <w:rPr>
-          <w:rFonts w:ascii="Microsoft YaHei" w:hAnsi="Microsoft YaHei" w:eastAsia="Microsoft YaHei"/>
-          <w:color w:val="BE123C"/>
-        </w:rPr>
-        <w:t>floor_price</w:t>
-      </w:r>
-      <w:r>
-        <w:rPr>
-          <w:rFonts w:eastAsia="Microsoft YaHei" w:ascii="Microsoft YaHei" w:hAnsi="Microsoft YaHei"/>
-          <w:b w:val="0"/>
-        </w:rPr>
-        <w:t>；</w:t>
-      </w:r>
-      <w:r>
-        <w:rPr>
-          <w:rFonts w:eastAsia="Microsoft YaHei" w:ascii="Microsoft YaHei" w:hAnsi="Microsoft YaHei"/>
-          <w:b/>
-        </w:rPr>
-        <w:t>空值 / 0.00 = 无底价（即不限制）</w:t>
-      </w:r>
-      <w:r>
-        <w:rPr>
-          <w:rFonts w:eastAsia="Microsoft YaHei" w:ascii="Microsoft YaHei" w:hAnsi="Microsoft YaHei"/>
-          <w:b w:val="0"/>
-        </w:rPr>
-        <w:t>，C 端该商品不做底价不击穿校验。</w:t>
-      </w:r>
-    </w:p>
-    <w:p>
-      <w:pPr>
-        <w:pStyle w:val="ListBullet"/>
-      </w:pPr>
-      <w:r>
-        <w:rPr>
-          <w:rFonts w:eastAsia="Microsoft YaHei" w:ascii="Microsoft YaHei" w:hAnsi="Microsoft YaHei"/>
-          <w:b/>
-        </w:rPr>
-        <w:t>校验</w:t>
-      </w:r>
-      <w:r>
-        <w:rPr>
-          <w:rFonts w:eastAsia="Microsoft YaHei" w:ascii="Microsoft YaHei" w:hAnsi="Microsoft YaHei"/>
-          <w:b w:val="0"/>
-        </w:rPr>
-        <w:t>：≥0 数值；可留空；</w:t>
-      </w:r>
-      <w:r>
-        <w:rPr>
-          <w:rFonts w:eastAsia="Microsoft YaHei" w:ascii="Microsoft YaHei" w:hAnsi="Microsoft YaHei"/>
-          <w:b/>
-        </w:rPr>
-        <w:t>不强制必填</w:t>
-      </w:r>
-      <w:r>
-        <w:rPr>
-          <w:rFonts w:eastAsia="Microsoft YaHei" w:ascii="Microsoft YaHei" w:hAnsi="Microsoft YaHei"/>
-          <w:b w:val="0"/>
-        </w:rPr>
-        <w:t>。</w:t>
-      </w:r>
-    </w:p>
-    <w:p>
-      <w:r>
-        <w:rPr>
-          <w:rFonts w:eastAsia="Microsoft YaHei" w:ascii="Microsoft YaHei" w:hAnsi="Microsoft YaHei"/>
-          <w:b/>
-        </w:rPr>
-        <w:t>C 端「严格不击穿底价」保护规则（本期实现）</w:t>
-      </w:r>
-      <w:r>
-        <w:rPr>
-          <w:rFonts w:eastAsia="Microsoft YaHei" w:ascii="Microsoft YaHei" w:hAnsi="Microsoft YaHei"/>
-          <w:b w:val="0"/>
-        </w:rPr>
-        <w:t>：</w:t>
-      </w:r>
-    </w:p>
-    <w:p>
-      <w:pPr>
-        <w:pStyle w:val="ListBullet"/>
-      </w:pPr>
-      <w:r>
-        <w:rPr>
-          <w:rFonts w:eastAsia="Microsoft YaHei" w:ascii="Microsoft YaHei" w:hAnsi="Microsoft YaHei"/>
-          <w:b/>
-        </w:rPr>
-        <w:t>生效位置</w:t>
-      </w:r>
-      <w:r>
-        <w:rPr>
-          <w:rFonts w:eastAsia="Microsoft YaHei" w:ascii="Microsoft YaHei" w:hAnsi="Microsoft YaHei"/>
-          <w:b w:val="0"/>
-        </w:rPr>
-        <w:t>：在确认订单页结算计算时生效（与 §4.3.6 选券联动），后端在下单/核销接口二次校验，前后端规则一致。</w:t>
-      </w:r>
-    </w:p>
-    <w:p>
-      <w:pPr>
-        <w:pStyle w:val="ListBullet"/>
-      </w:pPr>
-      <w:r>
-        <w:rPr>
-          <w:rFonts w:eastAsia="Microsoft YaHei" w:ascii="Microsoft YaHei" w:hAnsi="Microsoft YaHei"/>
-          <w:b/>
-        </w:rPr>
-        <w:t>计算顺序</w:t>
-      </w:r>
-      <w:r>
-        <w:rPr>
-          <w:rFonts w:eastAsia="Microsoft YaHei" w:ascii="Microsoft YaHei" w:hAnsi="Microsoft YaHei"/>
-          <w:b w:val="0"/>
-        </w:rPr>
-        <w:t>：多盒多折（商品级）→ 优惠券满减（订单级）→ 臻享积分抵现（支付级）。底价不击穿在「优惠券满减」步骤后、逐商品核算实付时触发。</w:t>
-      </w:r>
-    </w:p>
-    <w:p>
-      <w:pPr>
-        <w:pStyle w:val="ListBullet"/>
-      </w:pPr>
-      <w:r>
-        <w:rPr>
-          <w:rFonts w:eastAsia="Microsoft YaHei" w:ascii="Microsoft YaHei" w:hAnsi="Microsoft YaHei"/>
-          <w:b/>
-        </w:rPr>
-        <w:t>保护逻辑</w:t>
-      </w:r>
-      <w:r>
-        <w:rPr>
-          <w:rFonts w:eastAsia="Microsoft YaHei" w:ascii="Microsoft YaHei" w:hAnsi="Microsoft YaHei"/>
-          <w:b w:val="0"/>
-        </w:rPr>
-        <w:t>：逐商品校验「该商品结算实付单价 ≥ 其 floor_price」；若减免后实付 &lt; 底价，则</w:t>
-      </w:r>
-      <w:r>
-        <w:rPr>
-          <w:rFonts w:eastAsia="Microsoft YaHei" w:ascii="Microsoft YaHei" w:hAnsi="Microsoft YaHei"/>
-          <w:b/>
-        </w:rPr>
-        <w:t>回退该商品对应的优惠减免至刚好触底</w:t>
-      </w:r>
-      <w:r>
-        <w:rPr>
-          <w:rFonts w:eastAsia="Microsoft YaHei" w:ascii="Microsoft YaHei" w:hAnsi="Microsoft YaHei"/>
-          <w:b w:val="0"/>
-        </w:rPr>
-        <w:t>（该商品实付 = 底价），</w:t>
-      </w:r>
-      <w:r>
-        <w:rPr>
-          <w:rFonts w:eastAsia="Microsoft YaHei" w:ascii="Microsoft YaHei" w:hAnsi="Microsoft YaHei"/>
-          <w:b/>
-        </w:rPr>
-        <w:t>其余商品不受影响</w:t>
-      </w:r>
-      <w:r>
-        <w:rPr>
-          <w:rFonts w:eastAsia="Microsoft YaHei" w:ascii="Microsoft YaHei" w:hAnsi="Microsoft YaHei"/>
-          <w:b w:val="0"/>
-        </w:rPr>
-        <w:t>，不整体取消券。</w:t>
-      </w:r>
-    </w:p>
-    <w:p>
-      <w:pPr>
-        <w:pStyle w:val="ListBullet"/>
-      </w:pPr>
-      <w:r>
-        <w:rPr>
-          <w:rFonts w:eastAsia="Microsoft YaHei" w:ascii="Microsoft YaHei" w:hAnsi="Microsoft YaHei"/>
-          <w:b/>
-        </w:rPr>
-        <w:t>极端兜底</w:t>
-      </w:r>
-      <w:r>
-        <w:rPr>
-          <w:rFonts w:eastAsia="Microsoft YaHei" w:ascii="Microsoft YaHei" w:hAnsi="Microsoft YaHei"/>
-          <w:b w:val="0"/>
-        </w:rPr>
-        <w:t>：若回退后仍无法满足（如单商品订单券面额超过「原价 − 底价」），则该券对当前订单</w:t>
-      </w:r>
-      <w:r>
-        <w:rPr>
-          <w:rFonts w:eastAsia="Microsoft YaHei" w:ascii="Microsoft YaHei" w:hAnsi="Microsoft YaHei"/>
-          <w:b/>
-        </w:rPr>
-        <w:t>不可用</w:t>
-      </w:r>
-      <w:r>
-        <w:rPr>
-          <w:rFonts w:eastAsia="Microsoft YaHei" w:ascii="Microsoft YaHei" w:hAnsi="Microsoft YaHei"/>
-          <w:b w:val="0"/>
-        </w:rPr>
-        <w:t>，确认订单页置灰并提示「该商品触发底价不击穿，本券不可用」。</w:t>
-      </w:r>
-    </w:p>
-    <w:p>
-      <w:pPr>
-        <w:pStyle w:val="ListBullet"/>
-      </w:pPr>
-      <w:r>
-        <w:rPr>
-          <w:rFonts w:eastAsia="Microsoft YaHei" w:ascii="Microsoft YaHei" w:hAnsi="Microsoft YaHei"/>
-          <w:b/>
-        </w:rPr>
-        <w:t>前端展示</w:t>
-      </w:r>
-      <w:r>
-        <w:rPr>
-          <w:rFonts w:eastAsia="Microsoft YaHei" w:ascii="Microsoft YaHei" w:hAnsi="Microsoft YaHei"/>
-          <w:b w:val="0"/>
-        </w:rPr>
-        <w:t>：确认订单页实时计算并显示本单实际减免金额；触底回退时展示触底提示，减免金额随之更新。</w:t>
-      </w:r>
-    </w:p>
-    <w:p>
-      <w:pPr>
-        <w:pStyle w:val="ListBullet"/>
-      </w:pPr>
-      <w:r>
-        <w:rPr>
-          <w:rFonts w:eastAsia="Microsoft YaHei" w:ascii="Microsoft YaHei" w:hAnsi="Microsoft YaHei"/>
-          <w:b/>
-        </w:rPr>
-        <w:t>计算基数</w:t>
-      </w:r>
-      <w:r>
-        <w:rPr>
-          <w:rFonts w:eastAsia="Microsoft YaHei" w:ascii="Microsoft YaHei" w:hAnsi="Microsoft YaHei"/>
-          <w:b w:val="0"/>
-        </w:rPr>
-        <w:t>：底价不击穿仅作用于</w:t>
-      </w:r>
-      <w:r>
-        <w:rPr>
-          <w:rFonts w:eastAsia="Microsoft YaHei" w:ascii="Microsoft YaHei" w:hAnsi="Microsoft YaHei"/>
-          <w:b/>
-        </w:rPr>
-        <w:t>该券适用商品范围内</w:t>
-      </w:r>
-      <w:r>
-        <w:rPr>
-          <w:rFonts w:eastAsia="Microsoft YaHei" w:ascii="Microsoft YaHei" w:hAnsi="Microsoft YaHei"/>
-          <w:b w:val="0"/>
-        </w:rPr>
-        <w:t>的商品实付单价；</w:t>
-      </w:r>
-      <w:r>
-        <w:rPr>
-          <w:rFonts w:eastAsia="Microsoft YaHei" w:ascii="Microsoft YaHei" w:hAnsi="Microsoft YaHei"/>
-          <w:b/>
-        </w:rPr>
-        <w:t>不含赠品 / 换购商品金额</w:t>
-      </w:r>
-      <w:r>
-        <w:rPr>
-          <w:rFonts w:eastAsia="Microsoft YaHei" w:ascii="Microsoft YaHei" w:hAnsi="Microsoft YaHei"/>
-          <w:b w:val="0"/>
-        </w:rPr>
-        <w:t>（用户裁定：当前赠品不影响指定券的 SKU，与 §4.1.3.3 阶梯计算基数口径一致）。</w:t>
       </w:r>
     </w:p>
     <w:p>

</xml_diff>

<commit_message>
docs(PRD): 同步 Word（删 10.2 后 72表 suspect=0）
</commit_message>
<xml_diff>
--- a/coupon-prd.docx
+++ b/coupon-prd.docx
@@ -31942,7 +31942,7 @@
         <w:rPr>
           <w:rFonts w:eastAsia="Microsoft YaHei" w:ascii="Microsoft YaHei" w:hAnsi="Microsoft YaHei"/>
         </w:rPr>
-        <w:t>10.2 会员中心-批量送券</w:t>
+        <w:t>10.2 关联直播原型</w:t>
       </w:r>
     </w:p>
     <w:p>
@@ -31958,7 +31958,7 @@
           <w:rFonts w:eastAsia="Microsoft YaHei" w:ascii="Microsoft YaHei" w:hAnsi="Microsoft YaHei"/>
           <w:b w:val="0"/>
         </w:rPr>
-        <w:t>：平台端后台为运营提供「按用户标签圈选 → 批量发放优惠券」的能力。运营可在会员中心选择目标用户标签（如「福利直播」标签），配置要发放的券模板与数量，系统批量写入用户券账户。是「时长发券」之外另一条人工触达用户的送券通道。</w:t>
+        <w:t>：平台端后台将「直播间」与「优惠券模板」进行关联绑定，实现直播场景下的券发放。运营在直播商品池管理或直播间管理中，选择要关联的券模板，配置发放规则（如观看满 X 分钟自动发放）。</w:t>
       </w:r>
     </w:p>
     <w:p>
@@ -31974,7 +31974,7 @@
           <w:rFonts w:eastAsia="Microsoft YaHei" w:ascii="Microsoft YaHei" w:hAnsi="Microsoft YaHei"/>
           <w:b w:val="0"/>
         </w:rPr>
-        <w:t>：批量送券直接调用券模板的「发券」能力，写入用户券账户表；券的状态流转（未使用/已使用/已过期）与核销逻辑完全复用优惠券体系既有能力。</w:t>
+        <w:t>：关联直播是优惠券的「发放场景」之一，直播间绑定的是「券模板」而非具体券实例；用户满足发放条件后，系统调用券模板生成券实例并写入用户账户。</w:t>
       </w:r>
     </w:p>
     <w:p>
@@ -31993,98 +31993,6 @@
         <w:t>：</w:t>
       </w:r>
       <w:hyperlink r:id="rId35">
-        <w:r>
-          <w:rPr>
-            <w:rStyle w:val="Hyperlink"/>
-          </w:rPr>
-          <w:t>https://ddyuan-spec.github.io/taixiaohu/coupon-member.html</w:t>
-        </w:r>
-      </w:hyperlink>
-    </w:p>
-    <w:p>
-      <w:r>
-        <w:rPr>
-          <w:rFonts w:eastAsia="Microsoft YaHei" w:ascii="Microsoft YaHei" w:hAnsi="Microsoft YaHei"/>
-          <w:b/>
-        </w:rPr>
-        <w:t>原型截图</w:t>
-      </w:r>
-      <w:r>
-        <w:rPr>
-          <w:rFonts w:eastAsia="Microsoft YaHei" w:ascii="Microsoft YaHei" w:hAnsi="Microsoft YaHei"/>
-          <w:b w:val="0"/>
-        </w:rPr>
-        <w:t>：</w:t>
-      </w:r>
-    </w:p>
-    <w:p>
-      <w:r>
-        <w:rPr>
-          <w:rFonts w:eastAsia="Microsoft YaHei" w:ascii="Microsoft YaHei" w:hAnsi="Microsoft YaHei"/>
-          <w:color w:val="DC2626"/>
-        </w:rPr>
-        <w:t>[缺失图片] 会员中心-批量送券原型</w:t>
-      </w:r>
-    </w:p>
-    <w:p>
-      <w:pPr>
-        <w:pStyle w:val="Heading2"/>
-      </w:pPr>
-      <w:r>
-        <w:rPr>
-          <w:rFonts w:eastAsia="Microsoft YaHei" w:ascii="Microsoft YaHei" w:hAnsi="Microsoft YaHei"/>
-        </w:rPr>
-        <w:t>10.3 关联直播原型</w:t>
-      </w:r>
-    </w:p>
-    <w:p>
-      <w:r>
-        <w:rPr>
-          <w:rFonts w:eastAsia="Microsoft YaHei" w:ascii="Microsoft YaHei" w:hAnsi="Microsoft YaHei"/>
-          <w:b/>
-        </w:rPr>
-        <w:t>功能说明</w:t>
-      </w:r>
-      <w:r>
-        <w:rPr>
-          <w:rFonts w:eastAsia="Microsoft YaHei" w:ascii="Microsoft YaHei" w:hAnsi="Microsoft YaHei"/>
-          <w:b w:val="0"/>
-        </w:rPr>
-        <w:t>：平台端后台将「直播间」与「优惠券模板」进行关联绑定，实现直播场景下的券发放。运营在直播商品池管理或直播间管理中，选择要关联的券模板，配置发放规则（如观看满 X 分钟自动发放）。</w:t>
-      </w:r>
-    </w:p>
-    <w:p>
-      <w:r>
-        <w:rPr>
-          <w:rFonts w:eastAsia="Microsoft YaHei" w:ascii="Microsoft YaHei" w:hAnsi="Microsoft YaHei"/>
-          <w:b/>
-        </w:rPr>
-        <w:t>与优惠券体系的关系</w:t>
-      </w:r>
-      <w:r>
-        <w:rPr>
-          <w:rFonts w:eastAsia="Microsoft YaHei" w:ascii="Microsoft YaHei" w:hAnsi="Microsoft YaHei"/>
-          <w:b w:val="0"/>
-        </w:rPr>
-        <w:t>：关联直播是优惠券的「发放场景」之一，直播间绑定的是「券模板」而非具体券实例；用户满足发放条件后，系统调用券模板生成券实例并写入用户账户。</w:t>
-      </w:r>
-    </w:p>
-    <w:p>
-      <w:r>
-        <w:rPr>
-          <w:rFonts w:eastAsia="Microsoft YaHei" w:ascii="Microsoft YaHei" w:hAnsi="Microsoft YaHei"/>
-          <w:b/>
-        </w:rPr>
-        <w:t>原型短链</w:t>
-      </w:r>
-      <w:r>
-        <w:rPr>
-          <w:rFonts w:eastAsia="Microsoft YaHei" w:ascii="Microsoft YaHei" w:hAnsi="Microsoft YaHei"/>
-          <w:b w:val="0"/>
-        </w:rPr>
-        <w:t>：</w:t>
-      </w:r>
-      <w:hyperlink r:id="rId36">
         <w:r>
           <w:rPr>
             <w:rStyle w:val="Hyperlink"/>
@@ -32126,7 +32034,7 @@
         <w:rPr>
           <w:rFonts w:eastAsia="Microsoft YaHei" w:ascii="Microsoft YaHei" w:hAnsi="Microsoft YaHei"/>
         </w:rPr>
-        <w:t>10.4 订单关联优惠券</w:t>
+        <w:t>10.3 订单关联优惠券</w:t>
       </w:r>
     </w:p>
     <w:p>
@@ -32176,7 +32084,7 @@
         </w:rPr>
         <w:t>：</w:t>
       </w:r>
-      <w:hyperlink r:id="rId37">
+      <w:hyperlink r:id="rId36">
         <w:r>
           <w:rPr>
             <w:rStyle w:val="Hyperlink"/>
@@ -32218,7 +32126,7 @@
         <w:rPr>
           <w:rFonts w:eastAsia="Microsoft YaHei" w:ascii="Microsoft YaHei" w:hAnsi="Microsoft YaHei"/>
         </w:rPr>
-        <w:t>10.5 会员直接发券</w:t>
+        <w:t>10.4 会员直接发券</w:t>
       </w:r>
     </w:p>
     <w:p>
@@ -32268,7 +32176,7 @@
         </w:rPr>
         <w:t>：</w:t>
       </w:r>
-      <w:hyperlink r:id="rId38">
+      <w:hyperlink r:id="rId37">
         <w:r>
           <w:rPr>
             <w:rStyle w:val="Hyperlink"/>
@@ -32310,7 +32218,7 @@
         <w:rPr>
           <w:rFonts w:eastAsia="Microsoft YaHei" w:ascii="Microsoft YaHei" w:hAnsi="Microsoft YaHei"/>
         </w:rPr>
-        <w:t>10.6 直播观看记录</w:t>
+        <w:t>10.5 直播观看记录</w:t>
       </w:r>
     </w:p>
     <w:p>
@@ -32360,7 +32268,7 @@
         </w:rPr>
         <w:t>：</w:t>
       </w:r>
-      <w:hyperlink r:id="rId39">
+      <w:hyperlink r:id="rId38">
         <w:r>
           <w:rPr>
             <w:rStyle w:val="Hyperlink"/>

</xml_diff>

<commit_message>
docs(PRD): 同步 Word（恢复 10.2 后 72表 suspect=0）
</commit_message>
<xml_diff>
--- a/coupon-prd.docx
+++ b/coupon-prd.docx
@@ -31942,7 +31942,7 @@
         <w:rPr>
           <w:rFonts w:eastAsia="Microsoft YaHei" w:ascii="Microsoft YaHei" w:hAnsi="Microsoft YaHei"/>
         </w:rPr>
-        <w:t>10.2 关联直播原型</w:t>
+        <w:t>10.2 会员中心-批量送券</w:t>
       </w:r>
     </w:p>
     <w:p>
@@ -31958,7 +31958,7 @@
           <w:rFonts w:eastAsia="Microsoft YaHei" w:ascii="Microsoft YaHei" w:hAnsi="Microsoft YaHei"/>
           <w:b w:val="0"/>
         </w:rPr>
-        <w:t>：平台端后台将「直播间」与「优惠券模板」进行关联绑定，实现直播场景下的券发放。运营在直播商品池管理或直播间管理中，选择要关联的券模板，配置发放规则（如观看满 X 分钟自动发放）。</w:t>
+        <w:t>：平台端后台为运营提供「按用户标签圈选 → 批量发放优惠券」的能力。运营可在会员中心选择目标用户标签（如「福利直播」标签），配置要发放的券模板与数量，系统批量写入用户券账户。是「时长发券」之外另一条人工触达用户的送券通道。</w:t>
       </w:r>
     </w:p>
     <w:p>
@@ -31974,7 +31974,7 @@
           <w:rFonts w:eastAsia="Microsoft YaHei" w:ascii="Microsoft YaHei" w:hAnsi="Microsoft YaHei"/>
           <w:b w:val="0"/>
         </w:rPr>
-        <w:t>：关联直播是优惠券的「发放场景」之一，直播间绑定的是「券模板」而非具体券实例；用户满足发放条件后，系统调用券模板生成券实例并写入用户账户。</w:t>
+        <w:t>：批量送券直接调用券模板的「发券」能力，写入用户券账户表；券的状态流转（未使用/已使用/已过期）与核销逻辑完全复用优惠券体系既有能力。</w:t>
       </w:r>
     </w:p>
     <w:p>
@@ -31993,6 +31993,98 @@
         <w:t>：</w:t>
       </w:r>
       <w:hyperlink r:id="rId35">
+        <w:r>
+          <w:rPr>
+            <w:rStyle w:val="Hyperlink"/>
+          </w:rPr>
+          <w:t>https://ddyuan-spec.github.io/taixiaohu/coupon-member.html</w:t>
+        </w:r>
+      </w:hyperlink>
+    </w:p>
+    <w:p>
+      <w:r>
+        <w:rPr>
+          <w:rFonts w:eastAsia="Microsoft YaHei" w:ascii="Microsoft YaHei" w:hAnsi="Microsoft YaHei"/>
+          <w:b/>
+        </w:rPr>
+        <w:t>原型截图</w:t>
+      </w:r>
+      <w:r>
+        <w:rPr>
+          <w:rFonts w:eastAsia="Microsoft YaHei" w:ascii="Microsoft YaHei" w:hAnsi="Microsoft YaHei"/>
+          <w:b w:val="0"/>
+        </w:rPr>
+        <w:t>：</w:t>
+      </w:r>
+    </w:p>
+    <w:p>
+      <w:r>
+        <w:rPr>
+          <w:rFonts w:eastAsia="Microsoft YaHei" w:ascii="Microsoft YaHei" w:hAnsi="Microsoft YaHei"/>
+          <w:color w:val="DC2626"/>
+        </w:rPr>
+        <w:t>[缺失图片] 会员中心-批量送券原型</w:t>
+      </w:r>
+    </w:p>
+    <w:p>
+      <w:pPr>
+        <w:pStyle w:val="Heading2"/>
+      </w:pPr>
+      <w:r>
+        <w:rPr>
+          <w:rFonts w:eastAsia="Microsoft YaHei" w:ascii="Microsoft YaHei" w:hAnsi="Microsoft YaHei"/>
+        </w:rPr>
+        <w:t>10.3 关联直播原型</w:t>
+      </w:r>
+    </w:p>
+    <w:p>
+      <w:r>
+        <w:rPr>
+          <w:rFonts w:eastAsia="Microsoft YaHei" w:ascii="Microsoft YaHei" w:hAnsi="Microsoft YaHei"/>
+          <w:b/>
+        </w:rPr>
+        <w:t>功能说明</w:t>
+      </w:r>
+      <w:r>
+        <w:rPr>
+          <w:rFonts w:eastAsia="Microsoft YaHei" w:ascii="Microsoft YaHei" w:hAnsi="Microsoft YaHei"/>
+          <w:b w:val="0"/>
+        </w:rPr>
+        <w:t>：平台端后台将「直播间」与「优惠券模板」进行关联绑定，实现直播场景下的券发放。运营在直播商品池管理或直播间管理中，选择要关联的券模板，配置发放规则（如观看满 X 分钟自动发放）。</w:t>
+      </w:r>
+    </w:p>
+    <w:p>
+      <w:r>
+        <w:rPr>
+          <w:rFonts w:eastAsia="Microsoft YaHei" w:ascii="Microsoft YaHei" w:hAnsi="Microsoft YaHei"/>
+          <w:b/>
+        </w:rPr>
+        <w:t>与优惠券体系的关系</w:t>
+      </w:r>
+      <w:r>
+        <w:rPr>
+          <w:rFonts w:eastAsia="Microsoft YaHei" w:ascii="Microsoft YaHei" w:hAnsi="Microsoft YaHei"/>
+          <w:b w:val="0"/>
+        </w:rPr>
+        <w:t>：关联直播是优惠券的「发放场景」之一，直播间绑定的是「券模板」而非具体券实例；用户满足发放条件后，系统调用券模板生成券实例并写入用户账户。</w:t>
+      </w:r>
+    </w:p>
+    <w:p>
+      <w:r>
+        <w:rPr>
+          <w:rFonts w:eastAsia="Microsoft YaHei" w:ascii="Microsoft YaHei" w:hAnsi="Microsoft YaHei"/>
+          <w:b/>
+        </w:rPr>
+        <w:t>原型短链</w:t>
+      </w:r>
+      <w:r>
+        <w:rPr>
+          <w:rFonts w:eastAsia="Microsoft YaHei" w:ascii="Microsoft YaHei" w:hAnsi="Microsoft YaHei"/>
+          <w:b w:val="0"/>
+        </w:rPr>
+        <w:t>：</w:t>
+      </w:r>
+      <w:hyperlink r:id="rId36">
         <w:r>
           <w:rPr>
             <w:rStyle w:val="Hyperlink"/>
@@ -32034,7 +32126,7 @@
         <w:rPr>
           <w:rFonts w:eastAsia="Microsoft YaHei" w:ascii="Microsoft YaHei" w:hAnsi="Microsoft YaHei"/>
         </w:rPr>
-        <w:t>10.3 订单关联优惠券</w:t>
+        <w:t>10.4 订单关联优惠券</w:t>
       </w:r>
     </w:p>
     <w:p>
@@ -32084,7 +32176,7 @@
         </w:rPr>
         <w:t>：</w:t>
       </w:r>
-      <w:hyperlink r:id="rId36">
+      <w:hyperlink r:id="rId37">
         <w:r>
           <w:rPr>
             <w:rStyle w:val="Hyperlink"/>
@@ -32126,7 +32218,7 @@
         <w:rPr>
           <w:rFonts w:eastAsia="Microsoft YaHei" w:ascii="Microsoft YaHei" w:hAnsi="Microsoft YaHei"/>
         </w:rPr>
-        <w:t>10.4 会员直接发券</w:t>
+        <w:t>10.5 会员直接发券</w:t>
       </w:r>
     </w:p>
     <w:p>
@@ -32176,7 +32268,7 @@
         </w:rPr>
         <w:t>：</w:t>
       </w:r>
-      <w:hyperlink r:id="rId37">
+      <w:hyperlink r:id="rId38">
         <w:r>
           <w:rPr>
             <w:rStyle w:val="Hyperlink"/>
@@ -32218,7 +32310,7 @@
         <w:rPr>
           <w:rFonts w:eastAsia="Microsoft YaHei" w:ascii="Microsoft YaHei" w:hAnsi="Microsoft YaHei"/>
         </w:rPr>
-        <w:t>10.5 直播观看记录</w:t>
+        <w:t>10.6 直播观看记录</w:t>
       </w:r>
     </w:p>
     <w:p>
@@ -32268,7 +32360,7 @@
         </w:rPr>
         <w:t>：</w:t>
       </w:r>
-      <w:hyperlink r:id="rId38">
+      <w:hyperlink r:id="rId39">
         <w:r>
           <w:rPr>
             <w:rStyle w:val="Hyperlink"/>

</xml_diff>